<commit_message>
feat: add Drive folder creation subtask to Step 2 and sync 11-step process to GSA Trainer docx
</commit_message>
<xml_diff>
--- a/Data/Quy trình tổ chức GSA Trainer.docx
+++ b/Data/Quy trình tổ chức GSA Trainer.docx
@@ -481,360 +481,124 @@
             <w:vAlign w:val="top"/>
           </w:tcPr>
           <w:p>
-            <w:pPr>
-              <w:pBdr>
-                <w:top w:color="auto" w:space="0" w:sz="0" w:val="none"/>
-                <w:bottom w:color="auto" w:space="0" w:sz="0" w:val="none"/>
-                <w:right w:color="auto" w:space="0" w:sz="0" w:val="none"/>
-                <w:between w:color="auto" w:space="0" w:sz="0" w:val="none"/>
-              </w:pBdr>
-              <w:spacing w:after="480" w:lineRule="auto"/>
-              <w:rPr>
-                <w:color w:val="1f1f1f"/>
-              </w:rPr>
-            </w:pPr>
-            <w:r>
-              <w:rPr>
-                <w:b w:val="1"/>
-                <w:bCs w:val="1"/>
-                <w:color w:val="1f1f1f"/>
-                <w:rtl w:val="0"/>
-              </w:rPr>
-              <w:t xml:space="preserve">NGÀY 1</w:t>
-            </w:r>
-            <w:r>
-              <w:rPr>
-                <w:rtl w:val="0"/>
-              </w:rPr>
-            </w:r>
-          </w:p>
-        </w:tc>
-        <w:tc>
-          <w:tcPr>
-            <w:tcBorders>
-              <w:top w:color="c4c7c5" w:space="0" w:sz="5" w:val="single"/>
-              <w:left w:color="c4c7c5" w:space="0" w:sz="5" w:val="single"/>
-              <w:bottom w:color="c4c7c5" w:space="0" w:sz="5" w:val="single"/>
-              <w:right w:color="c4c7c5" w:space="0" w:sz="5" w:val="single"/>
-            </w:tcBorders>
-            <w:tcMar>
-              <w:top w:w="120.0" w:type="dxa"/>
-              <w:left w:w="180.0" w:type="dxa"/>
-              <w:bottom w:w="120.0" w:type="dxa"/>
-              <w:right w:w="180.0" w:type="dxa"/>
-            </w:tcMar>
-            <w:vAlign w:val="top"/>
-          </w:tcPr>
-          <w:p>
-            <w:pPr>
-              <w:pBdr>
-                <w:top w:color="auto" w:space="0" w:sz="0" w:val="none"/>
-                <w:bottom w:color="auto" w:space="0" w:sz="0" w:val="none"/>
-                <w:right w:color="auto" w:space="0" w:sz="0" w:val="none"/>
-                <w:between w:color="auto" w:space="0" w:sz="0" w:val="none"/>
-              </w:pBdr>
-              <w:spacing w:after="480" w:lineRule="auto"/>
-              <w:rPr>
-                <w:color w:val="1f1f1f"/>
-              </w:rPr>
-            </w:pPr>
-            <w:r>
-              <w:rPr>
-                <w:b w:val="1"/>
-                <w:bCs w:val="1"/>
-                <w:color w:val="1f1f1f"/>
-                <w:rtl w:val="0"/>
-              </w:rPr>
-              <w:t xml:space="preserve">Bước 1: Tìm trường &amp; Quét thông tin</w:t>
-            </w:r>
-            <w:r>
-              <w:rPr>
-                <w:rtl w:val="0"/>
-              </w:rPr>
-            </w:r>
-          </w:p>
-        </w:tc>
-        <w:tc>
-          <w:tcPr>
-            <w:tcBorders>
-              <w:top w:color="c4c7c5" w:space="0" w:sz="5" w:val="single"/>
-              <w:left w:color="c4c7c5" w:space="0" w:sz="5" w:val="single"/>
-              <w:bottom w:color="c4c7c5" w:space="0" w:sz="5" w:val="single"/>
-              <w:right w:color="c4c7c5" w:space="0" w:sz="5" w:val="single"/>
-            </w:tcBorders>
-            <w:tcMar>
-              <w:top w:w="120.0" w:type="dxa"/>
-              <w:left w:w="180.0" w:type="dxa"/>
-              <w:bottom w:w="120.0" w:type="dxa"/>
-              <w:right w:w="180.0" w:type="dxa"/>
-            </w:tcMar>
-            <w:vAlign w:val="top"/>
-          </w:tcPr>
-          <w:p>
-            <w:pPr>
-              <w:pBdr>
-                <w:top w:color="auto" w:space="0" w:sz="0" w:val="none"/>
-                <w:left w:color="auto" w:space="0" w:sz="0" w:val="none"/>
-                <w:bottom w:color="auto" w:space="0" w:sz="0" w:val="none"/>
-                <w:right w:color="auto" w:space="0" w:sz="0" w:val="none"/>
-                <w:between w:color="auto" w:space="0" w:sz="0" w:val="none"/>
-              </w:pBdr>
-              <w:spacing w:after="480" w:lineRule="auto"/>
-              <w:rPr>
-                <w:color w:val="1f1f1f"/>
-              </w:rPr>
-            </w:pPr>
-            <w:r>
-              <w:rPr>
-                <w:color w:val="1f1f1f"/>
-                <w:rtl w:val="0"/>
-              </w:rPr>
-              <w:t xml:space="preserve">- Tra cứu danh sách các trường Đại học.</w:t>
-            </w:r>
-          </w:p>
-          <w:p>
-            <w:pPr>
-              <w:pBdr>
-                <w:top w:color="auto" w:space="0" w:sz="0" w:val="none"/>
-                <w:bottom w:color="auto" w:space="0" w:sz="0" w:val="none"/>
-                <w:right w:color="auto" w:space="0" w:sz="0" w:val="none"/>
-                <w:between w:color="auto" w:space="0" w:sz="0" w:val="none"/>
-              </w:pBdr>
-              <w:spacing w:after="480" w:lineRule="auto"/>
-              <w:rPr>
-                <w:color w:val="1f1f1f"/>
-              </w:rPr>
-            </w:pPr>
-            <w:r>
-              <w:rPr>
-                <w:rtl w:val="0"/>
-              </w:rPr>
-            </w:r>
-          </w:p>
-          <w:p>
-            <w:pPr>
-              <w:pBdr>
-                <w:top w:color="auto" w:space="0" w:sz="0" w:val="none"/>
-                <w:left w:color="auto" w:space="0" w:sz="0" w:val="none"/>
-                <w:bottom w:color="auto" w:space="0" w:sz="0" w:val="none"/>
-                <w:right w:color="auto" w:space="0" w:sz="0" w:val="none"/>
-                <w:between w:color="auto" w:space="0" w:sz="0" w:val="none"/>
-              </w:pBdr>
-              <w:spacing w:after="480" w:lineRule="auto"/>
-              <w:rPr>
-                <w:color w:val="1f1f1f"/>
-              </w:rPr>
-            </w:pPr>
-            <w:r>
-              <w:rPr>
-                <w:color w:val="1f1f1f"/>
-                <w:rtl w:val="0"/>
-              </w:rPr>
-              <w:t xml:space="preserve">- Truy cập website trường -&gt; Tìm và thu thập chính xác </w:t>
-            </w:r>
-            <w:r>
-              <w:rPr>
-                <w:b w:val="1"/>
-                <w:bCs w:val="1"/>
-                <w:color w:val="1f1f1f"/>
-                <w:rtl w:val="0"/>
-              </w:rPr>
-              <w:t xml:space="preserve">Email của Trưởng khoa hoặc Phòng Đào tạo / Phòng CTSV</w:t>
-            </w:r>
-            <w:r>
-              <w:rPr>
-                <w:color w:val="1f1f1f"/>
-                <w:rtl w:val="0"/>
-              </w:rPr>
-              <w:t xml:space="preserve"> (người có thẩm quyền duyệt phối hợp).</w:t>
-            </w:r>
-          </w:p>
-        </w:tc>
-        <w:tc>
-          <w:tcPr>
-            <w:tcBorders>
-              <w:top w:color="c4c7c5" w:space="0" w:sz="5" w:val="single"/>
-              <w:left w:color="c4c7c5" w:space="0" w:sz="5" w:val="single"/>
-              <w:bottom w:color="c4c7c5" w:space="0" w:sz="5" w:val="single"/>
-              <w:right w:color="c4c7c5" w:space="0" w:sz="5" w:val="single"/>
-            </w:tcBorders>
-            <w:tcMar>
-              <w:top w:w="120.0" w:type="dxa"/>
-              <w:left w:w="180.0" w:type="dxa"/>
-              <w:bottom w:w="120.0" w:type="dxa"/>
-              <w:right w:w="180.0" w:type="dxa"/>
-            </w:tcMar>
-            <w:vAlign w:val="top"/>
-          </w:tcPr>
-          <w:p>
-            <w:pPr>
-              <w:pBdr>
-                <w:top w:color="auto" w:space="0" w:sz="0" w:val="none"/>
-                <w:left w:color="auto" w:space="0" w:sz="0" w:val="none"/>
-                <w:bottom w:color="auto" w:space="0" w:sz="0" w:val="none"/>
-                <w:right w:color="auto" w:space="0" w:sz="0" w:val="none"/>
-                <w:between w:color="auto" w:space="0" w:sz="0" w:val="none"/>
-              </w:pBdr>
-              <w:spacing w:after="480" w:lineRule="auto"/>
-              <w:rPr>
-                <w:color w:val="1f1f1f"/>
-              </w:rPr>
-            </w:pPr>
-            <w:r>
-              <w:rPr>
-                <w:color w:val="1f1f1f"/>
-                <w:rtl w:val="0"/>
-              </w:rPr>
-              <w:t xml:space="preserve">- Tra cứu tương tự hệ thống các trường Đại học lớn hoặc các Câu lạc bộ/Hội sinh viên toàn trường.</w:t>
-            </w:r>
-          </w:p>
-          <w:p>
-            <w:pPr>
-              <w:pBdr>
-                <w:top w:color="auto" w:space="0" w:sz="0" w:val="none"/>
-                <w:bottom w:color="auto" w:space="0" w:sz="0" w:val="none"/>
-                <w:right w:color="auto" w:space="0" w:sz="0" w:val="none"/>
-                <w:between w:color="auto" w:space="0" w:sz="0" w:val="none"/>
-              </w:pBdr>
-              <w:spacing w:after="480" w:lineRule="auto"/>
-              <w:rPr>
-                <w:color w:val="1f1f1f"/>
-              </w:rPr>
-            </w:pPr>
-            <w:r>
-              <w:rPr>
-                <w:rtl w:val="0"/>
-              </w:rPr>
-            </w:r>
-          </w:p>
-          <w:p>
-            <w:pPr>
-              <w:pBdr>
-                <w:top w:color="auto" w:space="0" w:sz="0" w:val="none"/>
-                <w:left w:color="auto" w:space="0" w:sz="0" w:val="none"/>
-                <w:bottom w:color="auto" w:space="0" w:sz="0" w:val="none"/>
-                <w:right w:color="auto" w:space="0" w:sz="0" w:val="none"/>
-                <w:between w:color="auto" w:space="0" w:sz="0" w:val="none"/>
-              </w:pBdr>
-              <w:spacing w:after="480" w:lineRule="auto"/>
-              <w:rPr>
-                <w:color w:val="1f1f1f"/>
-              </w:rPr>
-            </w:pPr>
-            <w:r>
-              <w:rPr>
-                <w:color w:val="1f1f1f"/>
-                <w:rtl w:val="0"/>
-              </w:rPr>
-              <w:t xml:space="preserve">- Tìm và thu thập chính xác </w:t>
-            </w:r>
-            <w:r>
-              <w:rPr>
-                <w:b w:val="1"/>
-                <w:bCs w:val="1"/>
-                <w:color w:val="1f1f1f"/>
-                <w:rtl w:val="0"/>
-              </w:rPr>
-              <w:t xml:space="preserve">Email của Trưởng khoa hoặc ban lãnh đạo có thẩm quyền</w:t>
-            </w:r>
-            <w:r>
-              <w:rPr>
-                <w:color w:val="1f1f1f"/>
-                <w:rtl w:val="0"/>
-              </w:rPr>
-              <w:t xml:space="preserve"> duyệt phối hợp.</w:t>
-            </w:r>
-          </w:p>
-        </w:tc>
-        <w:tc>
-          <w:tcPr>
-            <w:tcBorders>
-              <w:top w:color="c4c7c5" w:space="0" w:sz="5" w:val="single"/>
-              <w:left w:color="c4c7c5" w:space="0" w:sz="5" w:val="single"/>
-              <w:bottom w:color="c4c7c5" w:space="0" w:sz="5" w:val="single"/>
-              <w:right w:color="c4c7c5" w:space="0" w:sz="5" w:val="single"/>
-            </w:tcBorders>
-            <w:tcMar>
-              <w:top w:w="120.0" w:type="dxa"/>
-              <w:left w:w="180.0" w:type="dxa"/>
-              <w:bottom w:w="120.0" w:type="dxa"/>
-              <w:right w:w="180.0" w:type="dxa"/>
-            </w:tcMar>
-            <w:vAlign w:val="top"/>
-          </w:tcPr>
-          <w:p>
-            <w:pPr>
-              <w:pBdr>
-                <w:top w:color="auto" w:space="0" w:sz="0" w:val="none"/>
-                <w:bottom w:color="auto" w:space="0" w:sz="0" w:val="none"/>
-                <w:right w:color="auto" w:space="0" w:sz="0" w:val="none"/>
-                <w:between w:color="auto" w:space="0" w:sz="0" w:val="none"/>
-              </w:pBdr>
-              <w:spacing w:after="480" w:lineRule="auto"/>
-              <w:rPr>
-                <w:color w:val="1f1f1f"/>
-              </w:rPr>
-            </w:pPr>
-            <w:r>
-              <w:rPr>
-                <w:color w:val="1f1f1f"/>
-                <w:rtl w:val="0"/>
-              </w:rPr>
-              <w:t xml:space="preserve">Google Sheets, Website các trường Đại học</w:t>
-            </w:r>
-          </w:p>
-        </w:tc>
-        <w:tc>
-          <w:tcPr>
-            <w:tcBorders>
-              <w:top w:color="c4c7c5" w:space="0" w:sz="5" w:val="single"/>
-              <w:left w:color="c4c7c5" w:space="0" w:sz="5" w:val="single"/>
-              <w:bottom w:color="c4c7c5" w:space="0" w:sz="5" w:val="single"/>
-              <w:right w:color="c4c7c5" w:space="0" w:sz="5" w:val="single"/>
-            </w:tcBorders>
-            <w:tcMar>
-              <w:top w:w="120.0" w:type="dxa"/>
-              <w:left w:w="180.0" w:type="dxa"/>
-              <w:bottom w:w="120.0" w:type="dxa"/>
-              <w:right w:w="180.0" w:type="dxa"/>
-            </w:tcMar>
-            <w:vAlign w:val="top"/>
-          </w:tcPr>
-          <w:p>
-            <w:pPr>
-              <w:pBdr>
-                <w:top w:color="auto" w:space="0" w:sz="0" w:val="none"/>
-                <w:bottom w:color="auto" w:space="0" w:sz="0" w:val="none"/>
-                <w:right w:color="auto" w:space="0" w:sz="0" w:val="none"/>
-                <w:between w:color="auto" w:space="0" w:sz="0" w:val="none"/>
-              </w:pBdr>
-              <w:spacing w:after="480" w:lineRule="auto"/>
-              <w:rPr>
-                <w:color w:val="1f1f1f"/>
-              </w:rPr>
-            </w:pPr>
-            <w:r>
-              <w:rPr>
-                <w:color w:val="1f1f1f"/>
-                <w:rtl w:val="0"/>
-              </w:rPr>
-              <w:t xml:space="preserve">Đạt tối thiểu </w:t>
-            </w:r>
-            <w:r>
-              <w:rPr>
-                <w:b w:val="1"/>
-                <w:bCs w:val="1"/>
-                <w:color w:val="1f1f1f"/>
-                <w:rtl w:val="0"/>
-              </w:rPr>
-              <w:t xml:space="preserve">3 - 5 trường mục tiêu</w:t>
-            </w:r>
-            <w:r>
-              <w:rPr>
-                <w:color w:val="1f1f1f"/>
-                <w:rtl w:val="0"/>
-              </w:rPr>
-              <w:t xml:space="preserve"> được điền đầy đủ thông tin liên hệ vào file Excel để chuẩn bị gối đầu.</w:t>
+            <w:r>
+              <w:t>NGÀY 1</w:t>
+            </w:r>
+          </w:p>
+        </w:tc>
+        <w:tc>
+          <w:tcPr>
+            <w:tcBorders>
+              <w:top w:color="c4c7c5" w:space="0" w:sz="5" w:val="single"/>
+              <w:left w:color="c4c7c5" w:space="0" w:sz="5" w:val="single"/>
+              <w:bottom w:color="c4c7c5" w:space="0" w:sz="5" w:val="single"/>
+              <w:right w:color="c4c7c5" w:space="0" w:sz="5" w:val="single"/>
+            </w:tcBorders>
+            <w:tcMar>
+              <w:top w:w="120.0" w:type="dxa"/>
+              <w:left w:w="180.0" w:type="dxa"/>
+              <w:bottom w:w="120.0" w:type="dxa"/>
+              <w:right w:w="180.0" w:type="dxa"/>
+            </w:tcMar>
+            <w:vAlign w:val="top"/>
+          </w:tcPr>
+          <w:p>
+            <w:r>
+              <w:t>Bước 1: Tìm trường &amp; Quét thông tin</w:t>
+            </w:r>
+          </w:p>
+        </w:tc>
+        <w:tc>
+          <w:tcPr>
+            <w:tcBorders>
+              <w:top w:color="c4c7c5" w:space="0" w:sz="5" w:val="single"/>
+              <w:left w:color="c4c7c5" w:space="0" w:sz="5" w:val="single"/>
+              <w:bottom w:color="c4c7c5" w:space="0" w:sz="5" w:val="single"/>
+              <w:right w:color="c4c7c5" w:space="0" w:sz="5" w:val="single"/>
+            </w:tcBorders>
+            <w:tcMar>
+              <w:top w:w="120.0" w:type="dxa"/>
+              <w:left w:w="180.0" w:type="dxa"/>
+              <w:bottom w:w="120.0" w:type="dxa"/>
+              <w:right w:w="180.0" w:type="dxa"/>
+            </w:tcMar>
+            <w:vAlign w:val="top"/>
+          </w:tcPr>
+          <w:p>
+            <w:r>
+              <w:t>- Rà soát danh sách trường tiềm năng từ CRM School. Nếu chưa có trường: Lên internet tìm kiếm thông tin trường, email liên hệ, số điện thoại (Zalo) của giảng viên có thẩm quyền... và điền các thông tin đó vào CRM trước khi tạo dự án và bắt đầu.</w:t>
+              <w:br/>
+              <w:t>- Liên hệ đầu mối tại trường (Thầy/Cô, CLB Google DSC) để trao đổi hợp tác sơ bộ và pitch proposal.</w:t>
+              <w:br/>
+              <w:t>- Thảo luận để đạt được sự đồng ý hợp tác từ phía nhà trường, chốt lịch chính thức với thông tin rõ ràng về thời gian, địa điểm/hội trường, ngày tổ chức.</w:t>
+            </w:r>
+          </w:p>
+        </w:tc>
+        <w:tc>
+          <w:tcPr>
+            <w:tcBorders>
+              <w:top w:color="c4c7c5" w:space="0" w:sz="5" w:val="single"/>
+              <w:left w:color="c4c7c5" w:space="0" w:sz="5" w:val="single"/>
+              <w:bottom w:color="c4c7c5" w:space="0" w:sz="5" w:val="single"/>
+              <w:right w:color="c4c7c5" w:space="0" w:sz="5" w:val="single"/>
+            </w:tcBorders>
+            <w:tcMar>
+              <w:top w:w="120.0" w:type="dxa"/>
+              <w:left w:w="180.0" w:type="dxa"/>
+              <w:bottom w:w="120.0" w:type="dxa"/>
+              <w:right w:w="180.0" w:type="dxa"/>
+            </w:tcMar>
+            <w:vAlign w:val="top"/>
+          </w:tcPr>
+          <w:p>
+            <w:r>
+              <w:t>- Tra cứu tương tự hệ thống các trường Đại học lớn hoặc các Câu lạc bộ/Hội sinh viên toàn trường.</w:t>
+              <w:br/>
+              <w:t>- Tìm và thu thập chính xác Email của Trưởng khoa hoặc ban lãnh đạo có thẩm quyền duyệt phối hợp.</w:t>
+            </w:r>
+          </w:p>
+        </w:tc>
+        <w:tc>
+          <w:tcPr>
+            <w:tcBorders>
+              <w:top w:color="c4c7c5" w:space="0" w:sz="5" w:val="single"/>
+              <w:left w:color="c4c7c5" w:space="0" w:sz="5" w:val="single"/>
+              <w:bottom w:color="c4c7c5" w:space="0" w:sz="5" w:val="single"/>
+              <w:right w:color="c4c7c5" w:space="0" w:sz="5" w:val="single"/>
+            </w:tcBorders>
+            <w:tcMar>
+              <w:top w:w="120.0" w:type="dxa"/>
+              <w:left w:w="180.0" w:type="dxa"/>
+              <w:bottom w:w="120.0" w:type="dxa"/>
+              <w:right w:w="180.0" w:type="dxa"/>
+            </w:tcMar>
+            <w:vAlign w:val="top"/>
+          </w:tcPr>
+          <w:p>
+            <w:r>
+              <w:t>CRM School, Website các trường Đại học, Zalo, Gmail</w:t>
+            </w:r>
+          </w:p>
+        </w:tc>
+        <w:tc>
+          <w:tcPr>
+            <w:tcBorders>
+              <w:top w:color="c4c7c5" w:space="0" w:sz="5" w:val="single"/>
+              <w:left w:color="c4c7c5" w:space="0" w:sz="5" w:val="single"/>
+              <w:bottom w:color="c4c7c5" w:space="0" w:sz="5" w:val="single"/>
+              <w:right w:color="c4c7c5" w:space="0" w:sz="5" w:val="single"/>
+            </w:tcBorders>
+            <w:tcMar>
+              <w:top w:w="120.0" w:type="dxa"/>
+              <w:left w:w="180.0" w:type="dxa"/>
+              <w:bottom w:w="120.0" w:type="dxa"/>
+              <w:right w:w="180.0" w:type="dxa"/>
+            </w:tcMar>
+            <w:vAlign w:val="top"/>
+          </w:tcPr>
+          <w:p>
+            <w:r>
+              <w:t>Điền đầy đủ thông tin trường vào CRM. Đạt được sự đồng ý hợp tác sơ bộ và chốt lịch chính thức.</w:t>
             </w:r>
           </w:p>
         </w:tc>
@@ -862,640 +626,124 @@
             <w:vAlign w:val="top"/>
           </w:tcPr>
           <w:p>
-            <w:pPr>
-              <w:pBdr>
-                <w:top w:color="auto" w:space="0" w:sz="0" w:val="none"/>
-                <w:bottom w:color="auto" w:space="0" w:sz="0" w:val="none"/>
-                <w:right w:color="auto" w:space="0" w:sz="0" w:val="none"/>
-                <w:between w:color="auto" w:space="0" w:sz="0" w:val="none"/>
-              </w:pBdr>
-              <w:spacing w:after="480" w:lineRule="auto"/>
-              <w:rPr>
-                <w:color w:val="1f1f1f"/>
-              </w:rPr>
-            </w:pPr>
-            <w:r>
-              <w:rPr>
-                <w:b w:val="1"/>
-                <w:bCs w:val="1"/>
-                <w:color w:val="1f1f1f"/>
-                <w:rtl w:val="0"/>
-              </w:rPr>
-              <w:t xml:space="preserve">NGÀY 2</w:t>
-            </w:r>
-            <w:r>
-              <w:rPr>
-                <w:rtl w:val="0"/>
-              </w:rPr>
-            </w:r>
-          </w:p>
-        </w:tc>
-        <w:tc>
-          <w:tcPr>
-            <w:tcBorders>
-              <w:top w:color="c4c7c5" w:space="0" w:sz="5" w:val="single"/>
-              <w:left w:color="c4c7c5" w:space="0" w:sz="5" w:val="single"/>
-              <w:bottom w:color="c4c7c5" w:space="0" w:sz="5" w:val="single"/>
-              <w:right w:color="c4c7c5" w:space="0" w:sz="5" w:val="single"/>
-            </w:tcBorders>
-            <w:tcMar>
-              <w:top w:w="120.0" w:type="dxa"/>
-              <w:left w:w="180.0" w:type="dxa"/>
-              <w:bottom w:w="120.0" w:type="dxa"/>
-              <w:right w:w="180.0" w:type="dxa"/>
-            </w:tcMar>
-            <w:vAlign w:val="top"/>
-          </w:tcPr>
-          <w:p>
-            <w:pPr>
-              <w:pBdr>
-                <w:top w:color="auto" w:space="0" w:sz="0" w:val="none"/>
-                <w:bottom w:color="auto" w:space="0" w:sz="0" w:val="none"/>
-                <w:right w:color="auto" w:space="0" w:sz="0" w:val="none"/>
-                <w:between w:color="auto" w:space="0" w:sz="0" w:val="none"/>
-              </w:pBdr>
-              <w:spacing w:after="480" w:lineRule="auto"/>
-              <w:rPr>
-                <w:color w:val="1f1f1f"/>
-              </w:rPr>
-            </w:pPr>
-            <w:r>
-              <w:rPr>
-                <w:b w:val="1"/>
-                <w:bCs w:val="1"/>
-                <w:color w:val="1f1f1f"/>
-                <w:rtl w:val="0"/>
-              </w:rPr>
-              <w:t xml:space="preserve">Bước 2: Gửi Email Đề xuất Phối hợp</w:t>
-            </w:r>
-            <w:r>
-              <w:rPr>
-                <w:rtl w:val="0"/>
-              </w:rPr>
-            </w:r>
-          </w:p>
-        </w:tc>
-        <w:tc>
-          <w:tcPr>
-            <w:tcBorders>
-              <w:top w:color="c4c7c5" w:space="0" w:sz="5" w:val="single"/>
-              <w:left w:color="c4c7c5" w:space="0" w:sz="5" w:val="single"/>
-              <w:bottom w:color="c4c7c5" w:space="0" w:sz="5" w:val="single"/>
-              <w:right w:color="c4c7c5" w:space="0" w:sz="5" w:val="single"/>
-            </w:tcBorders>
-            <w:tcMar>
-              <w:top w:w="120.0" w:type="dxa"/>
-              <w:left w:w="180.0" w:type="dxa"/>
-              <w:bottom w:w="120.0" w:type="dxa"/>
-              <w:right w:w="180.0" w:type="dxa"/>
-            </w:tcMar>
-            <w:vAlign w:val="top"/>
-          </w:tcPr>
-          <w:p>
-            <w:pPr>
-              <w:pBdr>
-                <w:top w:color="auto" w:space="0" w:sz="0" w:val="none"/>
-                <w:left w:color="auto" w:space="0" w:sz="0" w:val="none"/>
-                <w:bottom w:color="auto" w:space="0" w:sz="0" w:val="none"/>
-                <w:right w:color="auto" w:space="0" w:sz="0" w:val="none"/>
-                <w:between w:color="auto" w:space="0" w:sz="0" w:val="none"/>
-              </w:pBdr>
-              <w:spacing w:after="480" w:lineRule="auto"/>
-              <w:rPr>
-                <w:color w:val="1f1f1f"/>
-              </w:rPr>
-            </w:pPr>
-            <w:r>
-              <w:rPr>
-                <w:color w:val="1f1f1f"/>
-                <w:rtl w:val="0"/>
-              </w:rPr>
-              <w:t xml:space="preserve">- Gửi email chính thức từ account Ambassador đề xuất tổ chức WS quy mô </w:t>
-            </w:r>
-            <w:r>
-              <w:rPr>
-                <w:b w:val="1"/>
-                <w:bCs w:val="1"/>
-                <w:color w:val="1f1f1f"/>
-                <w:rtl w:val="0"/>
-              </w:rPr>
-              <w:t xml:space="preserve">+250 sinh viên</w:t>
-            </w:r>
-            <w:r>
-              <w:rPr>
-                <w:color w:val="1f1f1f"/>
-                <w:rtl w:val="0"/>
-              </w:rPr>
-              <w:t xml:space="preserve">.</w:t>
-            </w:r>
-          </w:p>
-          <w:p>
-            <w:pPr>
-              <w:pBdr>
-                <w:top w:color="auto" w:space="0" w:sz="0" w:val="none"/>
-                <w:bottom w:color="auto" w:space="0" w:sz="0" w:val="none"/>
-                <w:right w:color="auto" w:space="0" w:sz="0" w:val="none"/>
-                <w:between w:color="auto" w:space="0" w:sz="0" w:val="none"/>
-              </w:pBdr>
-              <w:spacing w:after="480" w:lineRule="auto"/>
-              <w:rPr>
-                <w:color w:val="1f1f1f"/>
-              </w:rPr>
-            </w:pPr>
-            <w:r>
-              <w:rPr>
-                <w:rtl w:val="0"/>
-              </w:rPr>
-            </w:r>
-          </w:p>
-          <w:p>
-            <w:pPr>
-              <w:pBdr>
-                <w:top w:color="auto" w:space="0" w:sz="0" w:val="none"/>
-                <w:left w:color="auto" w:space="0" w:sz="0" w:val="none"/>
-                <w:bottom w:color="auto" w:space="0" w:sz="0" w:val="none"/>
-                <w:right w:color="auto" w:space="0" w:sz="0" w:val="none"/>
-                <w:between w:color="auto" w:space="0" w:sz="0" w:val="none"/>
-              </w:pBdr>
-              <w:spacing w:after="480" w:lineRule="auto"/>
-              <w:rPr>
-                <w:color w:val="1f1f1f"/>
-              </w:rPr>
-            </w:pPr>
-            <w:r>
-              <w:rPr>
-                <w:color w:val="1f1f1f"/>
-                <w:rtl w:val="0"/>
-              </w:rPr>
-              <w:t xml:space="preserve">- </w:t>
-            </w:r>
-            <w:r>
-              <w:rPr>
-                <w:b w:val="1"/>
-                <w:bCs w:val="1"/>
-                <w:color w:val="1f1f1f"/>
-                <w:rtl w:val="0"/>
-              </w:rPr>
-              <w:t xml:space="preserve">Yêu cầu trường hỗ trợ:</w:t>
-            </w:r>
-            <w:r>
-              <w:rPr>
-                <w:color w:val="1f1f1f"/>
-                <w:rtl w:val="0"/>
-              </w:rPr>
-              <w:t xml:space="preserve"> Truyền thông (Fanpage/Group trường) và Cơ sở vật chất (</w:t>
-            </w:r>
-            <w:r>
-              <w:rPr>
-                <w:b w:val="1"/>
-                <w:bCs w:val="1"/>
-                <w:color w:val="1f1f1f"/>
-                <w:rtl w:val="0"/>
-              </w:rPr>
-              <w:t xml:space="preserve">Hội trường lớn, thiết bị âm thanh, ánh sáng, mic, máy chiếu...</w:t>
-            </w:r>
-            <w:r>
-              <w:rPr>
-                <w:color w:val="1f1f1f"/>
-                <w:rtl w:val="0"/>
-              </w:rPr>
-              <w:t xml:space="preserve">).</w:t>
-            </w:r>
-          </w:p>
-          <w:p>
-            <w:pPr>
-              <w:pBdr>
-                <w:top w:color="auto" w:space="0" w:sz="0" w:val="none"/>
-                <w:bottom w:color="auto" w:space="0" w:sz="0" w:val="none"/>
-                <w:right w:color="auto" w:space="0" w:sz="0" w:val="none"/>
-                <w:between w:color="auto" w:space="0" w:sz="0" w:val="none"/>
-              </w:pBdr>
-              <w:spacing w:after="480" w:lineRule="auto"/>
-              <w:rPr>
-                <w:color w:val="1f1f1f"/>
-              </w:rPr>
-            </w:pPr>
-            <w:r>
-              <w:rPr>
-                <w:rtl w:val="0"/>
-              </w:rPr>
-            </w:r>
-          </w:p>
-          <w:p>
-            <w:pPr>
-              <w:pBdr>
-                <w:top w:color="auto" w:space="0" w:sz="0" w:val="none"/>
-                <w:left w:color="auto" w:space="0" w:sz="0" w:val="none"/>
-                <w:bottom w:color="auto" w:space="0" w:sz="0" w:val="none"/>
-                <w:right w:color="auto" w:space="0" w:sz="0" w:val="none"/>
-                <w:between w:color="auto" w:space="0" w:sz="0" w:val="none"/>
-              </w:pBdr>
-              <w:spacing w:after="480" w:lineRule="auto"/>
-              <w:rPr>
-                <w:color w:val="1f1f1f"/>
-              </w:rPr>
-            </w:pPr>
-            <w:r>
-              <w:rPr>
-                <w:color w:val="1f1f1f"/>
-                <w:rtl w:val="0"/>
-              </w:rPr>
-              <w:t xml:space="preserve">- </w:t>
-            </w:r>
-            <w:r>
-              <w:rPr>
-                <w:b w:val="1"/>
-                <w:bCs w:val="1"/>
-                <w:color w:val="1f1f1f"/>
-                <w:rtl w:val="0"/>
-              </w:rPr>
-              <w:t xml:space="preserve">Quyền lợi đổi lại:</w:t>
-            </w:r>
-            <w:r>
-              <w:rPr>
-                <w:color w:val="1f1f1f"/>
-                <w:rtl w:val="0"/>
-              </w:rPr>
-              <w:t xml:space="preserve"> Trao giá trị kỹ năng số cho SV; đồng thời </w:t>
-            </w:r>
-            <w:r>
-              <w:rPr>
-                <w:b w:val="1"/>
-                <w:bCs w:val="1"/>
-                <w:color w:val="1f1f1f"/>
-                <w:rtl w:val="0"/>
-              </w:rPr>
-              <w:t xml:space="preserve">sử dụng hình ảnh, tư liệu buổi WS đăng lên Fanpage, TikTok</w:t>
-            </w:r>
-            <w:r>
-              <w:rPr>
-                <w:color w:val="1f1f1f"/>
-                <w:rtl w:val="0"/>
-              </w:rPr>
-              <w:t xml:space="preserve"> để truyền thông thương hiệu cho cả 2 bên.</w:t>
-            </w:r>
-          </w:p>
-          <w:p>
-            <w:pPr>
-              <w:pBdr>
-                <w:top w:color="auto" w:space="0" w:sz="0" w:val="none"/>
-                <w:bottom w:color="auto" w:space="0" w:sz="0" w:val="none"/>
-                <w:right w:color="auto" w:space="0" w:sz="0" w:val="none"/>
-                <w:between w:color="auto" w:space="0" w:sz="0" w:val="none"/>
-              </w:pBdr>
-              <w:spacing w:after="480" w:lineRule="auto"/>
-              <w:rPr>
-                <w:color w:val="1f1f1f"/>
-              </w:rPr>
-            </w:pPr>
-            <w:r>
-              <w:rPr>
-                <w:rtl w:val="0"/>
-              </w:rPr>
-            </w:r>
-          </w:p>
-          <w:p>
-            <w:pPr>
-              <w:pBdr>
-                <w:top w:color="auto" w:space="0" w:sz="0" w:val="none"/>
-                <w:left w:color="auto" w:space="0" w:sz="0" w:val="none"/>
-                <w:bottom w:color="auto" w:space="0" w:sz="0" w:val="none"/>
-                <w:right w:color="auto" w:space="0" w:sz="0" w:val="none"/>
-                <w:between w:color="auto" w:space="0" w:sz="0" w:val="none"/>
-              </w:pBdr>
-              <w:spacing w:after="480" w:lineRule="auto"/>
-              <w:rPr>
-                <w:color w:val="1f1f1f"/>
-              </w:rPr>
-            </w:pPr>
-            <w:r>
-              <w:rPr>
-                <w:color w:val="1f1f1f"/>
-                <w:rtl w:val="0"/>
-              </w:rPr>
-              <w:t xml:space="preserve">- </w:t>
-            </w:r>
-            <w:r>
-              <w:rPr>
-                <w:i w:val="1"/>
-                <w:iCs w:val="1"/>
-                <w:color w:val="1f1f1f"/>
-                <w:rtl w:val="0"/>
-              </w:rPr>
-              <w:t xml:space="preserve">Cải tiến:</w:t>
-            </w:r>
-            <w:r>
-              <w:rPr>
-                <w:color w:val="1f1f1f"/>
-                <w:rtl w:val="0"/>
-              </w:rPr>
-              <w:t xml:space="preserve"> Đính kèm link video/ảnh bùng nổ của trường cũ làm vũ khí uy tín thuyết phục Trưởng khoa duyệt ngay.</w:t>
-            </w:r>
-          </w:p>
-        </w:tc>
-        <w:tc>
-          <w:tcPr>
-            <w:tcBorders>
-              <w:top w:color="c4c7c5" w:space="0" w:sz="5" w:val="single"/>
-              <w:left w:color="c4c7c5" w:space="0" w:sz="5" w:val="single"/>
-              <w:bottom w:color="c4c7c5" w:space="0" w:sz="5" w:val="single"/>
-              <w:right w:color="c4c7c5" w:space="0" w:sz="5" w:val="single"/>
-            </w:tcBorders>
-            <w:tcMar>
-              <w:top w:w="120.0" w:type="dxa"/>
-              <w:left w:w="180.0" w:type="dxa"/>
-              <w:bottom w:w="120.0" w:type="dxa"/>
-              <w:right w:w="180.0" w:type="dxa"/>
-            </w:tcMar>
-            <w:vAlign w:val="top"/>
-          </w:tcPr>
-          <w:p>
-            <w:pPr>
-              <w:pBdr>
-                <w:top w:color="auto" w:space="0" w:sz="0" w:val="none"/>
-                <w:left w:color="auto" w:space="0" w:sz="0" w:val="none"/>
-                <w:bottom w:color="auto" w:space="0" w:sz="0" w:val="none"/>
-                <w:right w:color="auto" w:space="0" w:sz="0" w:val="none"/>
-                <w:between w:color="auto" w:space="0" w:sz="0" w:val="none"/>
-              </w:pBdr>
-              <w:spacing w:after="480" w:lineRule="auto"/>
-              <w:rPr>
-                <w:color w:val="1f1f1f"/>
-              </w:rPr>
-            </w:pPr>
-            <w:r>
-              <w:rPr>
-                <w:color w:val="1f1f1f"/>
-                <w:rtl w:val="0"/>
-              </w:rPr>
-              <w:t xml:space="preserve">- Gửi email chính thức đề xuất tổ chức Online Webinar</w:t>
-            </w:r>
-          </w:p>
-          <w:p>
-            <w:pPr>
-              <w:pBdr>
-                <w:top w:color="auto" w:space="0" w:sz="0" w:val="none"/>
-                <w:bottom w:color="auto" w:space="0" w:sz="0" w:val="none"/>
-                <w:right w:color="auto" w:space="0" w:sz="0" w:val="none"/>
-                <w:between w:color="auto" w:space="0" w:sz="0" w:val="none"/>
-              </w:pBdr>
-              <w:spacing w:after="480" w:lineRule="auto"/>
-              <w:rPr>
-                <w:color w:val="1f1f1f"/>
-              </w:rPr>
-            </w:pPr>
-            <w:r>
-              <w:rPr>
-                <w:rtl w:val="0"/>
-              </w:rPr>
-            </w:r>
-          </w:p>
-          <w:p>
-            <w:pPr>
-              <w:pBdr>
-                <w:top w:color="auto" w:space="0" w:sz="0" w:val="none"/>
-                <w:left w:color="auto" w:space="0" w:sz="0" w:val="none"/>
-                <w:bottom w:color="auto" w:space="0" w:sz="0" w:val="none"/>
-                <w:right w:color="auto" w:space="0" w:sz="0" w:val="none"/>
-                <w:between w:color="auto" w:space="0" w:sz="0" w:val="none"/>
-              </w:pBdr>
-              <w:spacing w:after="480" w:lineRule="auto"/>
-              <w:rPr>
-                <w:color w:val="1f1f1f"/>
-              </w:rPr>
-            </w:pPr>
-            <w:r>
-              <w:rPr>
-                <w:color w:val="1f1f1f"/>
-                <w:rtl w:val="0"/>
-              </w:rPr>
-              <w:t xml:space="preserve">- </w:t>
-            </w:r>
-            <w:r>
-              <w:rPr>
-                <w:b w:val="1"/>
-                <w:bCs w:val="1"/>
-                <w:color w:val="1f1f1f"/>
-                <w:rtl w:val="0"/>
-              </w:rPr>
-              <w:t xml:space="preserve">Yêu cầu trường hỗ trợ:</w:t>
-            </w:r>
-            <w:r>
-              <w:rPr>
-                <w:color w:val="1f1f1f"/>
-                <w:rtl w:val="0"/>
-              </w:rPr>
-              <w:t xml:space="preserve"> Truyền thông phủ rộng (Đăng Fanpage trường/khoa, gửi link phòng học trực tiếp vào các group lớp, group Zalo SV). Ngân sách thiết bị bằng 0.</w:t>
-            </w:r>
-          </w:p>
-          <w:p>
-            <w:pPr>
-              <w:pBdr>
-                <w:top w:color="auto" w:space="0" w:sz="0" w:val="none"/>
-                <w:bottom w:color="auto" w:space="0" w:sz="0" w:val="none"/>
-                <w:right w:color="auto" w:space="0" w:sz="0" w:val="none"/>
-                <w:between w:color="auto" w:space="0" w:sz="0" w:val="none"/>
-              </w:pBdr>
-              <w:spacing w:after="480" w:lineRule="auto"/>
-              <w:rPr>
-                <w:color w:val="1f1f1f"/>
-              </w:rPr>
-            </w:pPr>
-            <w:r>
-              <w:rPr>
-                <w:rtl w:val="0"/>
-              </w:rPr>
-            </w:r>
-          </w:p>
-          <w:p>
-            <w:pPr>
-              <w:pBdr>
-                <w:top w:color="auto" w:space="0" w:sz="0" w:val="none"/>
-                <w:left w:color="auto" w:space="0" w:sz="0" w:val="none"/>
-                <w:bottom w:color="auto" w:space="0" w:sz="0" w:val="none"/>
-                <w:right w:color="auto" w:space="0" w:sz="0" w:val="none"/>
-                <w:between w:color="auto" w:space="0" w:sz="0" w:val="none"/>
-              </w:pBdr>
-              <w:spacing w:after="480" w:lineRule="auto"/>
-              <w:rPr>
-                <w:color w:val="1f1f1f"/>
-              </w:rPr>
-            </w:pPr>
-            <w:r>
-              <w:rPr>
-                <w:color w:val="1f1f1f"/>
-                <w:rtl w:val="0"/>
-              </w:rPr>
-              <w:t xml:space="preserve">- </w:t>
-            </w:r>
-            <w:r>
-              <w:rPr>
-                <w:b w:val="1"/>
-                <w:bCs w:val="1"/>
-                <w:color w:val="1f1f1f"/>
-                <w:rtl w:val="0"/>
-              </w:rPr>
-              <w:t xml:space="preserve">Quyền lợi đổi lại:</w:t>
-            </w:r>
-            <w:r>
-              <w:rPr>
-                <w:color w:val="1f1f1f"/>
-                <w:rtl w:val="0"/>
-              </w:rPr>
-              <w:t xml:space="preserve"> Trao giá trị cho SV; đồng thời </w:t>
-            </w:r>
-            <w:r>
-              <w:rPr>
-                <w:b w:val="1"/>
-                <w:bCs w:val="1"/>
-                <w:color w:val="1f1f1f"/>
-                <w:rtl w:val="0"/>
-              </w:rPr>
-              <w:t xml:space="preserve">sử dụng file quay màn hình (Screen Record) và ảnh chụp màn hình room họp để đăng Fanpage, TikTok</w:t>
-            </w:r>
-            <w:r>
-              <w:rPr>
-                <w:color w:val="1f1f1f"/>
-                <w:rtl w:val="0"/>
-              </w:rPr>
-              <w:t xml:space="preserve"> truyền thông cho cả 2 bên.</w:t>
-            </w:r>
-          </w:p>
-          <w:p>
-            <w:pPr>
-              <w:pBdr>
-                <w:top w:color="auto" w:space="0" w:sz="0" w:val="none"/>
-                <w:bottom w:color="auto" w:space="0" w:sz="0" w:val="none"/>
-                <w:right w:color="auto" w:space="0" w:sz="0" w:val="none"/>
-                <w:between w:color="auto" w:space="0" w:sz="0" w:val="none"/>
-              </w:pBdr>
-              <w:spacing w:after="480" w:lineRule="auto"/>
-              <w:rPr>
-                <w:color w:val="1f1f1f"/>
-              </w:rPr>
-            </w:pPr>
-            <w:r>
-              <w:rPr>
-                <w:rtl w:val="0"/>
-              </w:rPr>
-            </w:r>
-          </w:p>
-          <w:p>
-            <w:pPr>
-              <w:pBdr>
-                <w:top w:color="auto" w:space="0" w:sz="0" w:val="none"/>
-                <w:left w:color="auto" w:space="0" w:sz="0" w:val="none"/>
-                <w:bottom w:color="auto" w:space="0" w:sz="0" w:val="none"/>
-                <w:right w:color="auto" w:space="0" w:sz="0" w:val="none"/>
-                <w:between w:color="auto" w:space="0" w:sz="0" w:val="none"/>
-              </w:pBdr>
-              <w:spacing w:after="480" w:lineRule="auto"/>
-              <w:rPr>
-                <w:i w:val="1"/>
-                <w:iCs w:val="1"/>
-                <w:color w:val="1f1f1f"/>
-              </w:rPr>
-            </w:pPr>
-            <w:r>
-              <w:rPr>
-                <w:color w:val="1f1f1f"/>
-                <w:rtl w:val="0"/>
-              </w:rPr>
-              <w:t xml:space="preserve">- </w:t>
-            </w:r>
-            <w:r>
-              <w:rPr>
-                <w:i w:val="1"/>
-                <w:iCs w:val="1"/>
-                <w:color w:val="1f1f1f"/>
-                <w:rtl w:val="0"/>
-              </w:rPr>
-              <w:t xml:space="preserve">Cải tiến tương tự phương án Offline.</w:t>
-            </w:r>
-          </w:p>
-        </w:tc>
-        <w:tc>
-          <w:tcPr>
-            <w:tcBorders>
-              <w:top w:color="c4c7c5" w:space="0" w:sz="5" w:val="single"/>
-              <w:left w:color="c4c7c5" w:space="0" w:sz="5" w:val="single"/>
-              <w:bottom w:color="c4c7c5" w:space="0" w:sz="5" w:val="single"/>
-              <w:right w:color="c4c7c5" w:space="0" w:sz="5" w:val="single"/>
-            </w:tcBorders>
-            <w:tcMar>
-              <w:top w:w="120.0" w:type="dxa"/>
-              <w:left w:w="180.0" w:type="dxa"/>
-              <w:bottom w:w="120.0" w:type="dxa"/>
-              <w:right w:w="180.0" w:type="dxa"/>
-            </w:tcMar>
-            <w:vAlign w:val="top"/>
-          </w:tcPr>
-          <w:p>
-            <w:pPr>
-              <w:pBdr>
-                <w:top w:color="auto" w:space="0" w:sz="0" w:val="none"/>
-                <w:bottom w:color="auto" w:space="0" w:sz="0" w:val="none"/>
-                <w:right w:color="auto" w:space="0" w:sz="0" w:val="none"/>
-                <w:between w:color="auto" w:space="0" w:sz="0" w:val="none"/>
-              </w:pBdr>
-              <w:spacing w:after="480" w:lineRule="auto"/>
-              <w:rPr>
-                <w:color w:val="1f1f1f"/>
-              </w:rPr>
-            </w:pPr>
-            <w:r>
-              <w:rPr>
-                <w:color w:val="1f1f1f"/>
-                <w:rtl w:val="0"/>
-              </w:rPr>
-              <w:t xml:space="preserve">Gmail (tài khoản Ambassador chính thức)</w:t>
-            </w:r>
-          </w:p>
-        </w:tc>
-        <w:tc>
-          <w:tcPr>
-            <w:tcBorders>
-              <w:top w:color="c4c7c5" w:space="0" w:sz="5" w:val="single"/>
-              <w:left w:color="c4c7c5" w:space="0" w:sz="5" w:val="single"/>
-              <w:bottom w:color="c4c7c5" w:space="0" w:sz="5" w:val="single"/>
-              <w:right w:color="c4c7c5" w:space="0" w:sz="5" w:val="single"/>
-            </w:tcBorders>
-            <w:tcMar>
-              <w:top w:w="120.0" w:type="dxa"/>
-              <w:left w:w="180.0" w:type="dxa"/>
-              <w:bottom w:w="120.0" w:type="dxa"/>
-              <w:right w:w="180.0" w:type="dxa"/>
-            </w:tcMar>
-            <w:vAlign w:val="top"/>
-          </w:tcPr>
-          <w:p>
-            <w:pPr>
-              <w:pBdr>
-                <w:top w:color="auto" w:space="0" w:sz="0" w:val="none"/>
-                <w:bottom w:color="auto" w:space="0" w:sz="0" w:val="none"/>
-                <w:right w:color="auto" w:space="0" w:sz="0" w:val="none"/>
-                <w:between w:color="auto" w:space="0" w:sz="0" w:val="none"/>
-              </w:pBdr>
-              <w:spacing w:after="480" w:lineRule="auto"/>
-              <w:rPr>
-                <w:color w:val="1f1f1f"/>
-              </w:rPr>
-            </w:pPr>
-            <w:r>
-              <w:rPr>
-                <w:b w:val="1"/>
-                <w:bCs w:val="1"/>
-                <w:color w:val="1f1f1f"/>
-                <w:rtl w:val="0"/>
-              </w:rPr>
-              <w:t xml:space="preserve">Nhà trường phản hồi đồng ý phối hợp</w:t>
-            </w:r>
-            <w:r>
-              <w:rPr>
-                <w:color w:val="1f1f1f"/>
-                <w:rtl w:val="0"/>
-              </w:rPr>
-              <w:t xml:space="preserve"> bằng văn bản hoặc email, chốt ngày giờ tổ chức cụ thể và cử nhân sự đầu mối hỗ trợ.</w:t>
+            <w:r>
+              <w:t>NGÀY 2</w:t>
+            </w:r>
+          </w:p>
+        </w:tc>
+        <w:tc>
+          <w:tcPr>
+            <w:tcBorders>
+              <w:top w:color="c4c7c5" w:space="0" w:sz="5" w:val="single"/>
+              <w:left w:color="c4c7c5" w:space="0" w:sz="5" w:val="single"/>
+              <w:bottom w:color="c4c7c5" w:space="0" w:sz="5" w:val="single"/>
+              <w:right w:color="c4c7c5" w:space="0" w:sz="5" w:val="single"/>
+            </w:tcBorders>
+            <w:tcMar>
+              <w:top w:w="120.0" w:type="dxa"/>
+              <w:left w:w="180.0" w:type="dxa"/>
+              <w:bottom w:w="120.0" w:type="dxa"/>
+              <w:right w:w="180.0" w:type="dxa"/>
+            </w:tcMar>
+            <w:vAlign w:val="top"/>
+          </w:tcPr>
+          <w:p>
+            <w:r>
+              <w:t>Bước 2: Thủ tục Google &amp; Gửi Email Đề xuất</w:t>
+            </w:r>
+          </w:p>
+        </w:tc>
+        <w:tc>
+          <w:tcPr>
+            <w:tcBorders>
+              <w:top w:color="c4c7c5" w:space="0" w:sz="5" w:val="single"/>
+              <w:left w:color="c4c7c5" w:space="0" w:sz="5" w:val="single"/>
+              <w:bottom w:color="c4c7c5" w:space="0" w:sz="5" w:val="single"/>
+              <w:right w:color="c4c7c5" w:space="0" w:sz="5" w:val="single"/>
+            </w:tcBorders>
+            <w:tcMar>
+              <w:top w:w="120.0" w:type="dxa"/>
+              <w:left w:w="180.0" w:type="dxa"/>
+              <w:bottom w:w="120.0" w:type="dxa"/>
+              <w:right w:w="180.0" w:type="dxa"/>
+            </w:tcMar>
+            <w:vAlign w:val="top"/>
+          </w:tcPr>
+          <w:p>
+            <w:r>
+              <w:t>- Vào Google Drive tạo thư mục (folder) có tên trường dựa theo thư mục ví dụ hoặc thư mục của trường khác đã tổ chức trước đó để lưu trữ toàn bộ tài liệu và ấn phẩm của trường này.</w:t>
+              <w:br/>
+              <w:t>- Gửi email booking hội trường và Đề xuất Phối hợp chính thức cho nhà trường, đính kèm link folder poster/banner của trường (sau khi đã chuẩn bị xong folder ở Bước 3).</w:t>
+              <w:br/>
+              <w:t>- Điền form đăng ký workshop cho Google (Chí Thắng, Xuân Thi, Thảo, Phương Linh).</w:t>
+            </w:r>
+          </w:p>
+        </w:tc>
+        <w:tc>
+          <w:tcPr>
+            <w:tcBorders>
+              <w:top w:color="c4c7c5" w:space="0" w:sz="5" w:val="single"/>
+              <w:left w:color="c4c7c5" w:space="0" w:sz="5" w:val="single"/>
+              <w:bottom w:color="c4c7c5" w:space="0" w:sz="5" w:val="single"/>
+              <w:right w:color="c4c7c5" w:space="0" w:sz="5" w:val="single"/>
+            </w:tcBorders>
+            <w:tcMar>
+              <w:top w:w="120.0" w:type="dxa"/>
+              <w:left w:w="180.0" w:type="dxa"/>
+              <w:bottom w:w="120.0" w:type="dxa"/>
+              <w:right w:w="180.0" w:type="dxa"/>
+            </w:tcMar>
+            <w:vAlign w:val="top"/>
+          </w:tcPr>
+          <w:p>
+            <w:r>
+              <w:t>- Gửi email đề xuất tổ chức Online Webinar chính thức, gửi file đính kèm giới thiệu.</w:t>
+              <w:br/>
+              <w:t>- Điền form đăng ký workshop cho Google tương tự Offline.</w:t>
+            </w:r>
+          </w:p>
+        </w:tc>
+        <w:tc>
+          <w:tcPr>
+            <w:tcBorders>
+              <w:top w:color="c4c7c5" w:space="0" w:sz="5" w:val="single"/>
+              <w:left w:color="c4c7c5" w:space="0" w:sz="5" w:val="single"/>
+              <w:bottom w:color="c4c7c5" w:space="0" w:sz="5" w:val="single"/>
+              <w:right w:color="c4c7c5" w:space="0" w:sz="5" w:val="single"/>
+            </w:tcBorders>
+            <w:tcMar>
+              <w:top w:w="120.0" w:type="dxa"/>
+              <w:left w:w="180.0" w:type="dxa"/>
+              <w:bottom w:w="120.0" w:type="dxa"/>
+              <w:right w:w="180.0" w:type="dxa"/>
+            </w:tcMar>
+            <w:vAlign w:val="top"/>
+          </w:tcPr>
+          <w:p>
+            <w:r>
+              <w:t>Gmail, Google Form nội bộ, Google Drive</w:t>
+            </w:r>
+          </w:p>
+        </w:tc>
+        <w:tc>
+          <w:tcPr>
+            <w:tcBorders>
+              <w:top w:color="c4c7c5" w:space="0" w:sz="5" w:val="single"/>
+              <w:left w:color="c4c7c5" w:space="0" w:sz="5" w:val="single"/>
+              <w:bottom w:color="c4c7c5" w:space="0" w:sz="5" w:val="single"/>
+              <w:right w:color="c4c7c5" w:space="0" w:sz="5" w:val="single"/>
+            </w:tcBorders>
+            <w:tcMar>
+              <w:top w:w="120.0" w:type="dxa"/>
+              <w:left w:w="180.0" w:type="dxa"/>
+              <w:bottom w:w="120.0" w:type="dxa"/>
+              <w:right w:w="180.0" w:type="dxa"/>
+            </w:tcMar>
+            <w:vAlign w:val="top"/>
+          </w:tcPr>
+          <w:p>
+            <w:r>
+              <w:t>Điền xong form Google; Thư mục của trường trên Drive được thiết lập; Gửi email đề xuất đính kèm link folder.</w:t>
             </w:r>
           </w:p>
         </w:tc>
@@ -1523,506 +771,130 @@
             <w:vAlign w:val="top"/>
           </w:tcPr>
           <w:p>
-            <w:pPr>
-              <w:pBdr>
-                <w:top w:color="auto" w:space="0" w:sz="0" w:val="none"/>
-                <w:bottom w:color="auto" w:space="0" w:sz="0" w:val="none"/>
-                <w:right w:color="auto" w:space="0" w:sz="0" w:val="none"/>
-                <w:between w:color="auto" w:space="0" w:sz="0" w:val="none"/>
-              </w:pBdr>
-              <w:spacing w:after="480" w:lineRule="auto"/>
-              <w:rPr>
-                <w:color w:val="1f1f1f"/>
-              </w:rPr>
-            </w:pPr>
-            <w:r>
-              <w:rPr>
-                <w:b w:val="1"/>
-                <w:bCs w:val="1"/>
-                <w:color w:val="1f1f1f"/>
-                <w:rtl w:val="0"/>
-              </w:rPr>
-              <w:t xml:space="preserve">NGÀY 3</w:t>
-            </w:r>
-            <w:r>
-              <w:rPr>
-                <w:rtl w:val="0"/>
-              </w:rPr>
-            </w:r>
-          </w:p>
-        </w:tc>
-        <w:tc>
-          <w:tcPr>
-            <w:tcBorders>
-              <w:top w:color="c4c7c5" w:space="0" w:sz="5" w:val="single"/>
-              <w:left w:color="c4c7c5" w:space="0" w:sz="5" w:val="single"/>
-              <w:bottom w:color="c4c7c5" w:space="0" w:sz="5" w:val="single"/>
-              <w:right w:color="c4c7c5" w:space="0" w:sz="5" w:val="single"/>
-            </w:tcBorders>
-            <w:tcMar>
-              <w:top w:w="120.0" w:type="dxa"/>
-              <w:left w:w="180.0" w:type="dxa"/>
-              <w:bottom w:w="120.0" w:type="dxa"/>
-              <w:right w:w="180.0" w:type="dxa"/>
-            </w:tcMar>
-            <w:vAlign w:val="top"/>
-          </w:tcPr>
-          <w:p>
-            <w:pPr>
-              <w:pBdr>
-                <w:top w:color="auto" w:space="0" w:sz="0" w:val="none"/>
-                <w:bottom w:color="auto" w:space="0" w:sz="0" w:val="none"/>
-                <w:right w:color="auto" w:space="0" w:sz="0" w:val="none"/>
-                <w:between w:color="auto" w:space="0" w:sz="0" w:val="none"/>
-              </w:pBdr>
-              <w:spacing w:after="480" w:lineRule="auto"/>
-              <w:rPr>
-                <w:color w:val="1f1f1f"/>
-              </w:rPr>
-            </w:pPr>
-            <w:r>
-              <w:rPr>
-                <w:b w:val="1"/>
-                <w:bCs w:val="1"/>
-                <w:color w:val="1f1f1f"/>
-                <w:rtl w:val="0"/>
-              </w:rPr>
-              <w:t xml:space="preserve">Bước 3: Thủ tục Google &amp; Thiết kế Asset</w:t>
-            </w:r>
-            <w:r>
-              <w:rPr>
-                <w:rtl w:val="0"/>
-              </w:rPr>
-            </w:r>
-          </w:p>
-        </w:tc>
-        <w:tc>
-          <w:tcPr>
-            <w:tcBorders>
-              <w:top w:color="c4c7c5" w:space="0" w:sz="5" w:val="single"/>
-              <w:left w:color="c4c7c5" w:space="0" w:sz="5" w:val="single"/>
-              <w:bottom w:color="c4c7c5" w:space="0" w:sz="5" w:val="single"/>
-              <w:right w:color="c4c7c5" w:space="0" w:sz="5" w:val="single"/>
-            </w:tcBorders>
-            <w:tcMar>
-              <w:top w:w="120.0" w:type="dxa"/>
-              <w:left w:w="180.0" w:type="dxa"/>
-              <w:bottom w:w="120.0" w:type="dxa"/>
-              <w:right w:w="180.0" w:type="dxa"/>
-            </w:tcMar>
-            <w:vAlign w:val="top"/>
-          </w:tcPr>
-          <w:p>
-            <w:pPr>
-              <w:pBdr>
-                <w:top w:color="auto" w:space="0" w:sz="0" w:val="none"/>
-                <w:left w:color="auto" w:space="0" w:sz="0" w:val="none"/>
-                <w:bottom w:color="auto" w:space="0" w:sz="0" w:val="none"/>
-                <w:right w:color="auto" w:space="0" w:sz="0" w:val="none"/>
-                <w:between w:color="auto" w:space="0" w:sz="0" w:val="none"/>
-              </w:pBdr>
-              <w:spacing w:after="480" w:lineRule="auto"/>
-              <w:rPr>
-                <w:color w:val="1f1f1f"/>
-              </w:rPr>
-            </w:pPr>
-            <w:r>
-              <w:rPr>
-                <w:color w:val="1f1f1f"/>
-                <w:rtl w:val="0"/>
-              </w:rPr>
-              <w:t xml:space="preserve">- </w:t>
-            </w:r>
-            <w:r>
-              <w:rPr>
-                <w:b w:val="1"/>
-                <w:bCs w:val="1"/>
-                <w:color w:val="1f1f1f"/>
-                <w:rtl w:val="0"/>
-              </w:rPr>
-              <w:t xml:space="preserve">Điền Form đăng ký Workshop của Google (Cá nhân)</w:t>
-            </w:r>
-            <w:r>
-              <w:rPr>
-                <w:color w:val="1f1f1f"/>
-                <w:rtl w:val="0"/>
-              </w:rPr>
-              <w:t xml:space="preserve"> để hệ thống ghi nhận và phê duyệt nội bộ.</w:t>
-            </w:r>
-          </w:p>
-          <w:p>
-            <w:pPr>
-              <w:pBdr>
-                <w:top w:color="auto" w:space="0" w:sz="0" w:val="none"/>
-                <w:bottom w:color="auto" w:space="0" w:sz="0" w:val="none"/>
-                <w:right w:color="auto" w:space="0" w:sz="0" w:val="none"/>
-                <w:between w:color="auto" w:space="0" w:sz="0" w:val="none"/>
-              </w:pBdr>
-              <w:spacing w:after="480" w:lineRule="auto"/>
-              <w:rPr>
-                <w:color w:val="1f1f1f"/>
-              </w:rPr>
-            </w:pPr>
-            <w:r>
-              <w:rPr>
-                <w:rtl w:val="0"/>
-              </w:rPr>
-            </w:r>
-          </w:p>
-          <w:p>
-            <w:pPr>
-              <w:pBdr>
-                <w:top w:color="auto" w:space="0" w:sz="0" w:val="none"/>
-                <w:left w:color="auto" w:space="0" w:sz="0" w:val="none"/>
-                <w:bottom w:color="auto" w:space="0" w:sz="0" w:val="none"/>
-                <w:right w:color="auto" w:space="0" w:sz="0" w:val="none"/>
-                <w:between w:color="auto" w:space="0" w:sz="0" w:val="none"/>
-              </w:pBdr>
-              <w:spacing w:after="480" w:lineRule="auto"/>
-              <w:rPr>
-                <w:color w:val="1f1f1f"/>
-              </w:rPr>
-            </w:pPr>
-            <w:r>
-              <w:rPr>
-                <w:color w:val="1f1f1f"/>
-                <w:rtl w:val="0"/>
-              </w:rPr>
-              <w:t xml:space="preserve">- </w:t>
-            </w:r>
-            <w:r>
-              <w:rPr>
-                <w:b w:val="1"/>
-                <w:bCs w:val="1"/>
-                <w:color w:val="1f1f1f"/>
-                <w:rtl w:val="0"/>
-              </w:rPr>
-              <w:t xml:space="preserve">Làm Posters/Banner để treo trong Campus của trường</w:t>
-            </w:r>
-            <w:r>
-              <w:rPr>
-                <w:color w:val="1f1f1f"/>
-                <w:rtl w:val="0"/>
-              </w:rPr>
-              <w:t xml:space="preserve"> (Nếu trường hỗ trợ in ấn/treo thì càng tốt, </w:t>
-            </w:r>
-            <w:r>
-              <w:rPr>
-                <w:b w:val="1"/>
-                <w:bCs w:val="1"/>
-                <w:color w:val="1f1f1f"/>
-                <w:rtl w:val="0"/>
-              </w:rPr>
-              <w:t xml:space="preserve">còn không hỗ trợ thì phải tự bỏ tiền ra làm và tự edit</w:t>
-            </w:r>
-            <w:r>
-              <w:rPr>
-                <w:color w:val="1f1f1f"/>
-                <w:rtl w:val="0"/>
-              </w:rPr>
-              <w:t xml:space="preserve">).</w:t>
-            </w:r>
-          </w:p>
-          <w:p>
-            <w:pPr>
-              <w:pBdr>
-                <w:top w:color="auto" w:space="0" w:sz="0" w:val="none"/>
-                <w:bottom w:color="auto" w:space="0" w:sz="0" w:val="none"/>
-                <w:right w:color="auto" w:space="0" w:sz="0" w:val="none"/>
-                <w:between w:color="auto" w:space="0" w:sz="0" w:val="none"/>
-              </w:pBdr>
-              <w:spacing w:after="480" w:lineRule="auto"/>
-              <w:rPr>
-                <w:color w:val="1f1f1f"/>
-              </w:rPr>
-            </w:pPr>
-            <w:r>
-              <w:rPr>
-                <w:rtl w:val="0"/>
-              </w:rPr>
-            </w:r>
-          </w:p>
-          <w:p>
-            <w:pPr>
-              <w:pBdr>
-                <w:top w:color="auto" w:space="0" w:sz="0" w:val="none"/>
-                <w:left w:color="auto" w:space="0" w:sz="0" w:val="none"/>
-                <w:bottom w:color="auto" w:space="0" w:sz="0" w:val="none"/>
-                <w:right w:color="auto" w:space="0" w:sz="0" w:val="none"/>
-                <w:between w:color="auto" w:space="0" w:sz="0" w:val="none"/>
-              </w:pBdr>
-              <w:spacing w:after="480" w:lineRule="auto"/>
-              <w:rPr>
-                <w:color w:val="1f1f1f"/>
-              </w:rPr>
-            </w:pPr>
-            <w:r>
-              <w:rPr>
-                <w:color w:val="1f1f1f"/>
-                <w:rtl w:val="0"/>
-              </w:rPr>
-              <w:t xml:space="preserve">- Tạo Google Form Check-in (Đăng ký) Xuất link thành </w:t>
-            </w:r>
-            <w:r>
-              <w:rPr>
-                <w:b w:val="1"/>
-                <w:bCs w:val="1"/>
-                <w:color w:val="1f1f1f"/>
-                <w:rtl w:val="0"/>
-              </w:rPr>
-              <w:t xml:space="preserve">QR Code chèn trực tiếp lên Poster/Banner</w:t>
-            </w:r>
-            <w:r>
-              <w:rPr>
-                <w:color w:val="1f1f1f"/>
-                <w:rtl w:val="0"/>
-              </w:rPr>
-              <w:t xml:space="preserve">.</w:t>
-            </w:r>
-          </w:p>
-        </w:tc>
-        <w:tc>
-          <w:tcPr>
-            <w:tcBorders>
-              <w:top w:color="c4c7c5" w:space="0" w:sz="5" w:val="single"/>
-              <w:left w:color="c4c7c5" w:space="0" w:sz="5" w:val="single"/>
-              <w:bottom w:color="c4c7c5" w:space="0" w:sz="5" w:val="single"/>
-              <w:right w:color="c4c7c5" w:space="0" w:sz="5" w:val="single"/>
-            </w:tcBorders>
-            <w:tcMar>
-              <w:top w:w="120.0" w:type="dxa"/>
-              <w:left w:w="180.0" w:type="dxa"/>
-              <w:bottom w:w="120.0" w:type="dxa"/>
-              <w:right w:w="180.0" w:type="dxa"/>
-            </w:tcMar>
-            <w:vAlign w:val="top"/>
-          </w:tcPr>
-          <w:p>
-            <w:pPr>
-              <w:pBdr>
-                <w:top w:color="auto" w:space="0" w:sz="0" w:val="none"/>
-                <w:left w:color="auto" w:space="0" w:sz="0" w:val="none"/>
-                <w:bottom w:color="auto" w:space="0" w:sz="0" w:val="none"/>
-                <w:right w:color="auto" w:space="0" w:sz="0" w:val="none"/>
-                <w:between w:color="auto" w:space="0" w:sz="0" w:val="none"/>
-              </w:pBdr>
-              <w:spacing w:after="480" w:lineRule="auto"/>
-              <w:rPr>
-                <w:color w:val="1f1f1f"/>
-              </w:rPr>
-            </w:pPr>
-            <w:r>
-              <w:rPr>
-                <w:color w:val="1f1f1f"/>
-                <w:rtl w:val="0"/>
-              </w:rPr>
-              <w:t xml:space="preserve">- </w:t>
-            </w:r>
-            <w:r>
-              <w:rPr>
-                <w:b w:val="1"/>
-                <w:bCs w:val="1"/>
-                <w:color w:val="1f1f1f"/>
-                <w:rtl w:val="0"/>
-              </w:rPr>
-              <w:t xml:space="preserve">Điền Form đăng ký Workshop của Google (Cá nhân)</w:t>
-            </w:r>
-            <w:r>
-              <w:rPr>
-                <w:color w:val="1f1f1f"/>
-                <w:rtl w:val="0"/>
-              </w:rPr>
-              <w:t xml:space="preserve"> để hệ thống ghi nhận và phê duyệt nội bộ.</w:t>
-            </w:r>
-          </w:p>
-          <w:p>
-            <w:pPr>
-              <w:pBdr>
-                <w:top w:color="auto" w:space="0" w:sz="0" w:val="none"/>
-                <w:bottom w:color="auto" w:space="0" w:sz="0" w:val="none"/>
-                <w:right w:color="auto" w:space="0" w:sz="0" w:val="none"/>
-                <w:between w:color="auto" w:space="0" w:sz="0" w:val="none"/>
-              </w:pBdr>
-              <w:spacing w:after="480" w:lineRule="auto"/>
-              <w:rPr>
-                <w:color w:val="1f1f1f"/>
-              </w:rPr>
-            </w:pPr>
-            <w:r>
-              <w:rPr>
-                <w:rtl w:val="0"/>
-              </w:rPr>
-            </w:r>
-          </w:p>
-          <w:p>
-            <w:pPr>
-              <w:pBdr>
-                <w:top w:color="auto" w:space="0" w:sz="0" w:val="none"/>
-                <w:left w:color="auto" w:space="0" w:sz="0" w:val="none"/>
-                <w:bottom w:color="auto" w:space="0" w:sz="0" w:val="none"/>
-                <w:right w:color="auto" w:space="0" w:sz="0" w:val="none"/>
-                <w:between w:color="auto" w:space="0" w:sz="0" w:val="none"/>
-              </w:pBdr>
-              <w:spacing w:after="480" w:lineRule="auto"/>
-              <w:rPr>
-                <w:color w:val="1f1f1f"/>
-              </w:rPr>
-            </w:pPr>
-            <w:r>
-              <w:rPr>
-                <w:color w:val="1f1f1f"/>
-                <w:rtl w:val="0"/>
-              </w:rPr>
-              <w:t xml:space="preserve">- </w:t>
-            </w:r>
-            <w:r>
-              <w:rPr>
-                <w:b w:val="1"/>
-                <w:bCs w:val="1"/>
-                <w:color w:val="1f1f1f"/>
-                <w:rtl w:val="0"/>
-              </w:rPr>
-              <w:t xml:space="preserve">Làm Banner Online, Thumbnail</w:t>
-            </w:r>
-            <w:r>
-              <w:rPr>
-                <w:color w:val="1f1f1f"/>
-                <w:rtl w:val="0"/>
-              </w:rPr>
-              <w:t xml:space="preserve"> để đăng Facebook và làm màn hình chờ phòng họp (Tự edit 100% bằng Canva, không tốn chi phí in ấn).</w:t>
-            </w:r>
-          </w:p>
-          <w:p>
-            <w:pPr>
-              <w:pBdr>
-                <w:top w:color="auto" w:space="0" w:sz="0" w:val="none"/>
-                <w:bottom w:color="auto" w:space="0" w:sz="0" w:val="none"/>
-                <w:right w:color="auto" w:space="0" w:sz="0" w:val="none"/>
-                <w:between w:color="auto" w:space="0" w:sz="0" w:val="none"/>
-              </w:pBdr>
-              <w:spacing w:after="480" w:lineRule="auto"/>
-              <w:rPr>
-                <w:color w:val="1f1f1f"/>
-              </w:rPr>
-            </w:pPr>
-            <w:r>
-              <w:rPr>
-                <w:rtl w:val="0"/>
-              </w:rPr>
-            </w:r>
-          </w:p>
-          <w:p>
-            <w:pPr>
-              <w:pBdr>
-                <w:top w:color="auto" w:space="0" w:sz="0" w:val="none"/>
-                <w:left w:color="auto" w:space="0" w:sz="0" w:val="none"/>
-                <w:bottom w:color="auto" w:space="0" w:sz="0" w:val="none"/>
-                <w:right w:color="auto" w:space="0" w:sz="0" w:val="none"/>
-                <w:between w:color="auto" w:space="0" w:sz="0" w:val="none"/>
-              </w:pBdr>
-              <w:spacing w:after="480" w:lineRule="auto"/>
-              <w:rPr>
-                <w:color w:val="1f1f1f"/>
-              </w:rPr>
-            </w:pPr>
-            <w:r>
-              <w:rPr>
-                <w:color w:val="1f1f1f"/>
-                <w:rtl w:val="0"/>
-              </w:rPr>
-              <w:t xml:space="preserve">- Tạo Google Form Check-in (Đăng ký) Lấy </w:t>
-            </w:r>
-            <w:r>
-              <w:rPr>
-                <w:b w:val="1"/>
-                <w:bCs w:val="1"/>
-                <w:color w:val="1f1f1f"/>
-                <w:rtl w:val="0"/>
-              </w:rPr>
-              <w:t xml:space="preserve">Link đăng ký trực tiếp</w:t>
-            </w:r>
-            <w:r>
-              <w:rPr>
-                <w:color w:val="1f1f1f"/>
-                <w:rtl w:val="0"/>
-              </w:rPr>
-              <w:t xml:space="preserve"> để chèn vào các bài đăng truyền thông Online.</w:t>
-            </w:r>
-          </w:p>
-        </w:tc>
-        <w:tc>
-          <w:tcPr>
-            <w:tcBorders>
-              <w:top w:color="c4c7c5" w:space="0" w:sz="5" w:val="single"/>
-              <w:left w:color="c4c7c5" w:space="0" w:sz="5" w:val="single"/>
-              <w:bottom w:color="c4c7c5" w:space="0" w:sz="5" w:val="single"/>
-              <w:right w:color="c4c7c5" w:space="0" w:sz="5" w:val="single"/>
-            </w:tcBorders>
-            <w:tcMar>
-              <w:top w:w="120.0" w:type="dxa"/>
-              <w:left w:w="180.0" w:type="dxa"/>
-              <w:bottom w:w="120.0" w:type="dxa"/>
-              <w:right w:w="180.0" w:type="dxa"/>
-            </w:tcMar>
-            <w:vAlign w:val="top"/>
-          </w:tcPr>
-          <w:p>
-            <w:pPr>
-              <w:pBdr>
-                <w:top w:color="auto" w:space="0" w:sz="0" w:val="none"/>
-                <w:bottom w:color="auto" w:space="0" w:sz="0" w:val="none"/>
-                <w:right w:color="auto" w:space="0" w:sz="0" w:val="none"/>
-                <w:between w:color="auto" w:space="0" w:sz="0" w:val="none"/>
-              </w:pBdr>
-              <w:spacing w:after="480" w:lineRule="auto"/>
-              <w:rPr>
-                <w:color w:val="1f1f1f"/>
-              </w:rPr>
-            </w:pPr>
-            <w:r>
-              <w:rPr>
-                <w:color w:val="1f1f1f"/>
-                <w:rtl w:val="0"/>
-              </w:rPr>
-              <w:t xml:space="preserve">Google Form nội bộ của Google, Canva, QR Generator</w:t>
-            </w:r>
-          </w:p>
-        </w:tc>
-        <w:tc>
-          <w:tcPr>
-            <w:tcBorders>
-              <w:top w:color="c4c7c5" w:space="0" w:sz="5" w:val="single"/>
-              <w:left w:color="c4c7c5" w:space="0" w:sz="5" w:val="single"/>
-              <w:bottom w:color="c4c7c5" w:space="0" w:sz="5" w:val="single"/>
-              <w:right w:color="c4c7c5" w:space="0" w:sz="5" w:val="single"/>
-            </w:tcBorders>
-            <w:tcMar>
-              <w:top w:w="120.0" w:type="dxa"/>
-              <w:left w:w="180.0" w:type="dxa"/>
-              <w:bottom w:w="120.0" w:type="dxa"/>
-              <w:right w:w="180.0" w:type="dxa"/>
-            </w:tcMar>
-            <w:vAlign w:val="top"/>
-          </w:tcPr>
-          <w:p>
-            <w:pPr>
-              <w:pBdr>
-                <w:top w:color="auto" w:space="0" w:sz="0" w:val="none"/>
-                <w:bottom w:color="auto" w:space="0" w:sz="0" w:val="none"/>
-                <w:right w:color="auto" w:space="0" w:sz="0" w:val="none"/>
-                <w:between w:color="auto" w:space="0" w:sz="0" w:val="none"/>
-              </w:pBdr>
-              <w:spacing w:after="480" w:lineRule="auto"/>
-              <w:rPr>
-                <w:color w:val="1f1f1f"/>
-              </w:rPr>
-            </w:pPr>
-            <w:r>
-              <w:rPr>
-                <w:color w:val="1f1f1f"/>
-                <w:rtl w:val="0"/>
-              </w:rPr>
-              <w:t xml:space="preserve">File thiết kế sẵn sàng (Banner sân khấu + Poster dọc); Link/QR Form Check-in hoạt động mượt mà, không bị lỗi hiển thị.</w:t>
+            <w:r>
+              <w:t>NGÀY 3</w:t>
+            </w:r>
+          </w:p>
+        </w:tc>
+        <w:tc>
+          <w:tcPr>
+            <w:tcBorders>
+              <w:top w:color="c4c7c5" w:space="0" w:sz="5" w:val="single"/>
+              <w:left w:color="c4c7c5" w:space="0" w:sz="5" w:val="single"/>
+              <w:bottom w:color="c4c7c5" w:space="0" w:sz="5" w:val="single"/>
+              <w:right w:color="c4c7c5" w:space="0" w:sz="5" w:val="single"/>
+            </w:tcBorders>
+            <w:tcMar>
+              <w:top w:w="120.0" w:type="dxa"/>
+              <w:left w:w="180.0" w:type="dxa"/>
+              <w:bottom w:w="120.0" w:type="dxa"/>
+              <w:right w:w="180.0" w:type="dxa"/>
+            </w:tcMar>
+            <w:vAlign w:val="top"/>
+          </w:tcPr>
+          <w:p>
+            <w:r>
+              <w:t>Bước 3: Thiết kế Asset Poster/Banner &amp; QR Code</w:t>
+            </w:r>
+          </w:p>
+        </w:tc>
+        <w:tc>
+          <w:tcPr>
+            <w:tcBorders>
+              <w:top w:color="c4c7c5" w:space="0" w:sz="5" w:val="single"/>
+              <w:left w:color="c4c7c5" w:space="0" w:sz="5" w:val="single"/>
+              <w:bottom w:color="c4c7c5" w:space="0" w:sz="5" w:val="single"/>
+              <w:right w:color="c4c7c5" w:space="0" w:sz="5" w:val="single"/>
+            </w:tcBorders>
+            <w:tcMar>
+              <w:top w:w="120.0" w:type="dxa"/>
+              <w:left w:w="180.0" w:type="dxa"/>
+              <w:bottom w:w="120.0" w:type="dxa"/>
+              <w:right w:w="180.0" w:type="dxa"/>
+            </w:tcMar>
+            <w:vAlign w:val="top"/>
+          </w:tcPr>
+          <w:p>
+            <w:r>
+              <w:t>- Truy cập link Google Drive, nhân bản và đổi tên form "Check-in for Students" theo tên trường mục tiêu.</w:t>
+              <w:br/>
+              <w:t>- Copy link Google Form đó, truy cập https://me-qr.com/vi/qr-code-generator/google-form để tạo QR Code, đặt tên QR Code theo tên trường và tải ảnh QR Code về.</w:t>
+              <w:br/>
+              <w:t>- Vào Gemini tạo poster/banner theo 3 tỷ lệ: Dọc, Vuông, Ngang; kích hoạt tính năng Canva và dùng câu lệnh "Make it editable" để có thể tùy chỉnh các phần tử trên Canva.</w:t>
+              <w:br/>
+              <w:t>- Trên Canva: Thay đổi tên trường, chèn Logo của trường và dán hình ảnh QR Code vừa tải về.</w:t>
+              <w:br/>
+              <w:t>- Tải ảnh banner/poster hoàn thiện lên folder (Tên trường đó) trong Google Drive.</w:t>
+              <w:br/>
+              <w:t>- Chuẩn bị slide bài giảng AI &amp; Gemini (https://drive.google.com/drive/folders/1dn_c4lL1G9G40-EoIugZSQTTEqdHGz2k)</w:t>
+            </w:r>
+          </w:p>
+        </w:tc>
+        <w:tc>
+          <w:tcPr>
+            <w:tcBorders>
+              <w:top w:color="c4c7c5" w:space="0" w:sz="5" w:val="single"/>
+              <w:left w:color="c4c7c5" w:space="0" w:sz="5" w:val="single"/>
+              <w:bottom w:color="c4c7c5" w:space="0" w:sz="5" w:val="single"/>
+              <w:right w:color="c4c7c5" w:space="0" w:sz="5" w:val="single"/>
+            </w:tcBorders>
+            <w:tcMar>
+              <w:top w:w="120.0" w:type="dxa"/>
+              <w:left w:w="180.0" w:type="dxa"/>
+              <w:bottom w:w="120.0" w:type="dxa"/>
+              <w:right w:w="180.0" w:type="dxa"/>
+            </w:tcMar>
+            <w:vAlign w:val="top"/>
+          </w:tcPr>
+          <w:p>
+            <w:r>
+              <w:t>- Thiết kế banner/thumbnail online tương tự như Offline nhưng tối ưu hóa kích thước hiển thị trên các nền tảng mạng xã hội và màn hình Meet/Zoom (không tốn chi phí in ấn).</w:t>
+              <w:br/>
+              <w:t>- Các thủ tục tạo form Check-in, tạo QR Code và chuẩn bị slide thực hiện giống hệt phương án Offline.</w:t>
+            </w:r>
+          </w:p>
+        </w:tc>
+        <w:tc>
+          <w:tcPr>
+            <w:tcBorders>
+              <w:top w:color="c4c7c5" w:space="0" w:sz="5" w:val="single"/>
+              <w:left w:color="c4c7c5" w:space="0" w:sz="5" w:val="single"/>
+              <w:bottom w:color="c4c7c5" w:space="0" w:sz="5" w:val="single"/>
+              <w:right w:color="c4c7c5" w:space="0" w:sz="5" w:val="single"/>
+            </w:tcBorders>
+            <w:tcMar>
+              <w:top w:w="120.0" w:type="dxa"/>
+              <w:left w:w="180.0" w:type="dxa"/>
+              <w:bottom w:w="120.0" w:type="dxa"/>
+              <w:right w:w="180.0" w:type="dxa"/>
+            </w:tcMar>
+            <w:vAlign w:val="top"/>
+          </w:tcPr>
+          <w:p>
+            <w:r>
+              <w:t>Google Drive, me-qr.com, Gemini (Canva), Google Slides</w:t>
+            </w:r>
+          </w:p>
+        </w:tc>
+        <w:tc>
+          <w:tcPr>
+            <w:tcBorders>
+              <w:top w:color="c4c7c5" w:space="0" w:sz="5" w:val="single"/>
+              <w:left w:color="c4c7c5" w:space="0" w:sz="5" w:val="single"/>
+              <w:bottom w:color="c4c7c5" w:space="0" w:sz="5" w:val="single"/>
+              <w:right w:color="c4c7c5" w:space="0" w:sz="5" w:val="single"/>
+            </w:tcBorders>
+            <w:tcMar>
+              <w:top w:w="120.0" w:type="dxa"/>
+              <w:left w:w="180.0" w:type="dxa"/>
+              <w:bottom w:w="120.0" w:type="dxa"/>
+              <w:right w:w="180.0" w:type="dxa"/>
+            </w:tcMar>
+            <w:vAlign w:val="top"/>
+          </w:tcPr>
+          <w:p>
+            <w:r>
+              <w:t>Hoàn thành thiết kế poster/banner 3 tỷ lệ; QR Code hoạt động tốt; slide bài giảng sẵn sàng; upload file lên folder trường.</w:t>
             </w:r>
           </w:p>
         </w:tc>
@@ -2050,490 +922,128 @@
             <w:vAlign w:val="top"/>
           </w:tcPr>
           <w:p>
-            <w:pPr>
-              <w:pBdr>
-                <w:top w:color="auto" w:space="0" w:sz="0" w:val="none"/>
-                <w:bottom w:color="auto" w:space="0" w:sz="0" w:val="none"/>
-                <w:right w:color="auto" w:space="0" w:sz="0" w:val="none"/>
-                <w:between w:color="auto" w:space="0" w:sz="0" w:val="none"/>
-              </w:pBdr>
-              <w:spacing w:after="480" w:lineRule="auto"/>
-              <w:rPr>
-                <w:color w:val="1f1f1f"/>
-              </w:rPr>
-            </w:pPr>
-            <w:r>
-              <w:rPr>
-                <w:b w:val="1"/>
-                <w:bCs w:val="1"/>
-                <w:color w:val="1f1f1f"/>
-                <w:rtl w:val="0"/>
-              </w:rPr>
-              <w:t xml:space="preserve">NGÀY 4</w:t>
-            </w:r>
-            <w:r>
-              <w:rPr>
-                <w:rtl w:val="0"/>
-              </w:rPr>
-            </w:r>
-          </w:p>
-        </w:tc>
-        <w:tc>
-          <w:tcPr>
-            <w:tcBorders>
-              <w:top w:color="c4c7c5" w:space="0" w:sz="5" w:val="single"/>
-              <w:left w:color="c4c7c5" w:space="0" w:sz="5" w:val="single"/>
-              <w:bottom w:color="c4c7c5" w:space="0" w:sz="5" w:val="single"/>
-              <w:right w:color="c4c7c5" w:space="0" w:sz="5" w:val="single"/>
-            </w:tcBorders>
-            <w:tcMar>
-              <w:top w:w="120.0" w:type="dxa"/>
-              <w:left w:w="180.0" w:type="dxa"/>
-              <w:bottom w:w="120.0" w:type="dxa"/>
-              <w:right w:w="180.0" w:type="dxa"/>
-            </w:tcMar>
-            <w:vAlign w:val="top"/>
-          </w:tcPr>
-          <w:p>
-            <w:pPr>
-              <w:pBdr>
-                <w:top w:color="auto" w:space="0" w:sz="0" w:val="none"/>
-                <w:bottom w:color="auto" w:space="0" w:sz="0" w:val="none"/>
-                <w:right w:color="auto" w:space="0" w:sz="0" w:val="none"/>
-                <w:between w:color="auto" w:space="0" w:sz="0" w:val="none"/>
-              </w:pBdr>
-              <w:spacing w:after="480" w:lineRule="auto"/>
-              <w:rPr>
-                <w:color w:val="1f1f1f"/>
-              </w:rPr>
-            </w:pPr>
-            <w:r>
-              <w:rPr>
-                <w:b w:val="1"/>
-                <w:bCs w:val="1"/>
-                <w:color w:val="1f1f1f"/>
-                <w:rtl w:val="0"/>
-              </w:rPr>
-              <w:t xml:space="preserve">Bước 4: Cài đặt Automation Đăng ký (n8n)</w:t>
-            </w:r>
-            <w:r>
-              <w:rPr>
-                <w:rtl w:val="0"/>
-              </w:rPr>
-            </w:r>
-          </w:p>
-        </w:tc>
-        <w:tc>
-          <w:tcPr>
-            <w:tcBorders>
-              <w:top w:color="c4c7c5" w:space="0" w:sz="5" w:val="single"/>
-              <w:left w:color="c4c7c5" w:space="0" w:sz="5" w:val="single"/>
-              <w:bottom w:color="c4c7c5" w:space="0" w:sz="5" w:val="single"/>
-              <w:right w:color="c4c7c5" w:space="0" w:sz="5" w:val="single"/>
-            </w:tcBorders>
-            <w:tcMar>
-              <w:top w:w="120.0" w:type="dxa"/>
-              <w:left w:w="180.0" w:type="dxa"/>
-              <w:bottom w:w="120.0" w:type="dxa"/>
-              <w:right w:w="180.0" w:type="dxa"/>
-            </w:tcMar>
-            <w:vAlign w:val="top"/>
-          </w:tcPr>
-          <w:p>
-            <w:pPr>
-              <w:pBdr>
-                <w:top w:color="auto" w:space="0" w:sz="0" w:val="none"/>
-                <w:left w:color="auto" w:space="0" w:sz="0" w:val="none"/>
-                <w:bottom w:color="auto" w:space="0" w:sz="0" w:val="none"/>
-                <w:right w:color="auto" w:space="0" w:sz="0" w:val="none"/>
-                <w:between w:color="auto" w:space="0" w:sz="0" w:val="none"/>
-              </w:pBdr>
-              <w:spacing w:after="480" w:lineRule="auto"/>
-              <w:rPr>
-                <w:color w:val="1f1f1f"/>
-              </w:rPr>
-            </w:pPr>
-            <w:r>
-              <w:rPr>
-                <w:color w:val="1f1f1f"/>
-                <w:rtl w:val="0"/>
-              </w:rPr>
-              <w:t xml:space="preserve">- Xây dựng kịch bản tự động hóa trên </w:t>
-            </w:r>
-            <w:r>
-              <w:rPr>
-                <w:b w:val="1"/>
-                <w:bCs w:val="1"/>
-                <w:color w:val="1f1f1f"/>
-                <w:rtl w:val="0"/>
-              </w:rPr>
-              <w:t xml:space="preserve">n8n</w:t>
-            </w:r>
-            <w:r>
-              <w:rPr>
-                <w:color w:val="1f1f1f"/>
-                <w:rtl w:val="0"/>
-              </w:rPr>
-              <w:t xml:space="preserve">.</w:t>
-            </w:r>
-          </w:p>
-          <w:p>
-            <w:pPr>
-              <w:pBdr>
-                <w:top w:color="auto" w:space="0" w:sz="0" w:val="none"/>
-                <w:bottom w:color="auto" w:space="0" w:sz="0" w:val="none"/>
-                <w:right w:color="auto" w:space="0" w:sz="0" w:val="none"/>
-                <w:between w:color="auto" w:space="0" w:sz="0" w:val="none"/>
-              </w:pBdr>
-              <w:spacing w:after="480" w:lineRule="auto"/>
-              <w:rPr>
-                <w:color w:val="1f1f1f"/>
-              </w:rPr>
-            </w:pPr>
-            <w:r>
-              <w:rPr>
-                <w:rtl w:val="0"/>
-              </w:rPr>
-            </w:r>
-          </w:p>
-          <w:p>
-            <w:pPr>
-              <w:pBdr>
-                <w:top w:color="auto" w:space="0" w:sz="0" w:val="none"/>
-                <w:left w:color="auto" w:space="0" w:sz="0" w:val="none"/>
-                <w:bottom w:color="auto" w:space="0" w:sz="0" w:val="none"/>
-                <w:right w:color="auto" w:space="0" w:sz="0" w:val="none"/>
-                <w:between w:color="auto" w:space="0" w:sz="0" w:val="none"/>
-              </w:pBdr>
-              <w:spacing w:after="480" w:lineRule="auto"/>
-              <w:rPr>
-                <w:color w:val="1f1f1f"/>
-              </w:rPr>
-            </w:pPr>
-            <w:r>
-              <w:rPr>
-                <w:color w:val="1f1f1f"/>
-                <w:rtl w:val="0"/>
-              </w:rPr>
-              <w:t xml:space="preserve">- </w:t>
-            </w:r>
-            <w:r>
-              <w:rPr>
-                <w:b w:val="1"/>
-                <w:bCs w:val="1"/>
-                <w:color w:val="1f1f1f"/>
-                <w:rtl w:val="0"/>
-              </w:rPr>
-              <w:t xml:space="preserve">Luồng hoạt động:</w:t>
-            </w:r>
-            <w:r>
-              <w:rPr>
-                <w:color w:val="1f1f1f"/>
-                <w:rtl w:val="0"/>
-              </w:rPr>
-              <w:t xml:space="preserve"> Sinh viên </w:t>
-            </w:r>
-            <w:r>
-              <w:rPr>
-                <w:b w:val="1"/>
-                <w:bCs w:val="1"/>
-                <w:color w:val="1f1f1f"/>
-                <w:rtl w:val="0"/>
-              </w:rPr>
-              <w:t xml:space="preserve">hoàn thành điền Form Check-in</w:t>
-            </w:r>
-            <w:r>
-              <w:rPr>
-                <w:color w:val="1f1f1f"/>
-                <w:rtl w:val="0"/>
-              </w:rPr>
-              <w:t xml:space="preserve"> </w:t>
-            </w:r>
-            <w:r>
-              <w:rPr>
-                <w:i w:val="1"/>
-                <w:iCs w:val="1"/>
-                <w:color w:val="1f1f1f"/>
-                <w:rtl w:val="0"/>
-              </w:rPr>
-              <w:t xml:space="preserve">n8n chạy node trung gian kiểm tra đúng cú pháp email</w:t>
-            </w:r>
-            <w:r>
-              <w:rPr>
-                <w:color w:val="1f1f1f"/>
-                <w:rtl w:val="0"/>
-              </w:rPr>
-              <w:t xml:space="preserve"> -&gt; </w:t>
-            </w:r>
-            <w:r>
-              <w:rPr>
-                <w:b w:val="1"/>
-                <w:bCs w:val="1"/>
-                <w:color w:val="1f1f1f"/>
-                <w:rtl w:val="0"/>
-              </w:rPr>
-              <w:t xml:space="preserve">Hệ thống n8n tự động gửi Email xác nhận đăng ký thành công</w:t>
-            </w:r>
-            <w:r>
-              <w:rPr>
-                <w:color w:val="1f1f1f"/>
-                <w:rtl w:val="0"/>
-              </w:rPr>
-              <w:t xml:space="preserve"> kèm vé mời điện tử, thời gian, địa điểm hội trường (Tránh lỗi Bounce mail).</w:t>
-            </w:r>
-          </w:p>
-        </w:tc>
-        <w:tc>
-          <w:tcPr>
-            <w:tcBorders>
-              <w:top w:color="c4c7c5" w:space="0" w:sz="5" w:val="single"/>
-              <w:left w:color="c4c7c5" w:space="0" w:sz="5" w:val="single"/>
-              <w:bottom w:color="c4c7c5" w:space="0" w:sz="5" w:val="single"/>
-              <w:right w:color="c4c7c5" w:space="0" w:sz="5" w:val="single"/>
-            </w:tcBorders>
-            <w:tcMar>
-              <w:top w:w="120.0" w:type="dxa"/>
-              <w:left w:w="180.0" w:type="dxa"/>
-              <w:bottom w:w="120.0" w:type="dxa"/>
-              <w:right w:w="180.0" w:type="dxa"/>
-            </w:tcMar>
-            <w:vAlign w:val="top"/>
-          </w:tcPr>
-          <w:p>
-            <w:pPr>
-              <w:pBdr>
-                <w:top w:color="auto" w:space="0" w:sz="0" w:val="none"/>
-                <w:left w:color="auto" w:space="0" w:sz="0" w:val="none"/>
-                <w:bottom w:color="auto" w:space="0" w:sz="0" w:val="none"/>
-                <w:right w:color="auto" w:space="0" w:sz="0" w:val="none"/>
-                <w:between w:color="auto" w:space="0" w:sz="0" w:val="none"/>
-              </w:pBdr>
-              <w:spacing w:after="480" w:lineRule="auto"/>
-              <w:rPr>
-                <w:color w:val="1f1f1f"/>
-              </w:rPr>
-            </w:pPr>
-            <w:r>
-              <w:rPr>
-                <w:color w:val="1f1f1f"/>
-                <w:rtl w:val="0"/>
-              </w:rPr>
-              <w:t xml:space="preserve">- Xây dựng kịch bản tự động hóa trên </w:t>
-            </w:r>
-            <w:r>
-              <w:rPr>
-                <w:b w:val="1"/>
-                <w:bCs w:val="1"/>
-                <w:color w:val="1f1f1f"/>
-                <w:rtl w:val="0"/>
-              </w:rPr>
-              <w:t xml:space="preserve">n8n</w:t>
-            </w:r>
-            <w:r>
-              <w:rPr>
-                <w:color w:val="1f1f1f"/>
-                <w:rtl w:val="0"/>
-              </w:rPr>
-              <w:t xml:space="preserve">.</w:t>
-            </w:r>
-          </w:p>
-          <w:p>
-            <w:pPr>
-              <w:pBdr>
-                <w:top w:color="auto" w:space="0" w:sz="0" w:val="none"/>
-                <w:bottom w:color="auto" w:space="0" w:sz="0" w:val="none"/>
-                <w:right w:color="auto" w:space="0" w:sz="0" w:val="none"/>
-                <w:between w:color="auto" w:space="0" w:sz="0" w:val="none"/>
-              </w:pBdr>
-              <w:spacing w:after="480" w:lineRule="auto"/>
-              <w:rPr>
-                <w:color w:val="1f1f1f"/>
-              </w:rPr>
-            </w:pPr>
-            <w:r>
-              <w:rPr>
-                <w:rtl w:val="0"/>
-              </w:rPr>
-            </w:r>
-          </w:p>
-          <w:p>
-            <w:pPr>
-              <w:pBdr>
-                <w:top w:color="auto" w:space="0" w:sz="0" w:val="none"/>
-                <w:left w:color="auto" w:space="0" w:sz="0" w:val="none"/>
-                <w:bottom w:color="auto" w:space="0" w:sz="0" w:val="none"/>
-                <w:right w:color="auto" w:space="0" w:sz="0" w:val="none"/>
-                <w:between w:color="auto" w:space="0" w:sz="0" w:val="none"/>
-              </w:pBdr>
-              <w:spacing w:after="480" w:lineRule="auto"/>
-              <w:rPr>
-                <w:color w:val="1f1f1f"/>
-              </w:rPr>
-            </w:pPr>
-            <w:r>
-              <w:rPr>
-                <w:color w:val="1f1f1f"/>
-                <w:rtl w:val="0"/>
-              </w:rPr>
-              <w:t xml:space="preserve">- </w:t>
-            </w:r>
-            <w:r>
-              <w:rPr>
-                <w:b w:val="1"/>
-                <w:bCs w:val="1"/>
-                <w:color w:val="1f1f1f"/>
-                <w:rtl w:val="0"/>
-              </w:rPr>
-              <w:t xml:space="preserve">Luồng hoạt động:</w:t>
-            </w:r>
-            <w:r>
-              <w:rPr>
-                <w:color w:val="1f1f1f"/>
-                <w:rtl w:val="0"/>
-              </w:rPr>
-              <w:t xml:space="preserve"> Sinh viên </w:t>
-            </w:r>
-            <w:r>
-              <w:rPr>
-                <w:b w:val="1"/>
-                <w:bCs w:val="1"/>
-                <w:color w:val="1f1f1f"/>
-                <w:rtl w:val="0"/>
-              </w:rPr>
-              <w:t xml:space="preserve">hoàn thành điền Form Check-in</w:t>
-            </w:r>
-            <w:r>
-              <w:rPr>
-                <w:color w:val="1f1f1f"/>
-                <w:rtl w:val="0"/>
-              </w:rPr>
-              <w:t xml:space="preserve"> -&gt; </w:t>
-            </w:r>
-            <w:r>
-              <w:rPr>
-                <w:i w:val="1"/>
-                <w:iCs w:val="1"/>
-                <w:color w:val="1f1f1f"/>
-                <w:rtl w:val="0"/>
-              </w:rPr>
-              <w:t xml:space="preserve">n8n chạy node trung gian kiểm tra đúng cú pháp email</w:t>
-            </w:r>
-            <w:r>
-              <w:rPr>
-                <w:color w:val="1f1f1f"/>
-                <w:rtl w:val="0"/>
-              </w:rPr>
-              <w:t xml:space="preserve"> -&gt; </w:t>
-            </w:r>
-            <w:r>
-              <w:rPr>
-                <w:b w:val="1"/>
-                <w:bCs w:val="1"/>
-                <w:color w:val="1f1f1f"/>
-                <w:rtl w:val="0"/>
-              </w:rPr>
-              <w:t xml:space="preserve">Hệ thống n8n tự động gửi Email xác nhận đăng ký thành công kèm Link phòng họp trực tuyến (Meet/Zoom)</w:t>
-            </w:r>
-            <w:r>
-              <w:rPr>
-                <w:color w:val="1f1f1f"/>
-                <w:rtl w:val="0"/>
-              </w:rPr>
-              <w:t xml:space="preserve"> và hướng dẫn tham gia.</w:t>
-            </w:r>
-          </w:p>
-        </w:tc>
-        <w:tc>
-          <w:tcPr>
-            <w:tcBorders>
-              <w:top w:color="c4c7c5" w:space="0" w:sz="5" w:val="single"/>
-              <w:left w:color="c4c7c5" w:space="0" w:sz="5" w:val="single"/>
-              <w:bottom w:color="c4c7c5" w:space="0" w:sz="5" w:val="single"/>
-              <w:right w:color="c4c7c5" w:space="0" w:sz="5" w:val="single"/>
-            </w:tcBorders>
-            <w:tcMar>
-              <w:top w:w="120.0" w:type="dxa"/>
-              <w:left w:w="180.0" w:type="dxa"/>
-              <w:bottom w:w="120.0" w:type="dxa"/>
-              <w:right w:w="180.0" w:type="dxa"/>
-            </w:tcMar>
-            <w:vAlign w:val="top"/>
-          </w:tcPr>
-          <w:p>
-            <w:pPr>
-              <w:pBdr>
-                <w:top w:color="auto" w:space="0" w:sz="0" w:val="none"/>
-                <w:bottom w:color="auto" w:space="0" w:sz="0" w:val="none"/>
-                <w:right w:color="auto" w:space="0" w:sz="0" w:val="none"/>
-                <w:between w:color="auto" w:space="0" w:sz="0" w:val="none"/>
-              </w:pBdr>
-              <w:spacing w:after="480" w:lineRule="auto"/>
-              <w:rPr>
-                <w:color w:val="1f1f1f"/>
-              </w:rPr>
-            </w:pPr>
-            <w:r>
-              <w:rPr>
-                <w:b w:val="1"/>
-                <w:bCs w:val="1"/>
-                <w:color w:val="1f1f1f"/>
-                <w:rtl w:val="0"/>
-              </w:rPr>
-              <w:t xml:space="preserve">n8n</w:t>
-            </w:r>
-            <w:r>
-              <w:rPr>
-                <w:color w:val="1f1f1f"/>
-                <w:rtl w:val="0"/>
-              </w:rPr>
-              <w:t xml:space="preserve">, Google Forms, Gmail</w:t>
-            </w:r>
-          </w:p>
-        </w:tc>
-        <w:tc>
-          <w:tcPr>
-            <w:tcBorders>
-              <w:top w:color="c4c7c5" w:space="0" w:sz="5" w:val="single"/>
-              <w:left w:color="c4c7c5" w:space="0" w:sz="5" w:val="single"/>
-              <w:bottom w:color="c4c7c5" w:space="0" w:sz="5" w:val="single"/>
-              <w:right w:color="c4c7c5" w:space="0" w:sz="5" w:val="single"/>
-            </w:tcBorders>
-            <w:tcMar>
-              <w:top w:w="120.0" w:type="dxa"/>
-              <w:left w:w="180.0" w:type="dxa"/>
-              <w:bottom w:w="120.0" w:type="dxa"/>
-              <w:right w:w="180.0" w:type="dxa"/>
-            </w:tcMar>
-            <w:vAlign w:val="top"/>
-          </w:tcPr>
-          <w:p>
-            <w:pPr>
-              <w:pBdr>
-                <w:top w:color="auto" w:space="0" w:sz="0" w:val="none"/>
-                <w:bottom w:color="auto" w:space="0" w:sz="0" w:val="none"/>
-                <w:right w:color="auto" w:space="0" w:sz="0" w:val="none"/>
-                <w:between w:color="auto" w:space="0" w:sz="0" w:val="none"/>
-              </w:pBdr>
-              <w:spacing w:after="480" w:lineRule="auto"/>
-              <w:rPr>
-                <w:color w:val="1f1f1f"/>
-              </w:rPr>
-            </w:pPr>
-            <w:r>
-              <w:rPr>
-                <w:b w:val="1"/>
-                <w:bCs w:val="1"/>
-                <w:color w:val="1f1f1f"/>
-                <w:rtl w:val="0"/>
-              </w:rPr>
-              <w:t xml:space="preserve">Hệ thống chạy tự động 100%</w:t>
-            </w:r>
-            <w:r>
-              <w:rPr>
-                <w:color w:val="1f1f1f"/>
-                <w:rtl w:val="0"/>
-              </w:rPr>
-              <w:t xml:space="preserve">. Sinh viên nhận được email xác nhận ngay lập tức sau khi bấm gửi form.</w:t>
+            <w:r>
+              <w:t>NGÀY 4</w:t>
+            </w:r>
+          </w:p>
+        </w:tc>
+        <w:tc>
+          <w:tcPr>
+            <w:tcBorders>
+              <w:top w:color="c4c7c5" w:space="0" w:sz="5" w:val="single"/>
+              <w:left w:color="c4c7c5" w:space="0" w:sz="5" w:val="single"/>
+              <w:bottom w:color="c4c7c5" w:space="0" w:sz="5" w:val="single"/>
+              <w:right w:color="c4c7c5" w:space="0" w:sz="5" w:val="single"/>
+            </w:tcBorders>
+            <w:tcMar>
+              <w:top w:w="120.0" w:type="dxa"/>
+              <w:left w:w="180.0" w:type="dxa"/>
+              <w:bottom w:w="120.0" w:type="dxa"/>
+              <w:right w:w="180.0" w:type="dxa"/>
+            </w:tcMar>
+            <w:vAlign w:val="top"/>
+          </w:tcPr>
+          <w:p>
+            <w:r>
+              <w:t>Bước 4: Cài đặt Automation Đăng ký (n8n)</w:t>
+            </w:r>
+          </w:p>
+        </w:tc>
+        <w:tc>
+          <w:tcPr>
+            <w:tcBorders>
+              <w:top w:color="c4c7c5" w:space="0" w:sz="5" w:val="single"/>
+              <w:left w:color="c4c7c5" w:space="0" w:sz="5" w:val="single"/>
+              <w:bottom w:color="c4c7c5" w:space="0" w:sz="5" w:val="single"/>
+              <w:right w:color="c4c7c5" w:space="0" w:sz="5" w:val="single"/>
+            </w:tcBorders>
+            <w:tcMar>
+              <w:top w:w="120.0" w:type="dxa"/>
+              <w:left w:w="180.0" w:type="dxa"/>
+              <w:bottom w:w="120.0" w:type="dxa"/>
+              <w:right w:w="180.0" w:type="dxa"/>
+            </w:tcMar>
+            <w:vAlign w:val="top"/>
+          </w:tcPr>
+          <w:p>
+            <w:r>
+              <w:t>- Setup một project/workflow n8n riêng theo tên trường dựa trên Google Form Check-in đã tạo.</w:t>
+              <w:br/>
+              <w:t>- Cấu hình luồng n8n gửi email xác nhận check-in tự động (kèm tên trường tương ứng) ngay khi sinh viên nộp form check-in thành công.</w:t>
+              <w:br/>
+              <w:t>- Setup và hẹn giờ trên n8n để tự động gửi email Check-out &amp; Quà tặng đến các sinh viên đã check-in vào lúc 23h55 cùng ngày tổ chức workshop.</w:t>
+              <w:br/>
+              <w:t>- Test luồng automation hoàn chỉnh: Google Form → n8n → Gmail xác nhận.</w:t>
+              <w:br/>
+              <w:t>- Đăng link form đăng ký lên các kênh truyền thông và kêu gọi đăng ký (+250 SV).</w:t>
+            </w:r>
+          </w:p>
+        </w:tc>
+        <w:tc>
+          <w:tcPr>
+            <w:tcBorders>
+              <w:top w:color="c4c7c5" w:space="0" w:sz="5" w:val="single"/>
+              <w:left w:color="c4c7c5" w:space="0" w:sz="5" w:val="single"/>
+              <w:bottom w:color="c4c7c5" w:space="0" w:sz="5" w:val="single"/>
+              <w:right w:color="c4c7c5" w:space="0" w:sz="5" w:val="single"/>
+            </w:tcBorders>
+            <w:tcMar>
+              <w:top w:w="120.0" w:type="dxa"/>
+              <w:left w:w="180.0" w:type="dxa"/>
+              <w:bottom w:w="120.0" w:type="dxa"/>
+              <w:right w:w="180.0" w:type="dxa"/>
+            </w:tcMar>
+            <w:vAlign w:val="top"/>
+          </w:tcPr>
+          <w:p>
+            <w:r>
+              <w:t>- Xây dựng kịch bản tự động hóa trên n8n tương tự Offline.</w:t>
+              <w:br/>
+              <w:t>- Điểm khác biệt duy nhất: Email xác nhận đăng ký thành công sẽ đính kèm Link phòng họp trực tuyến (Meet/Zoom) và hướng dẫn tham gia trực tuyến.</w:t>
+            </w:r>
+          </w:p>
+        </w:tc>
+        <w:tc>
+          <w:tcPr>
+            <w:tcBorders>
+              <w:top w:color="c4c7c5" w:space="0" w:sz="5" w:val="single"/>
+              <w:left w:color="c4c7c5" w:space="0" w:sz="5" w:val="single"/>
+              <w:bottom w:color="c4c7c5" w:space="0" w:sz="5" w:val="single"/>
+              <w:right w:color="c4c7c5" w:space="0" w:sz="5" w:val="single"/>
+            </w:tcBorders>
+            <w:tcMar>
+              <w:top w:w="120.0" w:type="dxa"/>
+              <w:left w:w="180.0" w:type="dxa"/>
+              <w:bottom w:w="120.0" w:type="dxa"/>
+              <w:right w:w="180.0" w:type="dxa"/>
+            </w:tcMar>
+            <w:vAlign w:val="top"/>
+          </w:tcPr>
+          <w:p>
+            <w:r>
+              <w:t>n8n, Google Forms, Gmail, Fanpage, TikTok</w:t>
+            </w:r>
+          </w:p>
+        </w:tc>
+        <w:tc>
+          <w:tcPr>
+            <w:tcBorders>
+              <w:top w:color="c4c7c5" w:space="0" w:sz="5" w:val="single"/>
+              <w:left w:color="c4c7c5" w:space="0" w:sz="5" w:val="single"/>
+              <w:bottom w:color="c4c7c5" w:space="0" w:sz="5" w:val="single"/>
+              <w:right w:color="c4c7c5" w:space="0" w:sz="5" w:val="single"/>
+            </w:tcBorders>
+            <w:tcMar>
+              <w:top w:w="120.0" w:type="dxa"/>
+              <w:left w:w="180.0" w:type="dxa"/>
+              <w:bottom w:w="120.0" w:type="dxa"/>
+              <w:right w:w="180.0" w:type="dxa"/>
+            </w:tcMar>
+            <w:vAlign w:val="top"/>
+          </w:tcPr>
+          <w:p>
+            <w:r>
+              <w:t>Hệ thống chạy tự động 100%. Sinh viên nhận được email xác nhận ngay lập tức sau khi bấm gửi form.</w:t>
             </w:r>
           </w:p>
         </w:tc>
@@ -2561,451 +1071,124 @@
             <w:vAlign w:val="top"/>
           </w:tcPr>
           <w:p>
-            <w:pPr>
-              <w:pBdr>
-                <w:top w:color="auto" w:space="0" w:sz="0" w:val="none"/>
-                <w:bottom w:color="auto" w:space="0" w:sz="0" w:val="none"/>
-                <w:right w:color="auto" w:space="0" w:sz="0" w:val="none"/>
-                <w:between w:color="auto" w:space="0" w:sz="0" w:val="none"/>
-              </w:pBdr>
-              <w:spacing w:after="480" w:lineRule="auto"/>
-              <w:rPr>
-                <w:color w:val="1f1f1f"/>
-              </w:rPr>
-            </w:pPr>
-            <w:r>
-              <w:rPr>
-                <w:b w:val="1"/>
-                <w:bCs w:val="1"/>
-                <w:color w:val="1f1f1f"/>
-                <w:rtl w:val="0"/>
-              </w:rPr>
-              <w:t xml:space="preserve">NGÀY 5</w:t>
-            </w:r>
-            <w:r>
-              <w:rPr>
-                <w:rtl w:val="0"/>
-              </w:rPr>
-            </w:r>
-          </w:p>
-        </w:tc>
-        <w:tc>
-          <w:tcPr>
-            <w:tcBorders>
-              <w:top w:color="c4c7c5" w:space="0" w:sz="5" w:val="single"/>
-              <w:left w:color="c4c7c5" w:space="0" w:sz="5" w:val="single"/>
-              <w:bottom w:color="c4c7c5" w:space="0" w:sz="5" w:val="single"/>
-              <w:right w:color="c4c7c5" w:space="0" w:sz="5" w:val="single"/>
-            </w:tcBorders>
-            <w:tcMar>
-              <w:top w:w="120.0" w:type="dxa"/>
-              <w:left w:w="180.0" w:type="dxa"/>
-              <w:bottom w:w="120.0" w:type="dxa"/>
-              <w:right w:w="180.0" w:type="dxa"/>
-            </w:tcMar>
-            <w:vAlign w:val="top"/>
-          </w:tcPr>
-          <w:p>
-            <w:pPr>
-              <w:pBdr>
-                <w:top w:color="auto" w:space="0" w:sz="0" w:val="none"/>
-                <w:bottom w:color="auto" w:space="0" w:sz="0" w:val="none"/>
-                <w:right w:color="auto" w:space="0" w:sz="0" w:val="none"/>
-                <w:between w:color="auto" w:space="0" w:sz="0" w:val="none"/>
-              </w:pBdr>
-              <w:spacing w:after="480" w:lineRule="auto"/>
-              <w:rPr>
-                <w:color w:val="1f1f1f"/>
-              </w:rPr>
-            </w:pPr>
-            <w:r>
-              <w:rPr>
-                <w:b w:val="1"/>
-                <w:bCs w:val="1"/>
-                <w:color w:val="1f1f1f"/>
-                <w:rtl w:val="0"/>
-              </w:rPr>
-              <w:t xml:space="preserve">Bước 5: Duyệt &amp; Chụp hình Truyền thông</w:t>
-            </w:r>
-            <w:r>
-              <w:rPr>
-                <w:rtl w:val="0"/>
-              </w:rPr>
-            </w:r>
-          </w:p>
-        </w:tc>
-        <w:tc>
-          <w:tcPr>
-            <w:tcBorders>
-              <w:top w:color="c4c7c5" w:space="0" w:sz="5" w:val="single"/>
-              <w:left w:color="c4c7c5" w:space="0" w:sz="5" w:val="single"/>
-              <w:bottom w:color="c4c7c5" w:space="0" w:sz="5" w:val="single"/>
-              <w:right w:color="c4c7c5" w:space="0" w:sz="5" w:val="single"/>
-            </w:tcBorders>
-            <w:tcMar>
-              <w:top w:w="120.0" w:type="dxa"/>
-              <w:left w:w="180.0" w:type="dxa"/>
-              <w:bottom w:w="120.0" w:type="dxa"/>
-              <w:right w:w="180.0" w:type="dxa"/>
-            </w:tcMar>
-            <w:vAlign w:val="top"/>
-          </w:tcPr>
-          <w:p>
-            <w:pPr>
-              <w:pBdr>
-                <w:top w:color="auto" w:space="0" w:sz="0" w:val="none"/>
-                <w:left w:color="auto" w:space="0" w:sz="0" w:val="none"/>
-                <w:bottom w:color="auto" w:space="0" w:sz="0" w:val="none"/>
-                <w:right w:color="auto" w:space="0" w:sz="0" w:val="none"/>
-                <w:between w:color="auto" w:space="0" w:sz="0" w:val="none"/>
-              </w:pBdr>
-              <w:spacing w:after="480" w:lineRule="auto"/>
-              <w:rPr>
-                <w:color w:val="1f1f1f"/>
-              </w:rPr>
-            </w:pPr>
-            <w:r>
-              <w:rPr>
-                <w:color w:val="1f1f1f"/>
-                <w:rtl w:val="0"/>
-              </w:rPr>
-              <w:t xml:space="preserve">- Thúc đẩy trường đăng bài; tự lan tỏa nội dung trên kênh cá nhân để quét lượng đăng ký chặng cuối.</w:t>
-            </w:r>
-          </w:p>
-          <w:p>
-            <w:pPr>
-              <w:pBdr>
-                <w:top w:color="auto" w:space="0" w:sz="0" w:val="none"/>
-                <w:bottom w:color="auto" w:space="0" w:sz="0" w:val="none"/>
-                <w:right w:color="auto" w:space="0" w:sz="0" w:val="none"/>
-                <w:between w:color="auto" w:space="0" w:sz="0" w:val="none"/>
-              </w:pBdr>
-              <w:spacing w:after="480" w:lineRule="auto"/>
-              <w:rPr>
-                <w:color w:val="1f1f1f"/>
-              </w:rPr>
-            </w:pPr>
-            <w:r>
-              <w:rPr>
-                <w:rtl w:val="0"/>
-              </w:rPr>
-            </w:r>
-          </w:p>
-          <w:p>
-            <w:pPr>
-              <w:pBdr>
-                <w:top w:color="auto" w:space="0" w:sz="0" w:val="none"/>
-                <w:left w:color="auto" w:space="0" w:sz="0" w:val="none"/>
-                <w:bottom w:color="auto" w:space="0" w:sz="0" w:val="none"/>
-                <w:right w:color="auto" w:space="0" w:sz="0" w:val="none"/>
-                <w:between w:color="auto" w:space="0" w:sz="0" w:val="none"/>
-              </w:pBdr>
-              <w:spacing w:after="480" w:lineRule="auto"/>
-              <w:rPr>
-                <w:color w:val="1f1f1f"/>
-              </w:rPr>
-            </w:pPr>
-            <w:r>
-              <w:rPr>
-                <w:color w:val="1f1f1f"/>
-                <w:rtl w:val="0"/>
-              </w:rPr>
-              <w:t xml:space="preserve">- </w:t>
-            </w:r>
-            <w:r>
-              <w:rPr>
-                <w:b w:val="1"/>
-                <w:bCs w:val="1"/>
-                <w:color w:val="1f1f1f"/>
-                <w:rtl w:val="0"/>
-              </w:rPr>
-              <w:t xml:space="preserve">Đến trường trước 1 ngày để duyệt lại hội trường, banner, poster</w:t>
-            </w:r>
-            <w:r>
-              <w:rPr>
-                <w:color w:val="1f1f1f"/>
-                <w:rtl w:val="0"/>
-              </w:rPr>
-              <w:t xml:space="preserve"> xem đã được triển khai treo tại campus chưa.</w:t>
-            </w:r>
-          </w:p>
-          <w:p>
-            <w:pPr>
-              <w:pBdr>
-                <w:top w:color="auto" w:space="0" w:sz="0" w:val="none"/>
-                <w:bottom w:color="auto" w:space="0" w:sz="0" w:val="none"/>
-                <w:right w:color="auto" w:space="0" w:sz="0" w:val="none"/>
-                <w:between w:color="auto" w:space="0" w:sz="0" w:val="none"/>
-              </w:pBdr>
-              <w:spacing w:after="480" w:lineRule="auto"/>
-              <w:rPr>
-                <w:color w:val="1f1f1f"/>
-              </w:rPr>
-            </w:pPr>
-            <w:r>
-              <w:rPr>
-                <w:rtl w:val="0"/>
-              </w:rPr>
-            </w:r>
-          </w:p>
-          <w:p>
-            <w:pPr>
-              <w:pBdr>
-                <w:top w:color="auto" w:space="0" w:sz="0" w:val="none"/>
-                <w:left w:color="auto" w:space="0" w:sz="0" w:val="none"/>
-                <w:bottom w:color="auto" w:space="0" w:sz="0" w:val="none"/>
-                <w:right w:color="auto" w:space="0" w:sz="0" w:val="none"/>
-                <w:between w:color="auto" w:space="0" w:sz="0" w:val="none"/>
-              </w:pBdr>
-              <w:spacing w:after="480" w:lineRule="auto"/>
-              <w:rPr>
-                <w:color w:val="1f1f1f"/>
-              </w:rPr>
-            </w:pPr>
-            <w:r>
-              <w:rPr>
-                <w:color w:val="1f1f1f"/>
-                <w:rtl w:val="0"/>
-              </w:rPr>
-              <w:t xml:space="preserve">- </w:t>
-            </w:r>
-            <w:r>
-              <w:rPr>
-                <w:b w:val="1"/>
-                <w:bCs w:val="1"/>
-                <w:color w:val="1f1f1f"/>
-                <w:rtl w:val="0"/>
-              </w:rPr>
-              <w:t xml:space="preserve">Chụp hình truyền thông thực tế trước 1 ngày</w:t>
-            </w:r>
-            <w:r>
-              <w:rPr>
-                <w:color w:val="1f1f1f"/>
-                <w:rtl w:val="0"/>
-              </w:rPr>
-              <w:t xml:space="preserve"> (không gian hội trường, banner tại campus) để đăng bài nhắc hẹn, hâm nóng không khí trước giờ G.</w:t>
-            </w:r>
-          </w:p>
-        </w:tc>
-        <w:tc>
-          <w:tcPr>
-            <w:tcBorders>
-              <w:top w:color="c4c7c5" w:space="0" w:sz="5" w:val="single"/>
-              <w:left w:color="c4c7c5" w:space="0" w:sz="5" w:val="single"/>
-              <w:bottom w:color="c4c7c5" w:space="0" w:sz="5" w:val="single"/>
-              <w:right w:color="c4c7c5" w:space="0" w:sz="5" w:val="single"/>
-            </w:tcBorders>
-            <w:tcMar>
-              <w:top w:w="120.0" w:type="dxa"/>
-              <w:left w:w="180.0" w:type="dxa"/>
-              <w:bottom w:w="120.0" w:type="dxa"/>
-              <w:right w:w="180.0" w:type="dxa"/>
-            </w:tcMar>
-            <w:vAlign w:val="top"/>
-          </w:tcPr>
-          <w:p>
-            <w:pPr>
-              <w:pBdr>
-                <w:top w:color="auto" w:space="0" w:sz="0" w:val="none"/>
-                <w:left w:color="auto" w:space="0" w:sz="0" w:val="none"/>
-                <w:bottom w:color="auto" w:space="0" w:sz="0" w:val="none"/>
-                <w:right w:color="auto" w:space="0" w:sz="0" w:val="none"/>
-                <w:between w:color="auto" w:space="0" w:sz="0" w:val="none"/>
-              </w:pBdr>
-              <w:spacing w:after="480" w:lineRule="auto"/>
-              <w:rPr>
-                <w:color w:val="1f1f1f"/>
-              </w:rPr>
-            </w:pPr>
-            <w:r>
-              <w:rPr>
-                <w:color w:val="1f1f1f"/>
-                <w:rtl w:val="0"/>
-              </w:rPr>
-              <w:t xml:space="preserve">- Thúc đẩy trường/khoa/CLB chia sẻ link phòng họp vào các group lớp; tự lan tỏa nội dung trên kênh cá nhân.</w:t>
-            </w:r>
-          </w:p>
-          <w:p>
-            <w:pPr>
-              <w:pBdr>
-                <w:top w:color="auto" w:space="0" w:sz="0" w:val="none"/>
-                <w:bottom w:color="auto" w:space="0" w:sz="0" w:val="none"/>
-                <w:right w:color="auto" w:space="0" w:sz="0" w:val="none"/>
-                <w:between w:color="auto" w:space="0" w:sz="0" w:val="none"/>
-              </w:pBdr>
-              <w:spacing w:after="480" w:lineRule="auto"/>
-              <w:rPr>
-                <w:color w:val="1f1f1f"/>
-              </w:rPr>
-            </w:pPr>
-            <w:r>
-              <w:rPr>
-                <w:rtl w:val="0"/>
-              </w:rPr>
-            </w:r>
-          </w:p>
-          <w:p>
-            <w:pPr>
-              <w:pBdr>
-                <w:top w:color="auto" w:space="0" w:sz="0" w:val="none"/>
-                <w:left w:color="auto" w:space="0" w:sz="0" w:val="none"/>
-                <w:bottom w:color="auto" w:space="0" w:sz="0" w:val="none"/>
-                <w:right w:color="auto" w:space="0" w:sz="0" w:val="none"/>
-                <w:between w:color="auto" w:space="0" w:sz="0" w:val="none"/>
-              </w:pBdr>
-              <w:spacing w:after="480" w:lineRule="auto"/>
-              <w:rPr>
-                <w:color w:val="1f1f1f"/>
-              </w:rPr>
-            </w:pPr>
-            <w:r>
-              <w:rPr>
-                <w:color w:val="1f1f1f"/>
-                <w:rtl w:val="0"/>
-              </w:rPr>
-              <w:t xml:space="preserve">- Kiểm tra hệ thống đường truyền mạng và room họp trực tuyến (Đảm bảo room họp đã nâng cấp sức chứa +250 người).</w:t>
-            </w:r>
-          </w:p>
-          <w:p>
-            <w:pPr>
-              <w:pBdr>
-                <w:top w:color="auto" w:space="0" w:sz="0" w:val="none"/>
-                <w:bottom w:color="auto" w:space="0" w:sz="0" w:val="none"/>
-                <w:right w:color="auto" w:space="0" w:sz="0" w:val="none"/>
-                <w:between w:color="auto" w:space="0" w:sz="0" w:val="none"/>
-              </w:pBdr>
-              <w:spacing w:after="480" w:lineRule="auto"/>
-              <w:rPr>
-                <w:color w:val="1f1f1f"/>
-              </w:rPr>
-            </w:pPr>
-            <w:r>
-              <w:rPr>
-                <w:rtl w:val="0"/>
-              </w:rPr>
-            </w:r>
-          </w:p>
-          <w:p>
-            <w:pPr>
-              <w:pBdr>
-                <w:top w:color="auto" w:space="0" w:sz="0" w:val="none"/>
-                <w:left w:color="auto" w:space="0" w:sz="0" w:val="none"/>
-                <w:bottom w:color="auto" w:space="0" w:sz="0" w:val="none"/>
-                <w:right w:color="auto" w:space="0" w:sz="0" w:val="none"/>
-                <w:between w:color="auto" w:space="0" w:sz="0" w:val="none"/>
-              </w:pBdr>
-              <w:spacing w:after="480" w:lineRule="auto"/>
-              <w:rPr>
-                <w:color w:val="1f1f1f"/>
-              </w:rPr>
-            </w:pPr>
-            <w:r>
-              <w:rPr>
-                <w:color w:val="1f1f1f"/>
-                <w:rtl w:val="0"/>
-              </w:rPr>
-              <w:t xml:space="preserve">- </w:t>
-            </w:r>
-            <w:r>
-              <w:rPr>
-                <w:b w:val="1"/>
-                <w:bCs w:val="1"/>
-                <w:color w:val="1f1f1f"/>
-                <w:rtl w:val="0"/>
-              </w:rPr>
-              <w:t xml:space="preserve">Chụp ảnh màn hình slide hoặc không gian test phòng họp trước 1 ngày</w:t>
-            </w:r>
-            <w:r>
-              <w:rPr>
-                <w:color w:val="1f1f1f"/>
-                <w:rtl w:val="0"/>
-              </w:rPr>
-              <w:t xml:space="preserve"> để đăng bài đếm ngược (Countdown) nhắc hẹn kèm link phòng lên Fanpage/TikTok.</w:t>
-            </w:r>
-          </w:p>
-        </w:tc>
-        <w:tc>
-          <w:tcPr>
-            <w:tcBorders>
-              <w:top w:color="c4c7c5" w:space="0" w:sz="5" w:val="single"/>
-              <w:left w:color="c4c7c5" w:space="0" w:sz="5" w:val="single"/>
-              <w:bottom w:color="c4c7c5" w:space="0" w:sz="5" w:val="single"/>
-              <w:right w:color="c4c7c5" w:space="0" w:sz="5" w:val="single"/>
-            </w:tcBorders>
-            <w:tcMar>
-              <w:top w:w="120.0" w:type="dxa"/>
-              <w:left w:w="180.0" w:type="dxa"/>
-              <w:bottom w:w="120.0" w:type="dxa"/>
-              <w:right w:w="180.0" w:type="dxa"/>
-            </w:tcMar>
-            <w:vAlign w:val="top"/>
-          </w:tcPr>
-          <w:p>
-            <w:pPr>
-              <w:pBdr>
-                <w:top w:color="auto" w:space="0" w:sz="0" w:val="none"/>
-                <w:bottom w:color="auto" w:space="0" w:sz="0" w:val="none"/>
-                <w:right w:color="auto" w:space="0" w:sz="0" w:val="none"/>
-                <w:between w:color="auto" w:space="0" w:sz="0" w:val="none"/>
-              </w:pBdr>
-              <w:spacing w:after="480" w:lineRule="auto"/>
-              <w:rPr>
-                <w:color w:val="1f1f1f"/>
-              </w:rPr>
-            </w:pPr>
-            <w:r>
-              <w:rPr>
-                <w:color w:val="1f1f1f"/>
-                <w:rtl w:val="0"/>
-              </w:rPr>
-              <w:t xml:space="preserve">Máy ảnh / Điện thoại, Fanpage, TikTok</w:t>
-            </w:r>
-          </w:p>
-        </w:tc>
-        <w:tc>
-          <w:tcPr>
-            <w:tcBorders>
-              <w:top w:color="c4c7c5" w:space="0" w:sz="5" w:val="single"/>
-              <w:left w:color="c4c7c5" w:space="0" w:sz="5" w:val="single"/>
-              <w:bottom w:color="c4c7c5" w:space="0" w:sz="5" w:val="single"/>
-              <w:right w:color="c4c7c5" w:space="0" w:sz="5" w:val="single"/>
-            </w:tcBorders>
-            <w:tcMar>
-              <w:top w:w="120.0" w:type="dxa"/>
-              <w:left w:w="180.0" w:type="dxa"/>
-              <w:bottom w:w="120.0" w:type="dxa"/>
-              <w:right w:w="180.0" w:type="dxa"/>
-            </w:tcMar>
-            <w:vAlign w:val="top"/>
-          </w:tcPr>
-          <w:p>
-            <w:pPr>
-              <w:pBdr>
-                <w:top w:color="auto" w:space="0" w:sz="0" w:val="none"/>
-                <w:bottom w:color="auto" w:space="0" w:sz="0" w:val="none"/>
-                <w:right w:color="auto" w:space="0" w:sz="0" w:val="none"/>
-                <w:between w:color="auto" w:space="0" w:sz="0" w:val="none"/>
-              </w:pBdr>
-              <w:spacing w:after="480" w:lineRule="auto"/>
-              <w:rPr>
-                <w:color w:val="1f1f1f"/>
-              </w:rPr>
-            </w:pPr>
-            <w:r>
-              <w:rPr>
-                <w:b w:val="1"/>
-                <w:bCs w:val="1"/>
-                <w:color w:val="1f1f1f"/>
-                <w:rtl w:val="0"/>
-              </w:rPr>
-              <w:t xml:space="preserve">Đạt mốc đăng ký +250 sinh viên</w:t>
-            </w:r>
-            <w:r>
-              <w:rPr>
-                <w:color w:val="1f1f1f"/>
-                <w:rtl w:val="0"/>
-              </w:rPr>
-              <w:t xml:space="preserve">. Bài đăng hâm nóng hình ảnh thực tế thu hút tương tác tốt trước ngày diễn ra sự kiện.</w:t>
+            <w:r>
+              <w:t>NGÀY 5</w:t>
+            </w:r>
+          </w:p>
+        </w:tc>
+        <w:tc>
+          <w:tcPr>
+            <w:tcBorders>
+              <w:top w:color="c4c7c5" w:space="0" w:sz="5" w:val="single"/>
+              <w:left w:color="c4c7c5" w:space="0" w:sz="5" w:val="single"/>
+              <w:bottom w:color="c4c7c5" w:space="0" w:sz="5" w:val="single"/>
+              <w:right w:color="c4c7c5" w:space="0" w:sz="5" w:val="single"/>
+            </w:tcBorders>
+            <w:tcMar>
+              <w:top w:w="120.0" w:type="dxa"/>
+              <w:left w:w="180.0" w:type="dxa"/>
+              <w:bottom w:w="120.0" w:type="dxa"/>
+              <w:right w:w="180.0" w:type="dxa"/>
+            </w:tcMar>
+            <w:vAlign w:val="top"/>
+          </w:tcPr>
+          <w:p>
+            <w:r>
+              <w:t>Bước 5: Duyệt &amp; Chụp hình Truyền thông</w:t>
+            </w:r>
+          </w:p>
+        </w:tc>
+        <w:tc>
+          <w:tcPr>
+            <w:tcBorders>
+              <w:top w:color="c4c7c5" w:space="0" w:sz="5" w:val="single"/>
+              <w:left w:color="c4c7c5" w:space="0" w:sz="5" w:val="single"/>
+              <w:bottom w:color="c4c7c5" w:space="0" w:sz="5" w:val="single"/>
+              <w:right w:color="c4c7c5" w:space="0" w:sz="5" w:val="single"/>
+            </w:tcBorders>
+            <w:tcMar>
+              <w:top w:w="120.0" w:type="dxa"/>
+              <w:left w:w="180.0" w:type="dxa"/>
+              <w:bottom w:w="120.0" w:type="dxa"/>
+              <w:right w:w="180.0" w:type="dxa"/>
+            </w:tcMar>
+            <w:vAlign w:val="top"/>
+          </w:tcPr>
+          <w:p>
+            <w:r>
+              <w:t>- Đến trường duyệt lại hội trường và banner đã treo tại campus.</w:t>
+              <w:br/>
+              <w:t>- Chụp hình truyền thông thực tế (không gian hội trường, banner tại campus) để đăng bài nhắc hẹn, hâm nóng không khí trước giờ G.</w:t>
+            </w:r>
+          </w:p>
+        </w:tc>
+        <w:tc>
+          <w:tcPr>
+            <w:tcBorders>
+              <w:top w:color="c4c7c5" w:space="0" w:sz="5" w:val="single"/>
+              <w:left w:color="c4c7c5" w:space="0" w:sz="5" w:val="single"/>
+              <w:bottom w:color="c4c7c5" w:space="0" w:sz="5" w:val="single"/>
+              <w:right w:color="c4c7c5" w:space="0" w:sz="5" w:val="single"/>
+            </w:tcBorders>
+            <w:tcMar>
+              <w:top w:w="120.0" w:type="dxa"/>
+              <w:left w:w="180.0" w:type="dxa"/>
+              <w:bottom w:w="120.0" w:type="dxa"/>
+              <w:right w:w="180.0" w:type="dxa"/>
+            </w:tcMar>
+            <w:vAlign w:val="top"/>
+          </w:tcPr>
+          <w:p>
+            <w:r>
+              <w:t>- Thúc đẩy trường/khoa/CLB chia sẻ link phòng họp vào các group lớp; tự lan tỏa nội dung trên kênh cá nhân.</w:t>
+              <w:br/>
+              <w:t>- Kiểm tra hệ thống đường truyền mạng và room họp trực tuyến (sức chứa +250 người).</w:t>
+              <w:br/>
+              <w:t>- Chụp ảnh màn hình slide hoặc không gian test phòng họp trước 1 ngày để đăng bài đếm ngược (Countdown) nhắc hẹn kèm link phòng lên Fanpage/TikTok.</w:t>
+            </w:r>
+          </w:p>
+        </w:tc>
+        <w:tc>
+          <w:tcPr>
+            <w:tcBorders>
+              <w:top w:color="c4c7c5" w:space="0" w:sz="5" w:val="single"/>
+              <w:left w:color="c4c7c5" w:space="0" w:sz="5" w:val="single"/>
+              <w:bottom w:color="c4c7c5" w:space="0" w:sz="5" w:val="single"/>
+              <w:right w:color="c4c7c5" w:space="0" w:sz="5" w:val="single"/>
+            </w:tcBorders>
+            <w:tcMar>
+              <w:top w:w="120.0" w:type="dxa"/>
+              <w:left w:w="180.0" w:type="dxa"/>
+              <w:bottom w:w="120.0" w:type="dxa"/>
+              <w:right w:w="180.0" w:type="dxa"/>
+            </w:tcMar>
+            <w:vAlign w:val="top"/>
+          </w:tcPr>
+          <w:p>
+            <w:r>
+              <w:t>Máy ảnh / Điện thoại, Fanpage, TikTok, Meet/Zoom</w:t>
+            </w:r>
+          </w:p>
+        </w:tc>
+        <w:tc>
+          <w:tcPr>
+            <w:tcBorders>
+              <w:top w:color="c4c7c5" w:space="0" w:sz="5" w:val="single"/>
+              <w:left w:color="c4c7c5" w:space="0" w:sz="5" w:val="single"/>
+              <w:bottom w:color="c4c7c5" w:space="0" w:sz="5" w:val="single"/>
+              <w:right w:color="c4c7c5" w:space="0" w:sz="5" w:val="single"/>
+            </w:tcBorders>
+            <w:tcMar>
+              <w:top w:w="120.0" w:type="dxa"/>
+              <w:left w:w="180.0" w:type="dxa"/>
+              <w:bottom w:w="120.0" w:type="dxa"/>
+              <w:right w:w="180.0" w:type="dxa"/>
+            </w:tcMar>
+            <w:vAlign w:val="top"/>
+          </w:tcPr>
+          <w:p>
+            <w:r>
+              <w:t>Đạt mốc đăng ký +250 sinh viên. Bài đăng hâm nóng hình ảnh thực tế thu hút tương tác tốt trước ngày diễn ra sự kiện.</w:t>
             </w:r>
           </w:p>
         </w:tc>
@@ -3033,585 +1216,124 @@
             <w:vAlign w:val="top"/>
           </w:tcPr>
           <w:p>
-            <w:pPr>
-              <w:pBdr>
-                <w:top w:color="auto" w:space="0" w:sz="0" w:val="none"/>
-                <w:bottom w:color="auto" w:space="0" w:sz="0" w:val="none"/>
-                <w:right w:color="auto" w:space="0" w:sz="0" w:val="none"/>
-                <w:between w:color="auto" w:space="0" w:sz="0" w:val="none"/>
-              </w:pBdr>
-              <w:spacing w:after="480" w:lineRule="auto"/>
-              <w:rPr>
-                <w:color w:val="1f1f1f"/>
-              </w:rPr>
-            </w:pPr>
-            <w:r>
-              <w:rPr>
-                <w:b w:val="1"/>
-                <w:bCs w:val="1"/>
-                <w:color w:val="1f1f1f"/>
-                <w:rtl w:val="0"/>
-              </w:rPr>
-              <w:t xml:space="preserve">NGÀY 6</w:t>
-            </w:r>
-            <w:r>
-              <w:rPr>
-                <w:rtl w:val="0"/>
-              </w:rPr>
-            </w:r>
-          </w:p>
-        </w:tc>
-        <w:tc>
-          <w:tcPr>
-            <w:tcBorders>
-              <w:top w:color="c4c7c5" w:space="0" w:sz="5" w:val="single"/>
-              <w:left w:color="c4c7c5" w:space="0" w:sz="5" w:val="single"/>
-              <w:bottom w:color="c4c7c5" w:space="0" w:sz="5" w:val="single"/>
-              <w:right w:color="c4c7c5" w:space="0" w:sz="5" w:val="single"/>
-            </w:tcBorders>
-            <w:tcMar>
-              <w:top w:w="120.0" w:type="dxa"/>
-              <w:left w:w="180.0" w:type="dxa"/>
-              <w:bottom w:w="120.0" w:type="dxa"/>
-              <w:right w:w="180.0" w:type="dxa"/>
-            </w:tcMar>
-            <w:vAlign w:val="top"/>
-          </w:tcPr>
-          <w:p>
-            <w:pPr>
-              <w:pBdr>
-                <w:top w:color="auto" w:space="0" w:sz="0" w:val="none"/>
-                <w:bottom w:color="auto" w:space="0" w:sz="0" w:val="none"/>
-                <w:right w:color="auto" w:space="0" w:sz="0" w:val="none"/>
-                <w:between w:color="auto" w:space="0" w:sz="0" w:val="none"/>
-              </w:pBdr>
-              <w:spacing w:after="480" w:lineRule="auto"/>
-              <w:rPr>
-                <w:color w:val="1f1f1f"/>
-              </w:rPr>
-            </w:pPr>
-            <w:r>
-              <w:rPr>
-                <w:b w:val="1"/>
-                <w:bCs w:val="1"/>
-                <w:color w:val="1f1f1f"/>
-                <w:rtl w:val="0"/>
-              </w:rPr>
-              <w:t xml:space="preserve">Bước 6 &amp; 7: VẬN HÀNH &amp; AUTOMATION CHECK-OUT</w:t>
-            </w:r>
-            <w:r>
-              <w:rPr>
-                <w:rtl w:val="0"/>
-              </w:rPr>
-            </w:r>
-          </w:p>
-        </w:tc>
-        <w:tc>
-          <w:tcPr>
-            <w:tcBorders>
-              <w:top w:color="c4c7c5" w:space="0" w:sz="5" w:val="single"/>
-              <w:left w:color="c4c7c5" w:space="0" w:sz="5" w:val="single"/>
-              <w:bottom w:color="c4c7c5" w:space="0" w:sz="5" w:val="single"/>
-              <w:right w:color="c4c7c5" w:space="0" w:sz="5" w:val="single"/>
-            </w:tcBorders>
-            <w:tcMar>
-              <w:top w:w="120.0" w:type="dxa"/>
-              <w:left w:w="180.0" w:type="dxa"/>
-              <w:bottom w:w="120.0" w:type="dxa"/>
-              <w:right w:w="180.0" w:type="dxa"/>
-            </w:tcMar>
-            <w:vAlign w:val="top"/>
-          </w:tcPr>
-          <w:p>
-            <w:pPr>
-              <w:pBdr>
-                <w:top w:color="auto" w:space="0" w:sz="0" w:val="none"/>
-                <w:left w:color="auto" w:space="0" w:sz="0" w:val="none"/>
-                <w:bottom w:color="auto" w:space="0" w:sz="0" w:val="none"/>
-                <w:right w:color="auto" w:space="0" w:sz="0" w:val="none"/>
-                <w:between w:color="auto" w:space="0" w:sz="0" w:val="none"/>
-              </w:pBdr>
-              <w:spacing w:after="480" w:lineRule="auto"/>
-              <w:rPr>
-                <w:color w:val="1f1f1f"/>
-              </w:rPr>
-            </w:pPr>
-            <w:r>
-              <w:rPr>
-                <w:b w:val="1"/>
-                <w:bCs w:val="1"/>
-                <w:color w:val="1f1f1f"/>
-                <w:rtl w:val="0"/>
-              </w:rPr>
-              <w:t xml:space="preserve">- Trước WS 2 tiếng:</w:t>
-            </w:r>
-            <w:r>
-              <w:rPr>
-                <w:color w:val="1f1f1f"/>
-                <w:rtl w:val="0"/>
-              </w:rPr>
-              <w:t xml:space="preserve"> Có mặt tại hội trường để </w:t>
-            </w:r>
-            <w:r>
-              <w:rPr>
-                <w:b w:val="1"/>
-                <w:bCs w:val="1"/>
-                <w:color w:val="1f1f1f"/>
-                <w:rtl w:val="0"/>
-              </w:rPr>
-              <w:t xml:space="preserve">mượn thiết bị từ cán bộ trường &amp; tiến hành setup</w:t>
-            </w:r>
-            <w:r>
-              <w:rPr>
-                <w:color w:val="1f1f1f"/>
-                <w:rtl w:val="0"/>
-              </w:rPr>
-              <w:t xml:space="preserve"> âm thanh, máy chiếu, micro, chạy thử slide, video bài giảng (Sound-check).</w:t>
-            </w:r>
-          </w:p>
-          <w:p>
-            <w:pPr>
-              <w:pBdr>
-                <w:top w:color="auto" w:space="0" w:sz="0" w:val="none"/>
-                <w:bottom w:color="auto" w:space="0" w:sz="0" w:val="none"/>
-                <w:right w:color="auto" w:space="0" w:sz="0" w:val="none"/>
-                <w:between w:color="auto" w:space="0" w:sz="0" w:val="none"/>
-              </w:pBdr>
-              <w:spacing w:after="480" w:lineRule="auto"/>
-              <w:rPr>
-                <w:color w:val="1f1f1f"/>
-              </w:rPr>
-            </w:pPr>
-            <w:r>
-              <w:rPr>
-                <w:rtl w:val="0"/>
-              </w:rPr>
-            </w:r>
-          </w:p>
-          <w:p>
-            <w:pPr>
-              <w:pBdr>
-                <w:top w:color="auto" w:space="0" w:sz="0" w:val="none"/>
-                <w:left w:color="auto" w:space="0" w:sz="0" w:val="none"/>
-                <w:bottom w:color="auto" w:space="0" w:sz="0" w:val="none"/>
-                <w:right w:color="auto" w:space="0" w:sz="0" w:val="none"/>
-                <w:between w:color="auto" w:space="0" w:sz="0" w:val="none"/>
-              </w:pBdr>
-              <w:spacing w:after="480" w:lineRule="auto"/>
-              <w:rPr>
-                <w:color w:val="1f1f1f"/>
-              </w:rPr>
-            </w:pPr>
-            <w:r>
-              <w:rPr>
-                <w:b w:val="1"/>
-                <w:bCs w:val="1"/>
-                <w:color w:val="1f1f1f"/>
-                <w:rtl w:val="0"/>
-              </w:rPr>
-              <w:t xml:space="preserve">- Trong WS:</w:t>
-            </w:r>
-            <w:r>
-              <w:rPr>
-                <w:color w:val="1f1f1f"/>
-                <w:rtl w:val="0"/>
-              </w:rPr>
-              <w:t xml:space="preserve"> Đội media tập trung quay chụp, bắt khoảnh khắc hội trường bùng nổ +250 người.</w:t>
-            </w:r>
-          </w:p>
-          <w:p>
-            <w:pPr>
-              <w:pBdr>
-                <w:top w:color="auto" w:space="0" w:sz="0" w:val="none"/>
-                <w:bottom w:color="auto" w:space="0" w:sz="0" w:val="none"/>
-                <w:right w:color="auto" w:space="0" w:sz="0" w:val="none"/>
-                <w:between w:color="auto" w:space="0" w:sz="0" w:val="none"/>
-              </w:pBdr>
-              <w:spacing w:after="480" w:lineRule="auto"/>
-              <w:rPr>
-                <w:color w:val="1f1f1f"/>
-              </w:rPr>
-            </w:pPr>
-            <w:r>
-              <w:rPr>
-                <w:rtl w:val="0"/>
-              </w:rPr>
-            </w:r>
-          </w:p>
-          <w:p>
-            <w:pPr>
-              <w:pBdr>
-                <w:top w:color="auto" w:space="0" w:sz="0" w:val="none"/>
-                <w:left w:color="auto" w:space="0" w:sz="0" w:val="none"/>
-                <w:bottom w:color="auto" w:space="0" w:sz="0" w:val="none"/>
-                <w:right w:color="auto" w:space="0" w:sz="0" w:val="none"/>
-                <w:between w:color="auto" w:space="0" w:sz="0" w:val="none"/>
-              </w:pBdr>
-              <w:spacing w:after="480" w:lineRule="auto"/>
-              <w:rPr>
-                <w:color w:val="1f1f1f"/>
-              </w:rPr>
-            </w:pPr>
-            <w:r>
-              <w:rPr>
-                <w:b w:val="1"/>
-                <w:bCs w:val="1"/>
-                <w:color w:val="1f1f1f"/>
-                <w:rtl w:val="0"/>
-              </w:rPr>
-              <w:t xml:space="preserve">- Cuối WS:</w:t>
-            </w:r>
-            <w:r>
-              <w:rPr>
-                <w:color w:val="1f1f1f"/>
-                <w:rtl w:val="0"/>
-              </w:rPr>
-              <w:t xml:space="preserve"> Chiếu slide </w:t>
-            </w:r>
-            <w:r>
-              <w:rPr>
-                <w:b w:val="1"/>
-                <w:bCs w:val="1"/>
-                <w:color w:val="1f1f1f"/>
-                <w:rtl w:val="0"/>
-              </w:rPr>
-              <w:t xml:space="preserve">QR Code Form Check-out</w:t>
-            </w:r>
-            <w:r>
-              <w:rPr>
-                <w:color w:val="1f1f1f"/>
-                <w:rtl w:val="0"/>
-              </w:rPr>
-              <w:t xml:space="preserve"> (Khảo sát) -&gt; Kích hoạt luồng </w:t>
-            </w:r>
-            <w:r>
-              <w:rPr>
-                <w:b w:val="1"/>
-                <w:bCs w:val="1"/>
-                <w:color w:val="1f1f1f"/>
-                <w:rtl w:val="0"/>
-              </w:rPr>
-              <w:t xml:space="preserve">n8n tự động gửi email cảm ơn, kèm link slide và tặng quà tự động</w:t>
-            </w:r>
-            <w:r>
-              <w:rPr>
-                <w:color w:val="1f1f1f"/>
-                <w:rtl w:val="0"/>
-              </w:rPr>
-              <w:t xml:space="preserve"> ngay khi điền xong.</w:t>
-            </w:r>
-          </w:p>
-        </w:tc>
-        <w:tc>
-          <w:tcPr>
-            <w:tcBorders>
-              <w:top w:color="c4c7c5" w:space="0" w:sz="5" w:val="single"/>
-              <w:left w:color="c4c7c5" w:space="0" w:sz="5" w:val="single"/>
-              <w:bottom w:color="c4c7c5" w:space="0" w:sz="5" w:val="single"/>
-              <w:right w:color="c4c7c5" w:space="0" w:sz="5" w:val="single"/>
-            </w:tcBorders>
-            <w:tcMar>
-              <w:top w:w="120.0" w:type="dxa"/>
-              <w:left w:w="180.0" w:type="dxa"/>
-              <w:bottom w:w="120.0" w:type="dxa"/>
-              <w:right w:w="180.0" w:type="dxa"/>
-            </w:tcMar>
-            <w:vAlign w:val="top"/>
-          </w:tcPr>
-          <w:p>
-            <w:pPr>
-              <w:pBdr>
-                <w:top w:color="auto" w:space="0" w:sz="0" w:val="none"/>
-                <w:left w:color="auto" w:space="0" w:sz="0" w:val="none"/>
-                <w:bottom w:color="auto" w:space="0" w:sz="0" w:val="none"/>
-                <w:right w:color="auto" w:space="0" w:sz="0" w:val="none"/>
-                <w:between w:color="auto" w:space="0" w:sz="0" w:val="none"/>
-              </w:pBdr>
-              <w:spacing w:after="480" w:lineRule="auto"/>
-              <w:rPr>
-                <w:color w:val="1f1f1f"/>
-              </w:rPr>
-            </w:pPr>
-            <w:r>
-              <w:rPr>
-                <w:b w:val="1"/>
-                <w:bCs w:val="1"/>
-                <w:color w:val="1f1f1f"/>
-                <w:rtl w:val="0"/>
-              </w:rPr>
-              <w:t xml:space="preserve">- Trước WS 1 tiếng:</w:t>
-            </w:r>
-            <w:r>
-              <w:rPr>
-                <w:color w:val="1f1f1f"/>
-                <w:rtl w:val="0"/>
-              </w:rPr>
-              <w:t xml:space="preserve"> Mở phòng họp trực tuyến, </w:t>
-            </w:r>
-            <w:r>
-              <w:rPr>
-                <w:b w:val="1"/>
-                <w:bCs w:val="1"/>
-                <w:color w:val="1f1f1f"/>
-                <w:rtl w:val="0"/>
-              </w:rPr>
-              <w:t xml:space="preserve">setup quyền Host/Co-host, kiểm tra mic/loa/chia sẻ màn hình</w:t>
-            </w:r>
-            <w:r>
-              <w:rPr>
-                <w:color w:val="1f1f1f"/>
-                <w:rtl w:val="0"/>
-              </w:rPr>
-              <w:t xml:space="preserve">, bật nhạc nền chờ sinh viên.</w:t>
-            </w:r>
-          </w:p>
-          <w:p>
-            <w:pPr>
-              <w:pBdr>
-                <w:top w:color="auto" w:space="0" w:sz="0" w:val="none"/>
-                <w:bottom w:color="auto" w:space="0" w:sz="0" w:val="none"/>
-                <w:right w:color="auto" w:space="0" w:sz="0" w:val="none"/>
-                <w:between w:color="auto" w:space="0" w:sz="0" w:val="none"/>
-              </w:pBdr>
-              <w:spacing w:after="480" w:lineRule="auto"/>
-              <w:rPr>
-                <w:color w:val="1f1f1f"/>
-              </w:rPr>
-            </w:pPr>
-            <w:r>
-              <w:rPr>
-                <w:rtl w:val="0"/>
-              </w:rPr>
-            </w:r>
-          </w:p>
-          <w:p>
-            <w:pPr>
-              <w:pBdr>
-                <w:top w:color="auto" w:space="0" w:sz="0" w:val="none"/>
-                <w:left w:color="auto" w:space="0" w:sz="0" w:val="none"/>
-                <w:bottom w:color="auto" w:space="0" w:sz="0" w:val="none"/>
-                <w:right w:color="auto" w:space="0" w:sz="0" w:val="none"/>
-                <w:between w:color="auto" w:space="0" w:sz="0" w:val="none"/>
-              </w:pBdr>
-              <w:spacing w:after="480" w:lineRule="auto"/>
-              <w:rPr>
-                <w:color w:val="1f1f1f"/>
-              </w:rPr>
-            </w:pPr>
-            <w:r>
-              <w:rPr>
-                <w:b w:val="1"/>
-                <w:bCs w:val="1"/>
-                <w:color w:val="1f1f1f"/>
-                <w:rtl w:val="0"/>
-              </w:rPr>
-              <w:t xml:space="preserve">- Trong WS:</w:t>
-            </w:r>
-            <w:r>
-              <w:rPr>
-                <w:color w:val="1f1f1f"/>
-                <w:rtl w:val="0"/>
-              </w:rPr>
-              <w:t xml:space="preserve"> Bật tính năng </w:t>
-            </w:r>
-            <w:r>
-              <w:rPr>
-                <w:b w:val="1"/>
-                <w:bCs w:val="1"/>
-                <w:color w:val="1f1f1f"/>
-                <w:rtl w:val="0"/>
-              </w:rPr>
-              <w:t xml:space="preserve">Record cuộc họp</w:t>
-            </w:r>
-            <w:r>
-              <w:rPr>
-                <w:color w:val="1f1f1f"/>
-                <w:rtl w:val="0"/>
-              </w:rPr>
-              <w:t xml:space="preserve">, chụp ảnh màn hình (Screenshot) khoảnh khắc room đạt +250 người cùng lúc.</w:t>
-            </w:r>
-          </w:p>
-          <w:p>
-            <w:pPr>
-              <w:pBdr>
-                <w:top w:color="auto" w:space="0" w:sz="0" w:val="none"/>
-                <w:bottom w:color="auto" w:space="0" w:sz="0" w:val="none"/>
-                <w:right w:color="auto" w:space="0" w:sz="0" w:val="none"/>
-                <w:between w:color="auto" w:space="0" w:sz="0" w:val="none"/>
-              </w:pBdr>
-              <w:spacing w:after="480" w:lineRule="auto"/>
-              <w:rPr>
-                <w:color w:val="1f1f1f"/>
-              </w:rPr>
-            </w:pPr>
-            <w:r>
-              <w:rPr>
-                <w:rtl w:val="0"/>
-              </w:rPr>
-            </w:r>
-          </w:p>
-          <w:p>
-            <w:pPr>
-              <w:pBdr>
-                <w:top w:color="auto" w:space="0" w:sz="0" w:val="none"/>
-                <w:left w:color="auto" w:space="0" w:sz="0" w:val="none"/>
-                <w:bottom w:color="auto" w:space="0" w:sz="0" w:val="none"/>
-                <w:right w:color="auto" w:space="0" w:sz="0" w:val="none"/>
-                <w:between w:color="auto" w:space="0" w:sz="0" w:val="none"/>
-              </w:pBdr>
-              <w:spacing w:after="480" w:lineRule="auto"/>
-              <w:rPr>
-                <w:color w:val="1f1f1f"/>
-              </w:rPr>
-            </w:pPr>
-            <w:r>
-              <w:rPr>
-                <w:b w:val="1"/>
-                <w:bCs w:val="1"/>
-                <w:color w:val="1f1f1f"/>
-                <w:rtl w:val="0"/>
-              </w:rPr>
-              <w:t xml:space="preserve">- Cuối WS:</w:t>
-            </w:r>
-            <w:r>
-              <w:rPr>
-                <w:color w:val="1f1f1f"/>
-                <w:rtl w:val="0"/>
-              </w:rPr>
-              <w:t xml:space="preserve"> Gửi </w:t>
-            </w:r>
-            <w:r>
-              <w:rPr>
-                <w:b w:val="1"/>
-                <w:bCs w:val="1"/>
-                <w:color w:val="1f1f1f"/>
-                <w:rtl w:val="0"/>
-              </w:rPr>
-              <w:t xml:space="preserve">Link Form Check-out vào ô Chat</w:t>
-            </w:r>
-            <w:r>
-              <w:rPr>
-                <w:color w:val="1f1f1f"/>
-                <w:rtl w:val="0"/>
-              </w:rPr>
-              <w:t xml:space="preserve"> -&gt; Kích hoạt luồng </w:t>
-            </w:r>
-            <w:r>
-              <w:rPr>
-                <w:b w:val="1"/>
-                <w:bCs w:val="1"/>
-                <w:color w:val="1f1f1f"/>
-                <w:rtl w:val="0"/>
-              </w:rPr>
-              <w:t xml:space="preserve">n8n tự động gửi email cảm ơn, kèm link slide và tặng quà tự động</w:t>
-            </w:r>
-            <w:r>
-              <w:rPr>
-                <w:color w:val="1f1f1f"/>
-                <w:rtl w:val="0"/>
-              </w:rPr>
-              <w:t xml:space="preserve"> ngay khi điền xong.</w:t>
-            </w:r>
-          </w:p>
-        </w:tc>
-        <w:tc>
-          <w:tcPr>
-            <w:tcBorders>
-              <w:top w:color="c4c7c5" w:space="0" w:sz="5" w:val="single"/>
-              <w:left w:color="c4c7c5" w:space="0" w:sz="5" w:val="single"/>
-              <w:bottom w:color="c4c7c5" w:space="0" w:sz="5" w:val="single"/>
-              <w:right w:color="c4c7c5" w:space="0" w:sz="5" w:val="single"/>
-            </w:tcBorders>
-            <w:tcMar>
-              <w:top w:w="120.0" w:type="dxa"/>
-              <w:left w:w="180.0" w:type="dxa"/>
-              <w:bottom w:w="120.0" w:type="dxa"/>
-              <w:right w:w="180.0" w:type="dxa"/>
-            </w:tcMar>
-            <w:vAlign w:val="top"/>
-          </w:tcPr>
-          <w:p>
-            <w:pPr>
-              <w:pBdr>
-                <w:top w:color="auto" w:space="0" w:sz="0" w:val="none"/>
-                <w:bottom w:color="auto" w:space="0" w:sz="0" w:val="none"/>
-                <w:right w:color="auto" w:space="0" w:sz="0" w:val="none"/>
-                <w:between w:color="auto" w:space="0" w:sz="0" w:val="none"/>
-              </w:pBdr>
-              <w:spacing w:after="480" w:lineRule="auto"/>
-              <w:rPr>
-                <w:color w:val="1f1f1f"/>
-              </w:rPr>
-            </w:pPr>
-            <w:r>
-              <w:rPr>
-                <w:color w:val="1f1f1f"/>
-                <w:rtl w:val="0"/>
-              </w:rPr>
-              <w:t xml:space="preserve">Thiết bị hội trường (Offline) / Room họp trực tuyến (Online), </w:t>
-            </w:r>
-            <w:r>
-              <w:rPr>
-                <w:b w:val="1"/>
-                <w:bCs w:val="1"/>
-                <w:color w:val="1f1f1f"/>
-                <w:rtl w:val="0"/>
-              </w:rPr>
-              <w:t xml:space="preserve">n8n</w:t>
-            </w:r>
-            <w:r>
-              <w:rPr>
-                <w:color w:val="1f1f1f"/>
-                <w:rtl w:val="0"/>
-              </w:rPr>
-              <w:t xml:space="preserve">, Gmail</w:t>
-            </w:r>
-          </w:p>
-        </w:tc>
-        <w:tc>
-          <w:tcPr>
-            <w:tcBorders>
-              <w:top w:color="c4c7c5" w:space="0" w:sz="5" w:val="single"/>
-              <w:left w:color="c4c7c5" w:space="0" w:sz="5" w:val="single"/>
-              <w:bottom w:color="c4c7c5" w:space="0" w:sz="5" w:val="single"/>
-              <w:right w:color="c4c7c5" w:space="0" w:sz="5" w:val="single"/>
-            </w:tcBorders>
-            <w:tcMar>
-              <w:top w:w="120.0" w:type="dxa"/>
-              <w:left w:w="180.0" w:type="dxa"/>
-              <w:bottom w:w="120.0" w:type="dxa"/>
-              <w:right w:w="180.0" w:type="dxa"/>
-            </w:tcMar>
-            <w:vAlign w:val="top"/>
-          </w:tcPr>
-          <w:p>
-            <w:pPr>
-              <w:pBdr>
-                <w:top w:color="auto" w:space="0" w:sz="0" w:val="none"/>
-                <w:bottom w:color="auto" w:space="0" w:sz="0" w:val="none"/>
-                <w:right w:color="auto" w:space="0" w:sz="0" w:val="none"/>
-                <w:between w:color="auto" w:space="0" w:sz="0" w:val="none"/>
-              </w:pBdr>
-              <w:spacing w:after="480" w:lineRule="auto"/>
-              <w:rPr>
-                <w:color w:val="1f1f1f"/>
-              </w:rPr>
-            </w:pPr>
-            <w:r>
-              <w:rPr>
-                <w:b w:val="1"/>
-                <w:bCs w:val="1"/>
-                <w:color w:val="1f1f1f"/>
-                <w:rtl w:val="0"/>
-              </w:rPr>
-              <w:t xml:space="preserve">Sự kiện diễn ra thành công mượt mà</w:t>
-            </w:r>
-            <w:r>
-              <w:rPr>
-                <w:color w:val="1f1f1f"/>
-                <w:rtl w:val="0"/>
-              </w:rPr>
-              <w:t xml:space="preserve">. Sinh viên nhận được trọn bộ tài liệu/quà tặng tự động qua hòm thư ngay khi vừa kết thúc.</w:t>
+            <w:r>
+              <w:t>NGÀY 6</w:t>
+            </w:r>
+          </w:p>
+        </w:tc>
+        <w:tc>
+          <w:tcPr>
+            <w:tcBorders>
+              <w:top w:color="c4c7c5" w:space="0" w:sz="5" w:val="single"/>
+              <w:left w:color="c4c7c5" w:space="0" w:sz="5" w:val="single"/>
+              <w:bottom w:color="c4c7c5" w:space="0" w:sz="5" w:val="single"/>
+              <w:right w:color="c4c7c5" w:space="0" w:sz="5" w:val="single"/>
+            </w:tcBorders>
+            <w:tcMar>
+              <w:top w:w="120.0" w:type="dxa"/>
+              <w:left w:w="180.0" w:type="dxa"/>
+              <w:bottom w:w="120.0" w:type="dxa"/>
+              <w:right w:w="180.0" w:type="dxa"/>
+            </w:tcMar>
+            <w:vAlign w:val="top"/>
+          </w:tcPr>
+          <w:p>
+            <w:r>
+              <w:t>Bước 6: Vận hành &amp; Diễn thuyết</w:t>
+            </w:r>
+          </w:p>
+        </w:tc>
+        <w:tc>
+          <w:tcPr>
+            <w:tcBorders>
+              <w:top w:color="c4c7c5" w:space="0" w:sz="5" w:val="single"/>
+              <w:left w:color="c4c7c5" w:space="0" w:sz="5" w:val="single"/>
+              <w:bottom w:color="c4c7c5" w:space="0" w:sz="5" w:val="single"/>
+              <w:right w:color="c4c7c5" w:space="0" w:sz="5" w:val="single"/>
+            </w:tcBorders>
+            <w:tcMar>
+              <w:top w:w="120.0" w:type="dxa"/>
+              <w:left w:w="180.0" w:type="dxa"/>
+              <w:bottom w:w="120.0" w:type="dxa"/>
+              <w:right w:w="180.0" w:type="dxa"/>
+            </w:tcMar>
+            <w:vAlign w:val="top"/>
+          </w:tcPr>
+          <w:p>
+            <w:r>
+              <w:t>- Có mặt trước 2 tiếng setup âm thanh, máy chiếu, micro (Sound-check).</w:t>
+              <w:br/>
+              <w:t>- Đội media quay chụp, bắt khoảnh khắc hội trường bùng nổ +250 người.</w:t>
+              <w:br/>
+              <w:t>- Chụp ảnh toàn cảnh khoảnh khắc "giơ điện thoại Gemini" đặc sắc để làm tư liệu truyền thông nghiệm thu và gối đầu cho trường tiếp theo.</w:t>
+            </w:r>
+          </w:p>
+        </w:tc>
+        <w:tc>
+          <w:tcPr>
+            <w:tcBorders>
+              <w:top w:color="c4c7c5" w:space="0" w:sz="5" w:val="single"/>
+              <w:left w:color="c4c7c5" w:space="0" w:sz="5" w:val="single"/>
+              <w:bottom w:color="c4c7c5" w:space="0" w:sz="5" w:val="single"/>
+              <w:right w:color="c4c7c5" w:space="0" w:sz="5" w:val="single"/>
+            </w:tcBorders>
+            <w:tcMar>
+              <w:top w:w="120.0" w:type="dxa"/>
+              <w:left w:w="180.0" w:type="dxa"/>
+              <w:bottom w:w="120.0" w:type="dxa"/>
+              <w:right w:w="180.0" w:type="dxa"/>
+            </w:tcMar>
+            <w:vAlign w:val="top"/>
+          </w:tcPr>
+          <w:p>
+            <w:r>
+              <w:t>- Trước WS 1 tiếng: Mở phòng họp trực tuyến, setup quyền Host/Co-host, kiểm tra thiết bị mic/loa/chia sẻ màn hình, bật nhạc nền chờ sinh viên.</w:t>
+              <w:br/>
+              <w:t>- Trong WS: Bật tính năng Record cuộc họp, chụp ảnh màn hình (Screenshot) khoảnh khắc room đạt +250 người cùng lúc.</w:t>
+            </w:r>
+          </w:p>
+        </w:tc>
+        <w:tc>
+          <w:tcPr>
+            <w:tcBorders>
+              <w:top w:color="c4c7c5" w:space="0" w:sz="5" w:val="single"/>
+              <w:left w:color="c4c7c5" w:space="0" w:sz="5" w:val="single"/>
+              <w:bottom w:color="c4c7c5" w:space="0" w:sz="5" w:val="single"/>
+              <w:right w:color="c4c7c5" w:space="0" w:sz="5" w:val="single"/>
+            </w:tcBorders>
+            <w:tcMar>
+              <w:top w:w="120.0" w:type="dxa"/>
+              <w:left w:w="180.0" w:type="dxa"/>
+              <w:bottom w:w="120.0" w:type="dxa"/>
+              <w:right w:w="180.0" w:type="dxa"/>
+            </w:tcMar>
+            <w:vAlign w:val="top"/>
+          </w:tcPr>
+          <w:p>
+            <w:r>
+              <w:t>Thiết bị hội trường (Offline) / Room họp trực tuyến (Online), Meet/Zoom, Máy ảnh / Điện thoại</w:t>
+            </w:r>
+          </w:p>
+        </w:tc>
+        <w:tc>
+          <w:tcPr>
+            <w:tcBorders>
+              <w:top w:color="c4c7c5" w:space="0" w:sz="5" w:val="single"/>
+              <w:left w:color="c4c7c5" w:space="0" w:sz="5" w:val="single"/>
+              <w:bottom w:color="c4c7c5" w:space="0" w:sz="5" w:val="single"/>
+              <w:right w:color="c4c7c5" w:space="0" w:sz="5" w:val="single"/>
+            </w:tcBorders>
+            <w:tcMar>
+              <w:top w:w="120.0" w:type="dxa"/>
+              <w:left w:w="180.0" w:type="dxa"/>
+              <w:bottom w:w="120.0" w:type="dxa"/>
+              <w:right w:w="180.0" w:type="dxa"/>
+            </w:tcMar>
+            <w:vAlign w:val="top"/>
+          </w:tcPr>
+          <w:p>
+            <w:r>
+              <w:t>Sự kiện diễn ra thành công mượt mà. Quay chụp đầy đủ hình ảnh/video bùng nổ sinh viên ứng dụng Gemini thực tế.</w:t>
             </w:r>
           </w:p>
         </w:tc>
@@ -3639,547 +1361,398 @@
             <w:vAlign w:val="top"/>
           </w:tcPr>
           <w:p>
-            <w:pPr>
-              <w:pBdr>
-                <w:top w:color="auto" w:space="0" w:sz="0" w:val="none"/>
-                <w:bottom w:color="auto" w:space="0" w:sz="0" w:val="none"/>
-                <w:right w:color="auto" w:space="0" w:sz="0" w:val="none"/>
-                <w:between w:color="auto" w:space="0" w:sz="0" w:val="none"/>
-              </w:pBdr>
-              <w:spacing w:after="480" w:lineRule="auto"/>
-              <w:rPr>
-                <w:color w:val="1f1f1f"/>
-              </w:rPr>
-            </w:pPr>
-            <w:r>
-              <w:rPr>
-                <w:b w:val="1"/>
-                <w:bCs w:val="1"/>
-                <w:color w:val="1f1f1f"/>
-                <w:rtl w:val="0"/>
-              </w:rPr>
-              <w:t xml:space="preserve">NGÀY 7</w:t>
-            </w:r>
-            <w:r>
-              <w:rPr>
-                <w:rtl w:val="0"/>
-              </w:rPr>
-            </w:r>
-          </w:p>
-        </w:tc>
-        <w:tc>
-          <w:tcPr>
-            <w:tcBorders>
-              <w:top w:color="c4c7c5" w:space="0" w:sz="5" w:val="single"/>
-              <w:left w:color="c4c7c5" w:space="0" w:sz="5" w:val="single"/>
-              <w:bottom w:color="c4c7c5" w:space="0" w:sz="5" w:val="single"/>
-              <w:right w:color="c4c7c5" w:space="0" w:sz="5" w:val="single"/>
-            </w:tcBorders>
-            <w:tcMar>
-              <w:top w:w="120.0" w:type="dxa"/>
-              <w:left w:w="180.0" w:type="dxa"/>
-              <w:bottom w:w="120.0" w:type="dxa"/>
-              <w:right w:w="180.0" w:type="dxa"/>
-            </w:tcMar>
-            <w:vAlign w:val="top"/>
-          </w:tcPr>
-          <w:p>
-            <w:pPr>
-              <w:pBdr>
-                <w:top w:color="auto" w:space="0" w:sz="0" w:val="none"/>
-                <w:bottom w:color="auto" w:space="0" w:sz="0" w:val="none"/>
-                <w:right w:color="auto" w:space="0" w:sz="0" w:val="none"/>
-                <w:between w:color="auto" w:space="0" w:sz="0" w:val="none"/>
-              </w:pBdr>
-              <w:spacing w:after="480" w:lineRule="auto"/>
-              <w:rPr>
-                <w:color w:val="1f1f1f"/>
-              </w:rPr>
-            </w:pPr>
-            <w:r>
-              <w:rPr>
-                <w:b w:val="1"/>
-                <w:bCs w:val="1"/>
-                <w:color w:val="1f1f1f"/>
-                <w:rtl w:val="0"/>
-              </w:rPr>
-              <w:t xml:space="preserve">Bước 8 &amp; 9: Hậu kỳ, Báo cáo &amp; Tìm trường mới</w:t>
-            </w:r>
-            <w:r>
-              <w:rPr>
-                <w:rtl w:val="0"/>
-              </w:rPr>
-            </w:r>
-          </w:p>
-        </w:tc>
-        <w:tc>
-          <w:tcPr>
-            <w:tcBorders>
-              <w:top w:color="c4c7c5" w:space="0" w:sz="5" w:val="single"/>
-              <w:left w:color="c4c7c5" w:space="0" w:sz="5" w:val="single"/>
-              <w:bottom w:color="c4c7c5" w:space="0" w:sz="5" w:val="single"/>
-              <w:right w:color="c4c7c5" w:space="0" w:sz="5" w:val="single"/>
-            </w:tcBorders>
-            <w:tcMar>
-              <w:top w:w="120.0" w:type="dxa"/>
-              <w:left w:w="180.0" w:type="dxa"/>
-              <w:bottom w:w="120.0" w:type="dxa"/>
-              <w:right w:w="180.0" w:type="dxa"/>
-            </w:tcMar>
-            <w:vAlign w:val="top"/>
-          </w:tcPr>
-          <w:p>
-            <w:pPr>
-              <w:pBdr>
-                <w:top w:color="auto" w:space="0" w:sz="0" w:val="none"/>
-                <w:left w:color="auto" w:space="0" w:sz="0" w:val="none"/>
-                <w:bottom w:color="auto" w:space="0" w:sz="0" w:val="none"/>
-                <w:right w:color="auto" w:space="0" w:sz="0" w:val="none"/>
-                <w:between w:color="auto" w:space="0" w:sz="0" w:val="none"/>
-              </w:pBdr>
-              <w:spacing w:after="480" w:lineRule="auto"/>
-              <w:rPr>
-                <w:color w:val="1f1f1f"/>
-              </w:rPr>
-            </w:pPr>
-            <w:r>
-              <w:rPr>
-                <w:color w:val="1f1f1f"/>
-                <w:rtl w:val="0"/>
-              </w:rPr>
-              <w:t xml:space="preserve">- Tiến hành </w:t>
-            </w:r>
-            <w:r>
-              <w:rPr>
-                <w:b w:val="1"/>
-                <w:bCs w:val="1"/>
-                <w:color w:val="1f1f1f"/>
-                <w:rtl w:val="0"/>
-              </w:rPr>
-              <w:t xml:space="preserve">edit hình ảnh thực tế &amp; dựng video WS</w:t>
-            </w:r>
-            <w:r>
-              <w:rPr>
-                <w:color w:val="1f1f1f"/>
-                <w:rtl w:val="0"/>
-              </w:rPr>
-              <w:t xml:space="preserve"> (dạng recap ngắn, highlight khoảnh khắc đám đông bùng nổ) để đăng lên Fanpage, TikTok nghiệm thu.</w:t>
-            </w:r>
-          </w:p>
-          <w:p>
-            <w:pPr>
-              <w:pBdr>
-                <w:top w:color="auto" w:space="0" w:sz="0" w:val="none"/>
-                <w:bottom w:color="auto" w:space="0" w:sz="0" w:val="none"/>
-                <w:right w:color="auto" w:space="0" w:sz="0" w:val="none"/>
-                <w:between w:color="auto" w:space="0" w:sz="0" w:val="none"/>
-              </w:pBdr>
-              <w:spacing w:after="480" w:lineRule="auto"/>
-              <w:rPr>
-                <w:color w:val="1f1f1f"/>
-              </w:rPr>
-            </w:pPr>
-            <w:r>
-              <w:rPr>
-                <w:rtl w:val="0"/>
-              </w:rPr>
-            </w:r>
-          </w:p>
-          <w:p>
-            <w:pPr>
-              <w:pBdr>
-                <w:top w:color="auto" w:space="0" w:sz="0" w:val="none"/>
-                <w:left w:color="auto" w:space="0" w:sz="0" w:val="none"/>
-                <w:bottom w:color="auto" w:space="0" w:sz="0" w:val="none"/>
-                <w:right w:color="auto" w:space="0" w:sz="0" w:val="none"/>
-                <w:between w:color="auto" w:space="0" w:sz="0" w:val="none"/>
-              </w:pBdr>
-              <w:spacing w:after="480" w:lineRule="auto"/>
-              <w:rPr>
-                <w:color w:val="1f1f1f"/>
-              </w:rPr>
-            </w:pPr>
-            <w:r>
-              <w:rPr>
-                <w:color w:val="1f1f1f"/>
-                <w:rtl w:val="0"/>
-              </w:rPr>
-              <w:t xml:space="preserve">- </w:t>
-            </w:r>
-            <w:r>
-              <w:rPr>
-                <w:b w:val="1"/>
-                <w:bCs w:val="1"/>
-                <w:color w:val="1f1f1f"/>
-                <w:rtl w:val="0"/>
-              </w:rPr>
-              <w:t xml:space="preserve">Điền form báo cáo Workshop cho Google (Cá nhân)</w:t>
-            </w:r>
-            <w:r>
-              <w:rPr>
-                <w:color w:val="1f1f1f"/>
-                <w:rtl w:val="0"/>
-              </w:rPr>
-              <w:t xml:space="preserve"> để ghi nhận KPI Đại sứ.</w:t>
-            </w:r>
-          </w:p>
-          <w:p>
-            <w:pPr>
-              <w:pBdr>
-                <w:top w:color="auto" w:space="0" w:sz="0" w:val="none"/>
-                <w:bottom w:color="auto" w:space="0" w:sz="0" w:val="none"/>
-                <w:right w:color="auto" w:space="0" w:sz="0" w:val="none"/>
-                <w:between w:color="auto" w:space="0" w:sz="0" w:val="none"/>
-              </w:pBdr>
-              <w:spacing w:after="480" w:lineRule="auto"/>
-              <w:rPr>
-                <w:color w:val="1f1f1f"/>
-              </w:rPr>
-            </w:pPr>
-            <w:r>
-              <w:rPr>
-                <w:rtl w:val="0"/>
-              </w:rPr>
-            </w:r>
-          </w:p>
-          <w:p>
-            <w:pPr>
-              <w:pBdr>
-                <w:top w:color="auto" w:space="0" w:sz="0" w:val="none"/>
-                <w:left w:color="auto" w:space="0" w:sz="0" w:val="none"/>
-                <w:bottom w:color="auto" w:space="0" w:sz="0" w:val="none"/>
-                <w:right w:color="auto" w:space="0" w:sz="0" w:val="none"/>
-                <w:between w:color="auto" w:space="0" w:sz="0" w:val="none"/>
-              </w:pBdr>
-              <w:spacing w:after="480" w:lineRule="auto"/>
-              <w:rPr>
-                <w:color w:val="1f1f1f"/>
-              </w:rPr>
-            </w:pPr>
-            <w:r>
-              <w:rPr>
-                <w:color w:val="1f1f1f"/>
-                <w:rtl w:val="0"/>
-              </w:rPr>
-              <w:t xml:space="preserve">- </w:t>
-            </w:r>
-            <w:r>
-              <w:rPr>
-                <w:b w:val="1"/>
-                <w:bCs w:val="1"/>
-                <w:color w:val="1f1f1f"/>
-                <w:rtl w:val="0"/>
-              </w:rPr>
-              <w:t xml:space="preserve">Tìm trường khác</w:t>
-            </w:r>
-            <w:r>
-              <w:rPr>
-                <w:color w:val="1f1f1f"/>
-                <w:rtl w:val="0"/>
-              </w:rPr>
-              <w:t xml:space="preserve"> (Quay lại </w:t>
-            </w:r>
-            <w:r>
-              <w:rPr>
-                <w:b w:val="1"/>
-                <w:bCs w:val="1"/>
-                <w:color w:val="1f1f1f"/>
-                <w:rtl w:val="0"/>
-              </w:rPr>
-              <w:t xml:space="preserve">Bước 1</w:t>
-            </w:r>
-            <w:r>
-              <w:rPr>
-                <w:color w:val="1f1f1f"/>
-                <w:rtl w:val="0"/>
-              </w:rPr>
-              <w:t xml:space="preserve"> để lấy data trường mới, dùng chính video recap vừa làm làm vũ khí tiếp cận để bắt đầu chu kỳ 1 tuần tiếp theo).</w:t>
-            </w:r>
-          </w:p>
-        </w:tc>
-        <w:tc>
-          <w:tcPr>
-            <w:tcBorders>
-              <w:top w:color="c4c7c5" w:space="0" w:sz="5" w:val="single"/>
-              <w:left w:color="c4c7c5" w:space="0" w:sz="5" w:val="single"/>
-              <w:bottom w:color="c4c7c5" w:space="0" w:sz="5" w:val="single"/>
-              <w:right w:color="c4c7c5" w:space="0" w:sz="5" w:val="single"/>
-            </w:tcBorders>
-            <w:tcMar>
-              <w:top w:w="120.0" w:type="dxa"/>
-              <w:left w:w="180.0" w:type="dxa"/>
-              <w:bottom w:w="120.0" w:type="dxa"/>
-              <w:right w:w="180.0" w:type="dxa"/>
-            </w:tcMar>
-            <w:vAlign w:val="top"/>
-          </w:tcPr>
-          <w:p>
-            <w:pPr>
-              <w:pBdr>
-                <w:top w:color="auto" w:space="0" w:sz="0" w:val="none"/>
-                <w:left w:color="auto" w:space="0" w:sz="0" w:val="none"/>
-                <w:bottom w:color="auto" w:space="0" w:sz="0" w:val="none"/>
-                <w:right w:color="auto" w:space="0" w:sz="0" w:val="none"/>
-                <w:between w:color="auto" w:space="0" w:sz="0" w:val="none"/>
-              </w:pBdr>
-              <w:spacing w:after="480" w:lineRule="auto"/>
-              <w:rPr>
-                <w:color w:val="1f1f1f"/>
-              </w:rPr>
-            </w:pPr>
-            <w:r>
-              <w:rPr>
-                <w:color w:val="1f1f1f"/>
-                <w:rtl w:val="0"/>
-              </w:rPr>
-              <w:t xml:space="preserve">- Tiến hành </w:t>
-            </w:r>
-            <w:r>
-              <w:rPr>
-                <w:b w:val="1"/>
-                <w:bCs w:val="1"/>
-                <w:color w:val="1f1f1f"/>
-                <w:rtl w:val="0"/>
-              </w:rPr>
-              <w:t xml:space="preserve">edit video record màn hình &amp; phối ảnh screenshot</w:t>
-            </w:r>
-            <w:r>
-              <w:rPr>
-                <w:color w:val="1f1f1f"/>
-                <w:rtl w:val="0"/>
-              </w:rPr>
-              <w:t xml:space="preserve"> thành video recap ngắn, lồng nhạc bắt trend để đăng lên Fanpage, TikTok nghiệm thu.</w:t>
-            </w:r>
-          </w:p>
-          <w:p>
-            <w:pPr>
-              <w:pBdr>
-                <w:top w:color="auto" w:space="0" w:sz="0" w:val="none"/>
-                <w:bottom w:color="auto" w:space="0" w:sz="0" w:val="none"/>
-                <w:right w:color="auto" w:space="0" w:sz="0" w:val="none"/>
-                <w:between w:color="auto" w:space="0" w:sz="0" w:val="none"/>
-              </w:pBdr>
-              <w:spacing w:after="480" w:lineRule="auto"/>
-              <w:rPr>
-                <w:color w:val="1f1f1f"/>
-              </w:rPr>
-            </w:pPr>
-            <w:r>
-              <w:rPr>
-                <w:rtl w:val="0"/>
-              </w:rPr>
-            </w:r>
-          </w:p>
-          <w:p>
-            <w:pPr>
-              <w:pBdr>
-                <w:top w:color="auto" w:space="0" w:sz="0" w:val="none"/>
-                <w:left w:color="auto" w:space="0" w:sz="0" w:val="none"/>
-                <w:bottom w:color="auto" w:space="0" w:sz="0" w:val="none"/>
-                <w:right w:color="auto" w:space="0" w:sz="0" w:val="none"/>
-                <w:between w:color="auto" w:space="0" w:sz="0" w:val="none"/>
-              </w:pBdr>
-              <w:spacing w:after="480" w:lineRule="auto"/>
-              <w:rPr>
-                <w:color w:val="1f1f1f"/>
-              </w:rPr>
-            </w:pPr>
-            <w:r>
-              <w:rPr>
-                <w:color w:val="1f1f1f"/>
-                <w:rtl w:val="0"/>
-              </w:rPr>
-              <w:t xml:space="preserve">- </w:t>
-            </w:r>
-            <w:r>
-              <w:rPr>
-                <w:b w:val="1"/>
-                <w:bCs w:val="1"/>
-                <w:color w:val="1f1f1f"/>
-                <w:rtl w:val="0"/>
-              </w:rPr>
-              <w:t xml:space="preserve">Điền form báo cáo Workshop cho Google (Cá nhân)</w:t>
-            </w:r>
-            <w:r>
-              <w:rPr>
-                <w:color w:val="1f1f1f"/>
-                <w:rtl w:val="0"/>
-              </w:rPr>
-              <w:t xml:space="preserve"> để ghi nhận KPI Đại sứ.</w:t>
-            </w:r>
-          </w:p>
-          <w:p>
-            <w:pPr>
-              <w:pBdr>
-                <w:top w:color="auto" w:space="0" w:sz="0" w:val="none"/>
-                <w:bottom w:color="auto" w:space="0" w:sz="0" w:val="none"/>
-                <w:right w:color="auto" w:space="0" w:sz="0" w:val="none"/>
-                <w:between w:color="auto" w:space="0" w:sz="0" w:val="none"/>
-              </w:pBdr>
-              <w:spacing w:after="480" w:lineRule="auto"/>
-              <w:rPr>
-                <w:color w:val="1f1f1f"/>
-              </w:rPr>
-            </w:pPr>
-            <w:r>
-              <w:rPr>
-                <w:rtl w:val="0"/>
-              </w:rPr>
-            </w:r>
-          </w:p>
-          <w:p>
-            <w:pPr>
-              <w:pBdr>
-                <w:top w:color="auto" w:space="0" w:sz="0" w:val="none"/>
-                <w:left w:color="auto" w:space="0" w:sz="0" w:val="none"/>
-                <w:bottom w:color="auto" w:space="0" w:sz="0" w:val="none"/>
-                <w:right w:color="auto" w:space="0" w:sz="0" w:val="none"/>
-                <w:between w:color="auto" w:space="0" w:sz="0" w:val="none"/>
-              </w:pBdr>
-              <w:spacing w:after="480" w:lineRule="auto"/>
-              <w:rPr>
-                <w:color w:val="1f1f1f"/>
-              </w:rPr>
-            </w:pPr>
-            <w:r>
-              <w:rPr>
-                <w:color w:val="1f1f1f"/>
-                <w:rtl w:val="0"/>
-              </w:rPr>
-              <w:t xml:space="preserve">- </w:t>
-            </w:r>
-            <w:r>
-              <w:rPr>
-                <w:b w:val="1"/>
-                <w:bCs w:val="1"/>
-                <w:color w:val="1f1f1f"/>
-                <w:rtl w:val="0"/>
-              </w:rPr>
-              <w:t xml:space="preserve">Tìm trường khác</w:t>
-            </w:r>
-            <w:r>
-              <w:rPr>
-                <w:color w:val="1f1f1f"/>
-                <w:rtl w:val="0"/>
-              </w:rPr>
-              <w:t xml:space="preserve"> (Quay lại </w:t>
-            </w:r>
-            <w:r>
-              <w:rPr>
-                <w:b w:val="1"/>
-                <w:bCs w:val="1"/>
-                <w:color w:val="1f1f1f"/>
-                <w:rtl w:val="0"/>
-              </w:rPr>
-              <w:t xml:space="preserve">Bước 1</w:t>
-            </w:r>
-            <w:r>
-              <w:rPr>
-                <w:color w:val="1f1f1f"/>
-                <w:rtl w:val="0"/>
-              </w:rPr>
-              <w:t xml:space="preserve"> để lấy data trường mới, dùng chính video recap vừa làm làm vũ khí tiếp cận để bắt đầu chu kỳ 1 tuần tiếp theo).</w:t>
-            </w:r>
-          </w:p>
-        </w:tc>
-        <w:tc>
-          <w:tcPr>
-            <w:tcBorders>
-              <w:top w:color="c4c7c5" w:space="0" w:sz="5" w:val="single"/>
-              <w:left w:color="c4c7c5" w:space="0" w:sz="5" w:val="single"/>
-              <w:bottom w:color="c4c7c5" w:space="0" w:sz="5" w:val="single"/>
-              <w:right w:color="c4c7c5" w:space="0" w:sz="5" w:val="single"/>
-            </w:tcBorders>
-            <w:tcMar>
-              <w:top w:w="120.0" w:type="dxa"/>
-              <w:left w:w="180.0" w:type="dxa"/>
-              <w:bottom w:w="120.0" w:type="dxa"/>
-              <w:right w:w="180.0" w:type="dxa"/>
-            </w:tcMar>
-            <w:vAlign w:val="top"/>
-          </w:tcPr>
-          <w:p>
-            <w:pPr>
-              <w:pBdr>
-                <w:top w:color="auto" w:space="0" w:sz="0" w:val="none"/>
-                <w:bottom w:color="auto" w:space="0" w:sz="0" w:val="none"/>
-                <w:right w:color="auto" w:space="0" w:sz="0" w:val="none"/>
-                <w:between w:color="auto" w:space="0" w:sz="0" w:val="none"/>
-              </w:pBdr>
-              <w:spacing w:after="480" w:lineRule="auto"/>
-              <w:rPr>
-                <w:color w:val="1f1f1f"/>
-              </w:rPr>
-            </w:pPr>
-            <w:r>
-              <w:rPr>
-                <w:color w:val="1f1f1f"/>
-                <w:rtl w:val="0"/>
-              </w:rPr>
-              <w:t xml:space="preserve">CapCut, Lightroom, Google Form hệ thống (Internal)</w:t>
-            </w:r>
-          </w:p>
-        </w:tc>
-        <w:tc>
-          <w:tcPr>
-            <w:tcBorders>
-              <w:top w:color="c4c7c5" w:space="0" w:sz="5" w:val="single"/>
-              <w:left w:color="c4c7c5" w:space="0" w:sz="5" w:val="single"/>
-              <w:bottom w:color="c4c7c5" w:space="0" w:sz="5" w:val="single"/>
-              <w:right w:color="c4c7c5" w:space="0" w:sz="5" w:val="single"/>
-            </w:tcBorders>
-            <w:tcMar>
-              <w:top w:w="120.0" w:type="dxa"/>
-              <w:left w:w="180.0" w:type="dxa"/>
-              <w:bottom w:w="120.0" w:type="dxa"/>
-              <w:right w:w="180.0" w:type="dxa"/>
-            </w:tcMar>
-            <w:vAlign w:val="top"/>
-          </w:tcPr>
-          <w:p>
-            <w:pPr>
-              <w:pBdr>
-                <w:top w:color="auto" w:space="0" w:sz="0" w:val="none"/>
-                <w:bottom w:color="auto" w:space="0" w:sz="0" w:val="none"/>
-                <w:right w:color="auto" w:space="0" w:sz="0" w:val="none"/>
-                <w:between w:color="auto" w:space="0" w:sz="0" w:val="none"/>
-              </w:pBdr>
-              <w:spacing w:after="480" w:lineRule="auto"/>
-              <w:rPr>
-                <w:color w:val="1f1f1f"/>
-              </w:rPr>
-            </w:pPr>
-            <w:r>
-              <w:rPr>
-                <w:b w:val="1"/>
-                <w:bCs w:val="1"/>
-                <w:color w:val="1f1f1f"/>
-                <w:rtl w:val="0"/>
-              </w:rPr>
-              <w:t xml:space="preserve">Hoàn thành nghiệm thu truyền thông</w:t>
-            </w:r>
-            <w:r>
-              <w:rPr>
-                <w:color w:val="1f1f1f"/>
-                <w:rtl w:val="0"/>
-              </w:rPr>
-              <w:t xml:space="preserve"> trên các kênh cá nhân và gửi báo cáo cho Google đúng hạn; </w:t>
-            </w:r>
-            <w:r>
-              <w:rPr>
-                <w:b w:val="1"/>
-                <w:bCs w:val="1"/>
-                <w:color w:val="1f1f1f"/>
-                <w:rtl w:val="0"/>
-              </w:rPr>
-              <w:t xml:space="preserve">kích hoạt thành công chu kỳ trường tiếp theo</w:t>
-            </w:r>
-            <w:r>
-              <w:rPr>
-                <w:color w:val="1f1f1f"/>
-                <w:rtl w:val="0"/>
-              </w:rPr>
-              <w:t xml:space="preserve">.</w:t>
+            <w:r>
+              <w:t>NGÀY 6</w:t>
+            </w:r>
+          </w:p>
+        </w:tc>
+        <w:tc>
+          <w:tcPr>
+            <w:tcBorders>
+              <w:top w:color="c4c7c5" w:space="0" w:sz="5" w:val="single"/>
+              <w:left w:color="c4c7c5" w:space="0" w:sz="5" w:val="single"/>
+              <w:bottom w:color="c4c7c5" w:space="0" w:sz="5" w:val="single"/>
+              <w:right w:color="c4c7c5" w:space="0" w:sz="5" w:val="single"/>
+            </w:tcBorders>
+            <w:tcMar>
+              <w:top w:w="120.0" w:type="dxa"/>
+              <w:left w:w="180.0" w:type="dxa"/>
+              <w:bottom w:w="120.0" w:type="dxa"/>
+              <w:right w:w="180.0" w:type="dxa"/>
+            </w:tcMar>
+            <w:vAlign w:val="top"/>
+          </w:tcPr>
+          <w:p>
+            <w:r>
+              <w:t>Bước 7: Automation Check-out &amp; Tặng quà</w:t>
+            </w:r>
+          </w:p>
+        </w:tc>
+        <w:tc>
+          <w:tcPr>
+            <w:tcBorders>
+              <w:top w:color="c4c7c5" w:space="0" w:sz="5" w:val="single"/>
+              <w:left w:color="c4c7c5" w:space="0" w:sz="5" w:val="single"/>
+              <w:bottom w:color="c4c7c5" w:space="0" w:sz="5" w:val="single"/>
+              <w:right w:color="c4c7c5" w:space="0" w:sz="5" w:val="single"/>
+            </w:tcBorders>
+            <w:tcMar>
+              <w:top w:w="120.0" w:type="dxa"/>
+              <w:left w:w="180.0" w:type="dxa"/>
+              <w:bottom w:w="120.0" w:type="dxa"/>
+              <w:right w:w="180.0" w:type="dxa"/>
+            </w:tcMar>
+            <w:vAlign w:val="top"/>
+          </w:tcPr>
+          <w:p>
+            <w:r>
+              <w:t>- Cuối WS: Chiếu slide QR Code Form Check-out (Khảo sát) (https://docs.google.com/forms/d/e/1FAIpQLSfwTIQ7nSaCdEnnOsQ0W9YzSkmP0cehLXuau2AXOVj0D5loxQ/viewform) để sinh viên điền khảo sát.</w:t>
+              <w:br/>
+              <w:t>- Kiểm tra tiến độ hàng chờ n8n để email Check-out &amp; Quà tặng tự động gửi đi vào lúc 23h55 cùng ngày.</w:t>
+            </w:r>
+          </w:p>
+        </w:tc>
+        <w:tc>
+          <w:tcPr>
+            <w:tcBorders>
+              <w:top w:color="c4c7c5" w:space="0" w:sz="5" w:val="single"/>
+              <w:left w:color="c4c7c5" w:space="0" w:sz="5" w:val="single"/>
+              <w:bottom w:color="c4c7c5" w:space="0" w:sz="5" w:val="single"/>
+              <w:right w:color="c4c7c5" w:space="0" w:sz="5" w:val="single"/>
+            </w:tcBorders>
+            <w:tcMar>
+              <w:top w:w="120.0" w:type="dxa"/>
+              <w:left w:w="180.0" w:type="dxa"/>
+              <w:bottom w:w="120.0" w:type="dxa"/>
+              <w:right w:w="180.0" w:type="dxa"/>
+            </w:tcMar>
+            <w:vAlign w:val="top"/>
+          </w:tcPr>
+          <w:p>
+            <w:r>
+              <w:t>- Cuối WS: Gửi Link Form Check-out vào ô Chat để sinh viên điền khảo sát.</w:t>
+              <w:br/>
+              <w:t>- Kiểm tra tương tự phương án Offline.</w:t>
+            </w:r>
+          </w:p>
+        </w:tc>
+        <w:tc>
+          <w:tcPr>
+            <w:tcBorders>
+              <w:top w:color="c4c7c5" w:space="0" w:sz="5" w:val="single"/>
+              <w:left w:color="c4c7c5" w:space="0" w:sz="5" w:val="single"/>
+              <w:bottom w:color="c4c7c5" w:space="0" w:sz="5" w:val="single"/>
+              <w:right w:color="c4c7c5" w:space="0" w:sz="5" w:val="single"/>
+            </w:tcBorders>
+            <w:tcMar>
+              <w:top w:w="120.0" w:type="dxa"/>
+              <w:left w:w="180.0" w:type="dxa"/>
+              <w:bottom w:w="120.0" w:type="dxa"/>
+              <w:right w:w="180.0" w:type="dxa"/>
+            </w:tcMar>
+            <w:vAlign w:val="top"/>
+          </w:tcPr>
+          <w:p>
+            <w:r>
+              <w:t>n8n, Gmail, Google Forms</w:t>
+            </w:r>
+          </w:p>
+        </w:tc>
+        <w:tc>
+          <w:tcPr>
+            <w:tcBorders>
+              <w:top w:color="c4c7c5" w:space="0" w:sz="5" w:val="single"/>
+              <w:left w:color="c4c7c5" w:space="0" w:sz="5" w:val="single"/>
+              <w:bottom w:color="c4c7c5" w:space="0" w:sz="5" w:val="single"/>
+              <w:right w:color="c4c7c5" w:space="0" w:sz="5" w:val="single"/>
+            </w:tcBorders>
+            <w:tcMar>
+              <w:top w:w="120.0" w:type="dxa"/>
+              <w:left w:w="180.0" w:type="dxa"/>
+              <w:bottom w:w="120.0" w:type="dxa"/>
+              <w:right w:w="180.0" w:type="dxa"/>
+            </w:tcMar>
+            <w:vAlign w:val="top"/>
+          </w:tcPr>
+          <w:p>
+            <w:r>
+              <w:t>Sinh viên điền khảo sát thành công và nhận được trọn bộ tài liệu/quà tặng tự động gửi vào hòm thư lúc 23h55.</w:t>
+            </w:r>
+          </w:p>
+        </w:tc>
+      </w:tr>
+      <w:tr>
+        <w:tc>
+          <w:tcPr>
+            <w:tcW w:type="dxa" w:w="1245"/>
+          </w:tcPr>
+          <w:p>
+            <w:r>
+              <w:t>NGÀY 7</w:t>
+            </w:r>
+          </w:p>
+        </w:tc>
+        <w:tc>
+          <w:tcPr>
+            <w:tcW w:type="dxa" w:w="1935"/>
+          </w:tcPr>
+          <w:p>
+            <w:r>
+              <w:t>Bước 8: Hậu kỳ &amp; Truyền thông Nghiệm thu</w:t>
+            </w:r>
+          </w:p>
+        </w:tc>
+        <w:tc>
+          <w:tcPr>
+            <w:tcW w:type="dxa" w:w="1935"/>
+          </w:tcPr>
+          <w:p>
+            <w:r>
+              <w:t>- Upload source hình ảnh/video gốc lên folder "Source Media (Gốc trong Google Drive)" - thông qua link URL (Cung cấp sau bằng việc edit to-do).</w:t>
+              <w:br/>
+              <w:t>- Edit hình ảnh thực tế (Lightroom) và dựng video Recap ngắn (CapCut).</w:t>
+              <w:br/>
+              <w:t>- Upload các hình/video đã edit vào trong folder "Source Media (Đã Edit)".</w:t>
+              <w:br/>
+              <w:t>- Đăng bài nghiệm thu truyền thông trên Fanpage &amp; TikTok.</w:t>
+            </w:r>
+          </w:p>
+        </w:tc>
+        <w:tc>
+          <w:tcPr>
+            <w:tcW w:type="dxa" w:w="2010"/>
+          </w:tcPr>
+          <w:p>
+            <w:r>
+              <w:t>- Tiến hành edit video record màn hình &amp; phối ảnh screenshot thành video recap ngắn, lồng nhạc bắt trend để đăng lên Fanpage, TikTok nghiệm thu.</w:t>
+              <w:br/>
+              <w:t>- Các bước upload và quản lý file giống như phương án Offline.</w:t>
+            </w:r>
+          </w:p>
+        </w:tc>
+        <w:tc>
+          <w:tcPr>
+            <w:tcW w:type="dxa" w:w="1545"/>
+          </w:tcPr>
+          <w:p>
+            <w:r>
+              <w:t>CapCut, Lightroom, Google Drive, Fanpage, TikTok</w:t>
+            </w:r>
+          </w:p>
+        </w:tc>
+        <w:tc>
+          <w:tcPr>
+            <w:tcW w:type="dxa" w:w="2055"/>
+          </w:tcPr>
+          <w:p>
+            <w:r>
+              <w:t>Hoàn thành bài đăng recap nghiệm thu truyền thông trên các kênh cá nhân thu hút tương tác tốt.</w:t>
+            </w:r>
+          </w:p>
+        </w:tc>
+      </w:tr>
+      <w:tr>
+        <w:tc>
+          <w:tcPr>
+            <w:tcW w:type="dxa" w:w="1245"/>
+          </w:tcPr>
+          <w:p>
+            <w:r>
+              <w:t>NGÀY 7</w:t>
+            </w:r>
+          </w:p>
+        </w:tc>
+        <w:tc>
+          <w:tcPr>
+            <w:tcW w:type="dxa" w:w="1935"/>
+          </w:tcPr>
+          <w:p>
+            <w:r>
+              <w:t>Bước 9: Báo cáo Google</w:t>
+            </w:r>
+          </w:p>
+        </w:tc>
+        <w:tc>
+          <w:tcPr>
+            <w:tcW w:type="dxa" w:w="1935"/>
+          </w:tcPr>
+          <w:p>
+            <w:r>
+              <w:t>- Điền form báo cáo Workshop cho Google (Cá nhân - Chí Thắng) (https://docs.google.com/forms/d/e/1FAIpQLSeNSgFg6dh-wlPgZVJJLqwlO-Y5UM0ItuukdbZ-ffiZFyJrYQ/viewform)</w:t>
+              <w:br/>
+              <w:t>- Điền form báo cáo Workshop cho Google (Cá nhân - Xuân Thi) (https://docs.google.com/forms/d/e/1FAIpQLSeNSgFg6dh-wlPgZVJJLqwlO-Y5UM0ItuukdbZ-ffiZFyJrYQ/viewform)</w:t>
+              <w:br/>
+              <w:t>- Điền form báo cáo Workshop cho Google (Cá nhân - Thảo) (https://docs.google.com/forms/d/e/1FAIpQLSeNSgFg6dh-wlPgZVJJLqwlO-Y5UM0ItuukdbZ-ffiZFyJrYQ/viewform)</w:t>
+              <w:br/>
+              <w:t>- Điền form báo cáo Workshop cho Google (Cá nhân - Phương Linh) (https://docs.google.com/forms/d/e/1FAIpQLSeNSgFg6dh-wlPgZVJJLqwlO-Y5UM0ItuukdbZ-ffiZFyJrYQ/viewform)</w:t>
+              <w:br/>
+              <w:t>- Phân tích số liệu đăng ký và phản hồi từ khảo sát cuối buổi.</w:t>
+            </w:r>
+          </w:p>
+        </w:tc>
+        <w:tc>
+          <w:tcPr>
+            <w:tcW w:type="dxa" w:w="2010"/>
+          </w:tcPr>
+          <w:p>
+            <w:r>
+              <w:t>- Quy trình điền form báo cáo cho Google được thực hiện giống hệt phương án Offline.</w:t>
+            </w:r>
+          </w:p>
+        </w:tc>
+        <w:tc>
+          <w:tcPr>
+            <w:tcW w:type="dxa" w:w="1545"/>
+          </w:tcPr>
+          <w:p>
+            <w:r>
+              <w:t>Google Form hệ thống (Internal)</w:t>
+            </w:r>
+          </w:p>
+        </w:tc>
+        <w:tc>
+          <w:tcPr>
+            <w:tcW w:type="dxa" w:w="2055"/>
+          </w:tcPr>
+          <w:p>
+            <w:r>
+              <w:t>Hoàn thành nghiệm thu và gửi báo cáo đầy đủ cho Google đúng hạn.</w:t>
+            </w:r>
+          </w:p>
+        </w:tc>
+      </w:tr>
+      <w:tr>
+        <w:tc>
+          <w:tcPr>
+            <w:tcW w:type="dxa" w:w="1245"/>
+          </w:tcPr>
+          <w:p>
+            <w:r>
+              <w:t>NGÀY 8</w:t>
+            </w:r>
+          </w:p>
+        </w:tc>
+        <w:tc>
+          <w:tcPr>
+            <w:tcW w:type="dxa" w:w="1935"/>
+          </w:tcPr>
+          <w:p>
+            <w:r>
+              <w:t>Bước 10: Bài học &amp; Cải tiến cho workshop</w:t>
+            </w:r>
+          </w:p>
+        </w:tc>
+        <w:tc>
+          <w:tcPr>
+            <w:tcW w:type="dxa" w:w="1935"/>
+          </w:tcPr>
+          <w:p>
+            <w:r>
+              <w:t>- Các thành viên trong team nộp báo cáo cải tiến:</w:t>
+              <w:br/>
+              <w:t>+ Chí Thắng - Nộp báo cáo cải tiến</w:t>
+              <w:br/>
+              <w:t>+ Xuân Thi - Nộp báo cáo cải tiến</w:t>
+              <w:br/>
+              <w:t>+ Thảo - Nộp báo cáo cải tiến</w:t>
+              <w:br/>
+              <w:t>+ Phương Linh - Nộp báo cáo cải tiến</w:t>
+            </w:r>
+          </w:p>
+        </w:tc>
+        <w:tc>
+          <w:tcPr>
+            <w:tcW w:type="dxa" w:w="2010"/>
+          </w:tcPr>
+          <w:p>
+            <w:r>
+              <w:t>- Tương tự phương án Offline (Các thành viên nộp báo cáo bài học &amp; cải tiến của buổi webinar trực tuyến).</w:t>
+            </w:r>
+          </w:p>
+        </w:tc>
+        <w:tc>
+          <w:tcPr>
+            <w:tcW w:type="dxa" w:w="1545"/>
+          </w:tcPr>
+          <w:p>
+            <w:r>
+              <w:t>Tài liệu nội bộ</w:t>
+            </w:r>
+          </w:p>
+        </w:tc>
+        <w:tc>
+          <w:tcPr>
+            <w:tcW w:type="dxa" w:w="2055"/>
+          </w:tcPr>
+          <w:p>
+            <w:r>
+              <w:t>Hoàn thành đầy đủ 4 báo cáo Bài học &amp; Cải tiến từ các thành viên.</w:t>
+            </w:r>
+          </w:p>
+        </w:tc>
+      </w:tr>
+      <w:tr>
+        <w:tc>
+          <w:tcPr>
+            <w:tcW w:type="dxa" w:w="1245"/>
+          </w:tcPr>
+          <w:p>
+            <w:r>
+              <w:t>NGÀY 9</w:t>
+            </w:r>
+          </w:p>
+        </w:tc>
+        <w:tc>
+          <w:tcPr>
+            <w:tcW w:type="dxa" w:w="1935"/>
+          </w:tcPr>
+          <w:p>
+            <w:r>
+              <w:t>Bước 11: Tìm trường mới</w:t>
+            </w:r>
+          </w:p>
+        </w:tc>
+        <w:tc>
+          <w:tcPr>
+            <w:tcW w:type="dxa" w:w="1935"/>
+          </w:tcPr>
+          <w:p>
+            <w:r>
+              <w:t>- Tìm trường mới (quay lại Bước 1, dùng video Recap làm vũ khí tiếp cận).</w:t>
+              <w:br/>
+              <w:t>- Nếu trường mới chưa có trong CRM: Lên internet tìm kiếm thông tin trường, email liên hệ, số điện thoại (Zalo) của giảng viên có thẩm quyền.</w:t>
+              <w:br/>
+              <w:t>- Điền đầy đủ thông tin trường mới vào CRM School trước khi tạo dự án workshop mới.</w:t>
+            </w:r>
+          </w:p>
+        </w:tc>
+        <w:tc>
+          <w:tcPr>
+            <w:tcW w:type="dxa" w:w="2010"/>
+          </w:tcPr>
+          <w:p>
+            <w:r>
+              <w:t>- Tương tự phương án Offline.</w:t>
+            </w:r>
+          </w:p>
+        </w:tc>
+        <w:tc>
+          <w:tcPr>
+            <w:tcW w:type="dxa" w:w="1545"/>
+          </w:tcPr>
+          <w:p>
+            <w:r>
+              <w:t>CRM School, Video Recap cũ, Kênh cá nhân</w:t>
+            </w:r>
+          </w:p>
+        </w:tc>
+        <w:tc>
+          <w:tcPr>
+            <w:tcW w:type="dxa" w:w="2055"/>
+          </w:tcPr>
+          <w:p>
+            <w:r>
+              <w:t>Kích hoạt thành công chu kỳ trường tiếp theo với trường mới.</w:t>
             </w:r>
           </w:p>
         </w:tc>

</xml_diff>

<commit_message>
feat: remove team member Phuong Linh from characters and todos
</commit_message>
<xml_diff>
--- a/Data/Quy trình tổ chức GSA Trainer.docx
+++ b/Data/Quy trình tổ chức GSA Trainer.docx
@@ -459,26 +459,9 @@
         </w:tc>
       </w:tr>
       <w:tr>
-        <w:trPr>
-          <w:cantSplit w:val="0"/>
-          <w:trHeight w:val="5790" w:hRule="atLeast"/>
-          <w:tblHeader w:val="0"/>
-        </w:trPr>
-        <w:tc>
-          <w:tcPr>
-            <w:tcBorders>
-              <w:top w:color="c4c7c5" w:space="0" w:sz="5" w:val="single"/>
-              <w:left w:color="c4c7c5" w:space="0" w:sz="5" w:val="single"/>
-              <w:bottom w:color="c4c7c5" w:space="0" w:sz="5" w:val="single"/>
-              <w:right w:color="c4c7c5" w:space="0" w:sz="5" w:val="single"/>
-            </w:tcBorders>
-            <w:tcMar>
-              <w:top w:w="120.0" w:type="dxa"/>
-              <w:left w:w="180.0" w:type="dxa"/>
-              <w:bottom w:w="120.0" w:type="dxa"/>
-              <w:right w:w="180.0" w:type="dxa"/>
-            </w:tcMar>
-            <w:vAlign w:val="top"/>
+        <w:tc>
+          <w:tcPr>
+            <w:tcW w:type="dxa" w:w="1245"/>
           </w:tcPr>
           <w:p>
             <w:r>
@@ -488,19 +471,7 @@
         </w:tc>
         <w:tc>
           <w:tcPr>
-            <w:tcBorders>
-              <w:top w:color="c4c7c5" w:space="0" w:sz="5" w:val="single"/>
-              <w:left w:color="c4c7c5" w:space="0" w:sz="5" w:val="single"/>
-              <w:bottom w:color="c4c7c5" w:space="0" w:sz="5" w:val="single"/>
-              <w:right w:color="c4c7c5" w:space="0" w:sz="5" w:val="single"/>
-            </w:tcBorders>
-            <w:tcMar>
-              <w:top w:w="120.0" w:type="dxa"/>
-              <w:left w:w="180.0" w:type="dxa"/>
-              <w:bottom w:w="120.0" w:type="dxa"/>
-              <w:right w:w="180.0" w:type="dxa"/>
-            </w:tcMar>
-            <w:vAlign w:val="top"/>
+            <w:tcW w:type="dxa" w:w="1935"/>
           </w:tcPr>
           <w:p>
             <w:r>
@@ -510,19 +481,7 @@
         </w:tc>
         <w:tc>
           <w:tcPr>
-            <w:tcBorders>
-              <w:top w:color="c4c7c5" w:space="0" w:sz="5" w:val="single"/>
-              <w:left w:color="c4c7c5" w:space="0" w:sz="5" w:val="single"/>
-              <w:bottom w:color="c4c7c5" w:space="0" w:sz="5" w:val="single"/>
-              <w:right w:color="c4c7c5" w:space="0" w:sz="5" w:val="single"/>
-            </w:tcBorders>
-            <w:tcMar>
-              <w:top w:w="120.0" w:type="dxa"/>
-              <w:left w:w="180.0" w:type="dxa"/>
-              <w:bottom w:w="120.0" w:type="dxa"/>
-              <w:right w:w="180.0" w:type="dxa"/>
-            </w:tcMar>
-            <w:vAlign w:val="top"/>
+            <w:tcW w:type="dxa" w:w="1935"/>
           </w:tcPr>
           <w:p>
             <w:r>
@@ -536,19 +495,7 @@
         </w:tc>
         <w:tc>
           <w:tcPr>
-            <w:tcBorders>
-              <w:top w:color="c4c7c5" w:space="0" w:sz="5" w:val="single"/>
-              <w:left w:color="c4c7c5" w:space="0" w:sz="5" w:val="single"/>
-              <w:bottom w:color="c4c7c5" w:space="0" w:sz="5" w:val="single"/>
-              <w:right w:color="c4c7c5" w:space="0" w:sz="5" w:val="single"/>
-            </w:tcBorders>
-            <w:tcMar>
-              <w:top w:w="120.0" w:type="dxa"/>
-              <w:left w:w="180.0" w:type="dxa"/>
-              <w:bottom w:w="120.0" w:type="dxa"/>
-              <w:right w:w="180.0" w:type="dxa"/>
-            </w:tcMar>
-            <w:vAlign w:val="top"/>
+            <w:tcW w:type="dxa" w:w="2010"/>
           </w:tcPr>
           <w:p>
             <w:r>
@@ -560,19 +507,7 @@
         </w:tc>
         <w:tc>
           <w:tcPr>
-            <w:tcBorders>
-              <w:top w:color="c4c7c5" w:space="0" w:sz="5" w:val="single"/>
-              <w:left w:color="c4c7c5" w:space="0" w:sz="5" w:val="single"/>
-              <w:bottom w:color="c4c7c5" w:space="0" w:sz="5" w:val="single"/>
-              <w:right w:color="c4c7c5" w:space="0" w:sz="5" w:val="single"/>
-            </w:tcBorders>
-            <w:tcMar>
-              <w:top w:w="120.0" w:type="dxa"/>
-              <w:left w:w="180.0" w:type="dxa"/>
-              <w:bottom w:w="120.0" w:type="dxa"/>
-              <w:right w:w="180.0" w:type="dxa"/>
-            </w:tcMar>
-            <w:vAlign w:val="top"/>
+            <w:tcW w:type="dxa" w:w="1545"/>
           </w:tcPr>
           <w:p>
             <w:r>
@@ -582,19 +517,7 @@
         </w:tc>
         <w:tc>
           <w:tcPr>
-            <w:tcBorders>
-              <w:top w:color="c4c7c5" w:space="0" w:sz="5" w:val="single"/>
-              <w:left w:color="c4c7c5" w:space="0" w:sz="5" w:val="single"/>
-              <w:bottom w:color="c4c7c5" w:space="0" w:sz="5" w:val="single"/>
-              <w:right w:color="c4c7c5" w:space="0" w:sz="5" w:val="single"/>
-            </w:tcBorders>
-            <w:tcMar>
-              <w:top w:w="120.0" w:type="dxa"/>
-              <w:left w:w="180.0" w:type="dxa"/>
-              <w:bottom w:w="120.0" w:type="dxa"/>
-              <w:right w:w="180.0" w:type="dxa"/>
-            </w:tcMar>
-            <w:vAlign w:val="top"/>
+            <w:tcW w:type="dxa" w:w="2055"/>
           </w:tcPr>
           <w:p>
             <w:r>
@@ -604,26 +527,9 @@
         </w:tc>
       </w:tr>
       <w:tr>
-        <w:trPr>
-          <w:cantSplit w:val="0"/>
-          <w:trHeight w:val="11580" w:hRule="atLeast"/>
-          <w:tblHeader w:val="0"/>
-        </w:trPr>
-        <w:tc>
-          <w:tcPr>
-            <w:tcBorders>
-              <w:top w:color="c4c7c5" w:space="0" w:sz="5" w:val="single"/>
-              <w:left w:color="c4c7c5" w:space="0" w:sz="5" w:val="single"/>
-              <w:bottom w:color="c4c7c5" w:space="0" w:sz="5" w:val="single"/>
-              <w:right w:color="c4c7c5" w:space="0" w:sz="5" w:val="single"/>
-            </w:tcBorders>
-            <w:tcMar>
-              <w:top w:w="120.0" w:type="dxa"/>
-              <w:left w:w="180.0" w:type="dxa"/>
-              <w:bottom w:w="120.0" w:type="dxa"/>
-              <w:right w:w="180.0" w:type="dxa"/>
-            </w:tcMar>
-            <w:vAlign w:val="top"/>
+        <w:tc>
+          <w:tcPr>
+            <w:tcW w:type="dxa" w:w="1245"/>
           </w:tcPr>
           <w:p>
             <w:r>
@@ -633,19 +539,7 @@
         </w:tc>
         <w:tc>
           <w:tcPr>
-            <w:tcBorders>
-              <w:top w:color="c4c7c5" w:space="0" w:sz="5" w:val="single"/>
-              <w:left w:color="c4c7c5" w:space="0" w:sz="5" w:val="single"/>
-              <w:bottom w:color="c4c7c5" w:space="0" w:sz="5" w:val="single"/>
-              <w:right w:color="c4c7c5" w:space="0" w:sz="5" w:val="single"/>
-            </w:tcBorders>
-            <w:tcMar>
-              <w:top w:w="120.0" w:type="dxa"/>
-              <w:left w:w="180.0" w:type="dxa"/>
-              <w:bottom w:w="120.0" w:type="dxa"/>
-              <w:right w:w="180.0" w:type="dxa"/>
-            </w:tcMar>
-            <w:vAlign w:val="top"/>
+            <w:tcW w:type="dxa" w:w="1935"/>
           </w:tcPr>
           <w:p>
             <w:r>
@@ -655,19 +549,7 @@
         </w:tc>
         <w:tc>
           <w:tcPr>
-            <w:tcBorders>
-              <w:top w:color="c4c7c5" w:space="0" w:sz="5" w:val="single"/>
-              <w:left w:color="c4c7c5" w:space="0" w:sz="5" w:val="single"/>
-              <w:bottom w:color="c4c7c5" w:space="0" w:sz="5" w:val="single"/>
-              <w:right w:color="c4c7c5" w:space="0" w:sz="5" w:val="single"/>
-            </w:tcBorders>
-            <w:tcMar>
-              <w:top w:w="120.0" w:type="dxa"/>
-              <w:left w:w="180.0" w:type="dxa"/>
-              <w:bottom w:w="120.0" w:type="dxa"/>
-              <w:right w:w="180.0" w:type="dxa"/>
-            </w:tcMar>
-            <w:vAlign w:val="top"/>
+            <w:tcW w:type="dxa" w:w="1935"/>
           </w:tcPr>
           <w:p>
             <w:r>
@@ -675,25 +557,13 @@
               <w:br/>
               <w:t>- Gửi email booking hội trường và Đề xuất Phối hợp chính thức cho nhà trường, đính kèm link folder poster/banner của trường (sau khi đã chuẩn bị xong folder ở Bước 3).</w:t>
               <w:br/>
-              <w:t>- Điền form đăng ký workshop cho Google (Chí Thắng, Xuân Thi, Thảo, Phương Linh).</w:t>
-            </w:r>
-          </w:p>
-        </w:tc>
-        <w:tc>
-          <w:tcPr>
-            <w:tcBorders>
-              <w:top w:color="c4c7c5" w:space="0" w:sz="5" w:val="single"/>
-              <w:left w:color="c4c7c5" w:space="0" w:sz="5" w:val="single"/>
-              <w:bottom w:color="c4c7c5" w:space="0" w:sz="5" w:val="single"/>
-              <w:right w:color="c4c7c5" w:space="0" w:sz="5" w:val="single"/>
-            </w:tcBorders>
-            <w:tcMar>
-              <w:top w:w="120.0" w:type="dxa"/>
-              <w:left w:w="180.0" w:type="dxa"/>
-              <w:bottom w:w="120.0" w:type="dxa"/>
-              <w:right w:w="180.0" w:type="dxa"/>
-            </w:tcMar>
-            <w:vAlign w:val="top"/>
+              <w:t>- Điền form đăng ký workshop cho Google (Chí Thắng, Xuân Thi, Thảo).</w:t>
+            </w:r>
+          </w:p>
+        </w:tc>
+        <w:tc>
+          <w:tcPr>
+            <w:tcW w:type="dxa" w:w="2010"/>
           </w:tcPr>
           <w:p>
             <w:r>
@@ -705,19 +575,7 @@
         </w:tc>
         <w:tc>
           <w:tcPr>
-            <w:tcBorders>
-              <w:top w:color="c4c7c5" w:space="0" w:sz="5" w:val="single"/>
-              <w:left w:color="c4c7c5" w:space="0" w:sz="5" w:val="single"/>
-              <w:bottom w:color="c4c7c5" w:space="0" w:sz="5" w:val="single"/>
-              <w:right w:color="c4c7c5" w:space="0" w:sz="5" w:val="single"/>
-            </w:tcBorders>
-            <w:tcMar>
-              <w:top w:w="120.0" w:type="dxa"/>
-              <w:left w:w="180.0" w:type="dxa"/>
-              <w:bottom w:w="120.0" w:type="dxa"/>
-              <w:right w:w="180.0" w:type="dxa"/>
-            </w:tcMar>
-            <w:vAlign w:val="top"/>
+            <w:tcW w:type="dxa" w:w="1545"/>
           </w:tcPr>
           <w:p>
             <w:r>
@@ -727,19 +585,7 @@
         </w:tc>
         <w:tc>
           <w:tcPr>
-            <w:tcBorders>
-              <w:top w:color="c4c7c5" w:space="0" w:sz="5" w:val="single"/>
-              <w:left w:color="c4c7c5" w:space="0" w:sz="5" w:val="single"/>
-              <w:bottom w:color="c4c7c5" w:space="0" w:sz="5" w:val="single"/>
-              <w:right w:color="c4c7c5" w:space="0" w:sz="5" w:val="single"/>
-            </w:tcBorders>
-            <w:tcMar>
-              <w:top w:w="120.0" w:type="dxa"/>
-              <w:left w:w="180.0" w:type="dxa"/>
-              <w:bottom w:w="120.0" w:type="dxa"/>
-              <w:right w:w="180.0" w:type="dxa"/>
-            </w:tcMar>
-            <w:vAlign w:val="top"/>
+            <w:tcW w:type="dxa" w:w="2055"/>
           </w:tcPr>
           <w:p>
             <w:r>
@@ -749,26 +595,9 @@
         </w:tc>
       </w:tr>
       <w:tr>
-        <w:trPr>
-          <w:cantSplit w:val="0"/>
-          <w:trHeight w:val="8265" w:hRule="atLeast"/>
-          <w:tblHeader w:val="0"/>
-        </w:trPr>
-        <w:tc>
-          <w:tcPr>
-            <w:tcBorders>
-              <w:top w:color="c4c7c5" w:space="0" w:sz="5" w:val="single"/>
-              <w:left w:color="c4c7c5" w:space="0" w:sz="5" w:val="single"/>
-              <w:bottom w:color="c4c7c5" w:space="0" w:sz="5" w:val="single"/>
-              <w:right w:color="c4c7c5" w:space="0" w:sz="5" w:val="single"/>
-            </w:tcBorders>
-            <w:tcMar>
-              <w:top w:w="120.0" w:type="dxa"/>
-              <w:left w:w="180.0" w:type="dxa"/>
-              <w:bottom w:w="120.0" w:type="dxa"/>
-              <w:right w:w="180.0" w:type="dxa"/>
-            </w:tcMar>
-            <w:vAlign w:val="top"/>
+        <w:tc>
+          <w:tcPr>
+            <w:tcW w:type="dxa" w:w="1245"/>
           </w:tcPr>
           <w:p>
             <w:r>
@@ -778,19 +607,7 @@
         </w:tc>
         <w:tc>
           <w:tcPr>
-            <w:tcBorders>
-              <w:top w:color="c4c7c5" w:space="0" w:sz="5" w:val="single"/>
-              <w:left w:color="c4c7c5" w:space="0" w:sz="5" w:val="single"/>
-              <w:bottom w:color="c4c7c5" w:space="0" w:sz="5" w:val="single"/>
-              <w:right w:color="c4c7c5" w:space="0" w:sz="5" w:val="single"/>
-            </w:tcBorders>
-            <w:tcMar>
-              <w:top w:w="120.0" w:type="dxa"/>
-              <w:left w:w="180.0" w:type="dxa"/>
-              <w:bottom w:w="120.0" w:type="dxa"/>
-              <w:right w:w="180.0" w:type="dxa"/>
-            </w:tcMar>
-            <w:vAlign w:val="top"/>
+            <w:tcW w:type="dxa" w:w="1935"/>
           </w:tcPr>
           <w:p>
             <w:r>
@@ -800,19 +617,7 @@
         </w:tc>
         <w:tc>
           <w:tcPr>
-            <w:tcBorders>
-              <w:top w:color="c4c7c5" w:space="0" w:sz="5" w:val="single"/>
-              <w:left w:color="c4c7c5" w:space="0" w:sz="5" w:val="single"/>
-              <w:bottom w:color="c4c7c5" w:space="0" w:sz="5" w:val="single"/>
-              <w:right w:color="c4c7c5" w:space="0" w:sz="5" w:val="single"/>
-            </w:tcBorders>
-            <w:tcMar>
-              <w:top w:w="120.0" w:type="dxa"/>
-              <w:left w:w="180.0" w:type="dxa"/>
-              <w:bottom w:w="120.0" w:type="dxa"/>
-              <w:right w:w="180.0" w:type="dxa"/>
-            </w:tcMar>
-            <w:vAlign w:val="top"/>
+            <w:tcW w:type="dxa" w:w="1935"/>
           </w:tcPr>
           <w:p>
             <w:r>
@@ -832,19 +637,7 @@
         </w:tc>
         <w:tc>
           <w:tcPr>
-            <w:tcBorders>
-              <w:top w:color="c4c7c5" w:space="0" w:sz="5" w:val="single"/>
-              <w:left w:color="c4c7c5" w:space="0" w:sz="5" w:val="single"/>
-              <w:bottom w:color="c4c7c5" w:space="0" w:sz="5" w:val="single"/>
-              <w:right w:color="c4c7c5" w:space="0" w:sz="5" w:val="single"/>
-            </w:tcBorders>
-            <w:tcMar>
-              <w:top w:w="120.0" w:type="dxa"/>
-              <w:left w:w="180.0" w:type="dxa"/>
-              <w:bottom w:w="120.0" w:type="dxa"/>
-              <w:right w:w="180.0" w:type="dxa"/>
-            </w:tcMar>
-            <w:vAlign w:val="top"/>
+            <w:tcW w:type="dxa" w:w="2010"/>
           </w:tcPr>
           <w:p>
             <w:r>
@@ -856,19 +649,7 @@
         </w:tc>
         <w:tc>
           <w:tcPr>
-            <w:tcBorders>
-              <w:top w:color="c4c7c5" w:space="0" w:sz="5" w:val="single"/>
-              <w:left w:color="c4c7c5" w:space="0" w:sz="5" w:val="single"/>
-              <w:bottom w:color="c4c7c5" w:space="0" w:sz="5" w:val="single"/>
-              <w:right w:color="c4c7c5" w:space="0" w:sz="5" w:val="single"/>
-            </w:tcBorders>
-            <w:tcMar>
-              <w:top w:w="120.0" w:type="dxa"/>
-              <w:left w:w="180.0" w:type="dxa"/>
-              <w:bottom w:w="120.0" w:type="dxa"/>
-              <w:right w:w="180.0" w:type="dxa"/>
-            </w:tcMar>
-            <w:vAlign w:val="top"/>
+            <w:tcW w:type="dxa" w:w="1545"/>
           </w:tcPr>
           <w:p>
             <w:r>
@@ -878,19 +659,7 @@
         </w:tc>
         <w:tc>
           <w:tcPr>
-            <w:tcBorders>
-              <w:top w:color="c4c7c5" w:space="0" w:sz="5" w:val="single"/>
-              <w:left w:color="c4c7c5" w:space="0" w:sz="5" w:val="single"/>
-              <w:bottom w:color="c4c7c5" w:space="0" w:sz="5" w:val="single"/>
-              <w:right w:color="c4c7c5" w:space="0" w:sz="5" w:val="single"/>
-            </w:tcBorders>
-            <w:tcMar>
-              <w:top w:w="120.0" w:type="dxa"/>
-              <w:left w:w="180.0" w:type="dxa"/>
-              <w:bottom w:w="120.0" w:type="dxa"/>
-              <w:right w:w="180.0" w:type="dxa"/>
-            </w:tcMar>
-            <w:vAlign w:val="top"/>
+            <w:tcW w:type="dxa" w:w="2055"/>
           </w:tcPr>
           <w:p>
             <w:r>
@@ -900,26 +669,9 @@
         </w:tc>
       </w:tr>
       <w:tr>
-        <w:trPr>
-          <w:cantSplit w:val="0"/>
-          <w:trHeight w:val="7170" w:hRule="atLeast"/>
-          <w:tblHeader w:val="0"/>
-        </w:trPr>
-        <w:tc>
-          <w:tcPr>
-            <w:tcBorders>
-              <w:top w:color="c4c7c5" w:space="0" w:sz="5" w:val="single"/>
-              <w:left w:color="c4c7c5" w:space="0" w:sz="5" w:val="single"/>
-              <w:bottom w:color="c4c7c5" w:space="0" w:sz="5" w:val="single"/>
-              <w:right w:color="c4c7c5" w:space="0" w:sz="5" w:val="single"/>
-            </w:tcBorders>
-            <w:tcMar>
-              <w:top w:w="120.0" w:type="dxa"/>
-              <w:left w:w="180.0" w:type="dxa"/>
-              <w:bottom w:w="120.0" w:type="dxa"/>
-              <w:right w:w="180.0" w:type="dxa"/>
-            </w:tcMar>
-            <w:vAlign w:val="top"/>
+        <w:tc>
+          <w:tcPr>
+            <w:tcW w:type="dxa" w:w="1245"/>
           </w:tcPr>
           <w:p>
             <w:r>
@@ -929,19 +681,7 @@
         </w:tc>
         <w:tc>
           <w:tcPr>
-            <w:tcBorders>
-              <w:top w:color="c4c7c5" w:space="0" w:sz="5" w:val="single"/>
-              <w:left w:color="c4c7c5" w:space="0" w:sz="5" w:val="single"/>
-              <w:bottom w:color="c4c7c5" w:space="0" w:sz="5" w:val="single"/>
-              <w:right w:color="c4c7c5" w:space="0" w:sz="5" w:val="single"/>
-            </w:tcBorders>
-            <w:tcMar>
-              <w:top w:w="120.0" w:type="dxa"/>
-              <w:left w:w="180.0" w:type="dxa"/>
-              <w:bottom w:w="120.0" w:type="dxa"/>
-              <w:right w:w="180.0" w:type="dxa"/>
-            </w:tcMar>
-            <w:vAlign w:val="top"/>
+            <w:tcW w:type="dxa" w:w="1935"/>
           </w:tcPr>
           <w:p>
             <w:r>
@@ -951,19 +691,7 @@
         </w:tc>
         <w:tc>
           <w:tcPr>
-            <w:tcBorders>
-              <w:top w:color="c4c7c5" w:space="0" w:sz="5" w:val="single"/>
-              <w:left w:color="c4c7c5" w:space="0" w:sz="5" w:val="single"/>
-              <w:bottom w:color="c4c7c5" w:space="0" w:sz="5" w:val="single"/>
-              <w:right w:color="c4c7c5" w:space="0" w:sz="5" w:val="single"/>
-            </w:tcBorders>
-            <w:tcMar>
-              <w:top w:w="120.0" w:type="dxa"/>
-              <w:left w:w="180.0" w:type="dxa"/>
-              <w:bottom w:w="120.0" w:type="dxa"/>
-              <w:right w:w="180.0" w:type="dxa"/>
-            </w:tcMar>
-            <w:vAlign w:val="top"/>
+            <w:tcW w:type="dxa" w:w="1935"/>
           </w:tcPr>
           <w:p>
             <w:r>
@@ -981,19 +709,7 @@
         </w:tc>
         <w:tc>
           <w:tcPr>
-            <w:tcBorders>
-              <w:top w:color="c4c7c5" w:space="0" w:sz="5" w:val="single"/>
-              <w:left w:color="c4c7c5" w:space="0" w:sz="5" w:val="single"/>
-              <w:bottom w:color="c4c7c5" w:space="0" w:sz="5" w:val="single"/>
-              <w:right w:color="c4c7c5" w:space="0" w:sz="5" w:val="single"/>
-            </w:tcBorders>
-            <w:tcMar>
-              <w:top w:w="120.0" w:type="dxa"/>
-              <w:left w:w="180.0" w:type="dxa"/>
-              <w:bottom w:w="120.0" w:type="dxa"/>
-              <w:right w:w="180.0" w:type="dxa"/>
-            </w:tcMar>
-            <w:vAlign w:val="top"/>
+            <w:tcW w:type="dxa" w:w="2010"/>
           </w:tcPr>
           <w:p>
             <w:r>
@@ -1005,19 +721,7 @@
         </w:tc>
         <w:tc>
           <w:tcPr>
-            <w:tcBorders>
-              <w:top w:color="c4c7c5" w:space="0" w:sz="5" w:val="single"/>
-              <w:left w:color="c4c7c5" w:space="0" w:sz="5" w:val="single"/>
-              <w:bottom w:color="c4c7c5" w:space="0" w:sz="5" w:val="single"/>
-              <w:right w:color="c4c7c5" w:space="0" w:sz="5" w:val="single"/>
-            </w:tcBorders>
-            <w:tcMar>
-              <w:top w:w="120.0" w:type="dxa"/>
-              <w:left w:w="180.0" w:type="dxa"/>
-              <w:bottom w:w="120.0" w:type="dxa"/>
-              <w:right w:w="180.0" w:type="dxa"/>
-            </w:tcMar>
-            <w:vAlign w:val="top"/>
+            <w:tcW w:type="dxa" w:w="1545"/>
           </w:tcPr>
           <w:p>
             <w:r>
@@ -1027,19 +731,7 @@
         </w:tc>
         <w:tc>
           <w:tcPr>
-            <w:tcBorders>
-              <w:top w:color="c4c7c5" w:space="0" w:sz="5" w:val="single"/>
-              <w:left w:color="c4c7c5" w:space="0" w:sz="5" w:val="single"/>
-              <w:bottom w:color="c4c7c5" w:space="0" w:sz="5" w:val="single"/>
-              <w:right w:color="c4c7c5" w:space="0" w:sz="5" w:val="single"/>
-            </w:tcBorders>
-            <w:tcMar>
-              <w:top w:w="120.0" w:type="dxa"/>
-              <w:left w:w="180.0" w:type="dxa"/>
-              <w:bottom w:w="120.0" w:type="dxa"/>
-              <w:right w:w="180.0" w:type="dxa"/>
-            </w:tcMar>
-            <w:vAlign w:val="top"/>
+            <w:tcW w:type="dxa" w:w="2055"/>
           </w:tcPr>
           <w:p>
             <w:r>
@@ -1049,26 +741,9 @@
         </w:tc>
       </w:tr>
       <w:tr>
-        <w:trPr>
-          <w:cantSplit w:val="0"/>
-          <w:trHeight w:val="8550" w:hRule="atLeast"/>
-          <w:tblHeader w:val="0"/>
-        </w:trPr>
-        <w:tc>
-          <w:tcPr>
-            <w:tcBorders>
-              <w:top w:color="c4c7c5" w:space="0" w:sz="5" w:val="single"/>
-              <w:left w:color="c4c7c5" w:space="0" w:sz="5" w:val="single"/>
-              <w:bottom w:color="c4c7c5" w:space="0" w:sz="5" w:val="single"/>
-              <w:right w:color="c4c7c5" w:space="0" w:sz="5" w:val="single"/>
-            </w:tcBorders>
-            <w:tcMar>
-              <w:top w:w="120.0" w:type="dxa"/>
-              <w:left w:w="180.0" w:type="dxa"/>
-              <w:bottom w:w="120.0" w:type="dxa"/>
-              <w:right w:w="180.0" w:type="dxa"/>
-            </w:tcMar>
-            <w:vAlign w:val="top"/>
+        <w:tc>
+          <w:tcPr>
+            <w:tcW w:type="dxa" w:w="1245"/>
           </w:tcPr>
           <w:p>
             <w:r>
@@ -1078,19 +753,7 @@
         </w:tc>
         <w:tc>
           <w:tcPr>
-            <w:tcBorders>
-              <w:top w:color="c4c7c5" w:space="0" w:sz="5" w:val="single"/>
-              <w:left w:color="c4c7c5" w:space="0" w:sz="5" w:val="single"/>
-              <w:bottom w:color="c4c7c5" w:space="0" w:sz="5" w:val="single"/>
-              <w:right w:color="c4c7c5" w:space="0" w:sz="5" w:val="single"/>
-            </w:tcBorders>
-            <w:tcMar>
-              <w:top w:w="120.0" w:type="dxa"/>
-              <w:left w:w="180.0" w:type="dxa"/>
-              <w:bottom w:w="120.0" w:type="dxa"/>
-              <w:right w:w="180.0" w:type="dxa"/>
-            </w:tcMar>
-            <w:vAlign w:val="top"/>
+            <w:tcW w:type="dxa" w:w="1935"/>
           </w:tcPr>
           <w:p>
             <w:r>
@@ -1100,19 +763,7 @@
         </w:tc>
         <w:tc>
           <w:tcPr>
-            <w:tcBorders>
-              <w:top w:color="c4c7c5" w:space="0" w:sz="5" w:val="single"/>
-              <w:left w:color="c4c7c5" w:space="0" w:sz="5" w:val="single"/>
-              <w:bottom w:color="c4c7c5" w:space="0" w:sz="5" w:val="single"/>
-              <w:right w:color="c4c7c5" w:space="0" w:sz="5" w:val="single"/>
-            </w:tcBorders>
-            <w:tcMar>
-              <w:top w:w="120.0" w:type="dxa"/>
-              <w:left w:w="180.0" w:type="dxa"/>
-              <w:bottom w:w="120.0" w:type="dxa"/>
-              <w:right w:w="180.0" w:type="dxa"/>
-            </w:tcMar>
-            <w:vAlign w:val="top"/>
+            <w:tcW w:type="dxa" w:w="1935"/>
           </w:tcPr>
           <w:p>
             <w:r>
@@ -1124,19 +775,7 @@
         </w:tc>
         <w:tc>
           <w:tcPr>
-            <w:tcBorders>
-              <w:top w:color="c4c7c5" w:space="0" w:sz="5" w:val="single"/>
-              <w:left w:color="c4c7c5" w:space="0" w:sz="5" w:val="single"/>
-              <w:bottom w:color="c4c7c5" w:space="0" w:sz="5" w:val="single"/>
-              <w:right w:color="c4c7c5" w:space="0" w:sz="5" w:val="single"/>
-            </w:tcBorders>
-            <w:tcMar>
-              <w:top w:w="120.0" w:type="dxa"/>
-              <w:left w:w="180.0" w:type="dxa"/>
-              <w:bottom w:w="120.0" w:type="dxa"/>
-              <w:right w:w="180.0" w:type="dxa"/>
-            </w:tcMar>
-            <w:vAlign w:val="top"/>
+            <w:tcW w:type="dxa" w:w="2010"/>
           </w:tcPr>
           <w:p>
             <w:r>
@@ -1150,19 +789,7 @@
         </w:tc>
         <w:tc>
           <w:tcPr>
-            <w:tcBorders>
-              <w:top w:color="c4c7c5" w:space="0" w:sz="5" w:val="single"/>
-              <w:left w:color="c4c7c5" w:space="0" w:sz="5" w:val="single"/>
-              <w:bottom w:color="c4c7c5" w:space="0" w:sz="5" w:val="single"/>
-              <w:right w:color="c4c7c5" w:space="0" w:sz="5" w:val="single"/>
-            </w:tcBorders>
-            <w:tcMar>
-              <w:top w:w="120.0" w:type="dxa"/>
-              <w:left w:w="180.0" w:type="dxa"/>
-              <w:bottom w:w="120.0" w:type="dxa"/>
-              <w:right w:w="180.0" w:type="dxa"/>
-            </w:tcMar>
-            <w:vAlign w:val="top"/>
+            <w:tcW w:type="dxa" w:w="1545"/>
           </w:tcPr>
           <w:p>
             <w:r>
@@ -1172,19 +799,7 @@
         </w:tc>
         <w:tc>
           <w:tcPr>
-            <w:tcBorders>
-              <w:top w:color="c4c7c5" w:space="0" w:sz="5" w:val="single"/>
-              <w:left w:color="c4c7c5" w:space="0" w:sz="5" w:val="single"/>
-              <w:bottom w:color="c4c7c5" w:space="0" w:sz="5" w:val="single"/>
-              <w:right w:color="c4c7c5" w:space="0" w:sz="5" w:val="single"/>
-            </w:tcBorders>
-            <w:tcMar>
-              <w:top w:w="120.0" w:type="dxa"/>
-              <w:left w:w="180.0" w:type="dxa"/>
-              <w:bottom w:w="120.0" w:type="dxa"/>
-              <w:right w:w="180.0" w:type="dxa"/>
-            </w:tcMar>
-            <w:vAlign w:val="top"/>
+            <w:tcW w:type="dxa" w:w="2055"/>
           </w:tcPr>
           <w:p>
             <w:r>
@@ -1194,26 +809,9 @@
         </w:tc>
       </w:tr>
       <w:tr>
-        <w:trPr>
-          <w:cantSplit w:val="0"/>
-          <w:trHeight w:val="9645" w:hRule="atLeast"/>
-          <w:tblHeader w:val="0"/>
-        </w:trPr>
-        <w:tc>
-          <w:tcPr>
-            <w:tcBorders>
-              <w:top w:color="c4c7c5" w:space="0" w:sz="5" w:val="single"/>
-              <w:left w:color="c4c7c5" w:space="0" w:sz="5" w:val="single"/>
-              <w:bottom w:color="c4c7c5" w:space="0" w:sz="5" w:val="single"/>
-              <w:right w:color="c4c7c5" w:space="0" w:sz="5" w:val="single"/>
-            </w:tcBorders>
-            <w:tcMar>
-              <w:top w:w="120.0" w:type="dxa"/>
-              <w:left w:w="180.0" w:type="dxa"/>
-              <w:bottom w:w="120.0" w:type="dxa"/>
-              <w:right w:w="180.0" w:type="dxa"/>
-            </w:tcMar>
-            <w:vAlign w:val="top"/>
+        <w:tc>
+          <w:tcPr>
+            <w:tcW w:type="dxa" w:w="1245"/>
           </w:tcPr>
           <w:p>
             <w:r>
@@ -1223,19 +821,7 @@
         </w:tc>
         <w:tc>
           <w:tcPr>
-            <w:tcBorders>
-              <w:top w:color="c4c7c5" w:space="0" w:sz="5" w:val="single"/>
-              <w:left w:color="c4c7c5" w:space="0" w:sz="5" w:val="single"/>
-              <w:bottom w:color="c4c7c5" w:space="0" w:sz="5" w:val="single"/>
-              <w:right w:color="c4c7c5" w:space="0" w:sz="5" w:val="single"/>
-            </w:tcBorders>
-            <w:tcMar>
-              <w:top w:w="120.0" w:type="dxa"/>
-              <w:left w:w="180.0" w:type="dxa"/>
-              <w:bottom w:w="120.0" w:type="dxa"/>
-              <w:right w:w="180.0" w:type="dxa"/>
-            </w:tcMar>
-            <w:vAlign w:val="top"/>
+            <w:tcW w:type="dxa" w:w="1935"/>
           </w:tcPr>
           <w:p>
             <w:r>
@@ -1245,19 +831,7 @@
         </w:tc>
         <w:tc>
           <w:tcPr>
-            <w:tcBorders>
-              <w:top w:color="c4c7c5" w:space="0" w:sz="5" w:val="single"/>
-              <w:left w:color="c4c7c5" w:space="0" w:sz="5" w:val="single"/>
-              <w:bottom w:color="c4c7c5" w:space="0" w:sz="5" w:val="single"/>
-              <w:right w:color="c4c7c5" w:space="0" w:sz="5" w:val="single"/>
-            </w:tcBorders>
-            <w:tcMar>
-              <w:top w:w="120.0" w:type="dxa"/>
-              <w:left w:w="180.0" w:type="dxa"/>
-              <w:bottom w:w="120.0" w:type="dxa"/>
-              <w:right w:w="180.0" w:type="dxa"/>
-            </w:tcMar>
-            <w:vAlign w:val="top"/>
+            <w:tcW w:type="dxa" w:w="1935"/>
           </w:tcPr>
           <w:p>
             <w:r>
@@ -1271,19 +845,7 @@
         </w:tc>
         <w:tc>
           <w:tcPr>
-            <w:tcBorders>
-              <w:top w:color="c4c7c5" w:space="0" w:sz="5" w:val="single"/>
-              <w:left w:color="c4c7c5" w:space="0" w:sz="5" w:val="single"/>
-              <w:bottom w:color="c4c7c5" w:space="0" w:sz="5" w:val="single"/>
-              <w:right w:color="c4c7c5" w:space="0" w:sz="5" w:val="single"/>
-            </w:tcBorders>
-            <w:tcMar>
-              <w:top w:w="120.0" w:type="dxa"/>
-              <w:left w:w="180.0" w:type="dxa"/>
-              <w:bottom w:w="120.0" w:type="dxa"/>
-              <w:right w:w="180.0" w:type="dxa"/>
-            </w:tcMar>
-            <w:vAlign w:val="top"/>
+            <w:tcW w:type="dxa" w:w="2010"/>
           </w:tcPr>
           <w:p>
             <w:r>
@@ -1295,19 +857,7 @@
         </w:tc>
         <w:tc>
           <w:tcPr>
-            <w:tcBorders>
-              <w:top w:color="c4c7c5" w:space="0" w:sz="5" w:val="single"/>
-              <w:left w:color="c4c7c5" w:space="0" w:sz="5" w:val="single"/>
-              <w:bottom w:color="c4c7c5" w:space="0" w:sz="5" w:val="single"/>
-              <w:right w:color="c4c7c5" w:space="0" w:sz="5" w:val="single"/>
-            </w:tcBorders>
-            <w:tcMar>
-              <w:top w:w="120.0" w:type="dxa"/>
-              <w:left w:w="180.0" w:type="dxa"/>
-              <w:bottom w:w="120.0" w:type="dxa"/>
-              <w:right w:w="180.0" w:type="dxa"/>
-            </w:tcMar>
-            <w:vAlign w:val="top"/>
+            <w:tcW w:type="dxa" w:w="1545"/>
           </w:tcPr>
           <w:p>
             <w:r>
@@ -1317,19 +867,7 @@
         </w:tc>
         <w:tc>
           <w:tcPr>
-            <w:tcBorders>
-              <w:top w:color="c4c7c5" w:space="0" w:sz="5" w:val="single"/>
-              <w:left w:color="c4c7c5" w:space="0" w:sz="5" w:val="single"/>
-              <w:bottom w:color="c4c7c5" w:space="0" w:sz="5" w:val="single"/>
-              <w:right w:color="c4c7c5" w:space="0" w:sz="5" w:val="single"/>
-            </w:tcBorders>
-            <w:tcMar>
-              <w:top w:w="120.0" w:type="dxa"/>
-              <w:left w:w="180.0" w:type="dxa"/>
-              <w:bottom w:w="120.0" w:type="dxa"/>
-              <w:right w:w="180.0" w:type="dxa"/>
-            </w:tcMar>
-            <w:vAlign w:val="top"/>
+            <w:tcW w:type="dxa" w:w="2055"/>
           </w:tcPr>
           <w:p>
             <w:r>
@@ -1339,26 +877,9 @@
         </w:tc>
       </w:tr>
       <w:tr>
-        <w:trPr>
-          <w:cantSplit w:val="0"/>
-          <w:trHeight w:val="8265" w:hRule="atLeast"/>
-          <w:tblHeader w:val="0"/>
-        </w:trPr>
-        <w:tc>
-          <w:tcPr>
-            <w:tcBorders>
-              <w:top w:color="c4c7c5" w:space="0" w:sz="5" w:val="single"/>
-              <w:left w:color="c4c7c5" w:space="0" w:sz="5" w:val="single"/>
-              <w:bottom w:color="c4c7c5" w:space="0" w:sz="5" w:val="single"/>
-              <w:right w:color="c4c7c5" w:space="0" w:sz="5" w:val="single"/>
-            </w:tcBorders>
-            <w:tcMar>
-              <w:top w:w="120.0" w:type="dxa"/>
-              <w:left w:w="180.0" w:type="dxa"/>
-              <w:bottom w:w="120.0" w:type="dxa"/>
-              <w:right w:w="180.0" w:type="dxa"/>
-            </w:tcMar>
-            <w:vAlign w:val="top"/>
+        <w:tc>
+          <w:tcPr>
+            <w:tcW w:type="dxa" w:w="1245"/>
           </w:tcPr>
           <w:p>
             <w:r>
@@ -1368,19 +889,7 @@
         </w:tc>
         <w:tc>
           <w:tcPr>
-            <w:tcBorders>
-              <w:top w:color="c4c7c5" w:space="0" w:sz="5" w:val="single"/>
-              <w:left w:color="c4c7c5" w:space="0" w:sz="5" w:val="single"/>
-              <w:bottom w:color="c4c7c5" w:space="0" w:sz="5" w:val="single"/>
-              <w:right w:color="c4c7c5" w:space="0" w:sz="5" w:val="single"/>
-            </w:tcBorders>
-            <w:tcMar>
-              <w:top w:w="120.0" w:type="dxa"/>
-              <w:left w:w="180.0" w:type="dxa"/>
-              <w:bottom w:w="120.0" w:type="dxa"/>
-              <w:right w:w="180.0" w:type="dxa"/>
-            </w:tcMar>
-            <w:vAlign w:val="top"/>
+            <w:tcW w:type="dxa" w:w="1935"/>
           </w:tcPr>
           <w:p>
             <w:r>
@@ -1390,19 +899,7 @@
         </w:tc>
         <w:tc>
           <w:tcPr>
-            <w:tcBorders>
-              <w:top w:color="c4c7c5" w:space="0" w:sz="5" w:val="single"/>
-              <w:left w:color="c4c7c5" w:space="0" w:sz="5" w:val="single"/>
-              <w:bottom w:color="c4c7c5" w:space="0" w:sz="5" w:val="single"/>
-              <w:right w:color="c4c7c5" w:space="0" w:sz="5" w:val="single"/>
-            </w:tcBorders>
-            <w:tcMar>
-              <w:top w:w="120.0" w:type="dxa"/>
-              <w:left w:w="180.0" w:type="dxa"/>
-              <w:bottom w:w="120.0" w:type="dxa"/>
-              <w:right w:w="180.0" w:type="dxa"/>
-            </w:tcMar>
-            <w:vAlign w:val="top"/>
+            <w:tcW w:type="dxa" w:w="1935"/>
           </w:tcPr>
           <w:p>
             <w:r>
@@ -1414,19 +911,7 @@
         </w:tc>
         <w:tc>
           <w:tcPr>
-            <w:tcBorders>
-              <w:top w:color="c4c7c5" w:space="0" w:sz="5" w:val="single"/>
-              <w:left w:color="c4c7c5" w:space="0" w:sz="5" w:val="single"/>
-              <w:bottom w:color="c4c7c5" w:space="0" w:sz="5" w:val="single"/>
-              <w:right w:color="c4c7c5" w:space="0" w:sz="5" w:val="single"/>
-            </w:tcBorders>
-            <w:tcMar>
-              <w:top w:w="120.0" w:type="dxa"/>
-              <w:left w:w="180.0" w:type="dxa"/>
-              <w:bottom w:w="120.0" w:type="dxa"/>
-              <w:right w:w="180.0" w:type="dxa"/>
-            </w:tcMar>
-            <w:vAlign w:val="top"/>
+            <w:tcW w:type="dxa" w:w="2010"/>
           </w:tcPr>
           <w:p>
             <w:r>
@@ -1438,19 +923,7 @@
         </w:tc>
         <w:tc>
           <w:tcPr>
-            <w:tcBorders>
-              <w:top w:color="c4c7c5" w:space="0" w:sz="5" w:val="single"/>
-              <w:left w:color="c4c7c5" w:space="0" w:sz="5" w:val="single"/>
-              <w:bottom w:color="c4c7c5" w:space="0" w:sz="5" w:val="single"/>
-              <w:right w:color="c4c7c5" w:space="0" w:sz="5" w:val="single"/>
-            </w:tcBorders>
-            <w:tcMar>
-              <w:top w:w="120.0" w:type="dxa"/>
-              <w:left w:w="180.0" w:type="dxa"/>
-              <w:bottom w:w="120.0" w:type="dxa"/>
-              <w:right w:w="180.0" w:type="dxa"/>
-            </w:tcMar>
-            <w:vAlign w:val="top"/>
+            <w:tcW w:type="dxa" w:w="1545"/>
           </w:tcPr>
           <w:p>
             <w:r>
@@ -1460,19 +933,7 @@
         </w:tc>
         <w:tc>
           <w:tcPr>
-            <w:tcBorders>
-              <w:top w:color="c4c7c5" w:space="0" w:sz="5" w:val="single"/>
-              <w:left w:color="c4c7c5" w:space="0" w:sz="5" w:val="single"/>
-              <w:bottom w:color="c4c7c5" w:space="0" w:sz="5" w:val="single"/>
-              <w:right w:color="c4c7c5" w:space="0" w:sz="5" w:val="single"/>
-            </w:tcBorders>
-            <w:tcMar>
-              <w:top w:w="120.0" w:type="dxa"/>
-              <w:left w:w="180.0" w:type="dxa"/>
-              <w:bottom w:w="120.0" w:type="dxa"/>
-              <w:right w:w="180.0" w:type="dxa"/>
-            </w:tcMar>
-            <w:vAlign w:val="top"/>
+            <w:tcW w:type="dxa" w:w="2055"/>
           </w:tcPr>
           <w:p>
             <w:r>
@@ -1584,8 +1045,6 @@
               <w:br/>
               <w:t>- Điền form báo cáo Workshop cho Google (Cá nhân - Thảo) (https://docs.google.com/forms/d/e/1FAIpQLSeNSgFg6dh-wlPgZVJJLqwlO-Y5UM0ItuukdbZ-ffiZFyJrYQ/viewform)</w:t>
               <w:br/>
-              <w:t>- Điền form báo cáo Workshop cho Google (Cá nhân - Phương Linh) (https://docs.google.com/forms/d/e/1FAIpQLSeNSgFg6dh-wlPgZVJJLqwlO-Y5UM0ItuukdbZ-ffiZFyJrYQ/viewform)</w:t>
-              <w:br/>
               <w:t>- Phân tích số liệu đăng ký và phản hồi từ khảo sát cuối buổi.</w:t>
             </w:r>
           </w:p>
@@ -1655,8 +1114,6 @@
               <w:t>+ Xuân Thi - Nộp báo cáo cải tiến</w:t>
               <w:br/>
               <w:t>+ Thảo - Nộp báo cáo cải tiến</w:t>
-              <w:br/>
-              <w:t>+ Phương Linh - Nộp báo cáo cải tiến</w:t>
             </w:r>
           </w:p>
         </w:tc>
@@ -1686,7 +1143,7 @@
           </w:tcPr>
           <w:p>
             <w:r>
-              <w:t>Hoàn thành đầy đủ 4 báo cáo Bài học &amp; Cải tiến từ các thành viên.</w:t>
+              <w:t>Hoàn thành đầy đủ 3 báo cáo Bài học &amp; Cải tiến từ các thành viên.</w:t>
             </w:r>
           </w:p>
         </w:tc>

</xml_diff>